<commit_message>
Création du menu brut
</commit_message>
<xml_diff>
--- a/X-P_GestMDP-amizeqiri-rapport.docx
+++ b/X-P_GestMDP-amizeqiri-rapport.docx
@@ -12,11 +12,9 @@
       <w:r>
         <w:t xml:space="preserve">Projet </w:t>
       </w:r>
-      <w:proofErr w:type="spellStart"/>
       <w:r>
         <w:t>GestMDP</w:t>
       </w:r>
-      <w:proofErr w:type="spellEnd"/>
     </w:p>
     <w:p>
       <w:pPr>
@@ -43,7 +41,7 @@
           <w:noProof/>
         </w:rPr>
         <w:drawing>
-          <wp:inline distT="0" distB="0" distL="0" distR="0" wp14:anchorId="733F270C" wp14:editId="5E0BF59A">
+          <wp:inline distT="0" distB="0" distL="0" distR="0" wp14:anchorId="733F270C" wp14:editId="461B5BF2">
             <wp:extent cx="4123750" cy="2166580"/>
             <wp:effectExtent l="0" t="0" r="0" b="5715"/>
             <wp:docPr id="6" name="Image 6"/>
@@ -857,7 +855,27 @@
         <w:pStyle w:val="Corpsdetexte"/>
       </w:pPr>
       <w:r>
-        <w:t>J’ai commencé cette application par créer son menu composé de 4 actions. La première permettra de consulter un mot de passe, la deuxième, d’ajouter un mot de passe, la troisième, de supprimer un mot de passe, et la dernière, de quitter le programme.</w:t>
+        <w:t>J’ai commencé cette application par créer son menu composé de 4 actions. La première permettra de consulter un mot de passe</w:t>
+      </w:r>
+      <w:r>
+        <w:t xml:space="preserve"> et de si l’on souhaite, en modifier un</w:t>
+      </w:r>
+      <w:r>
+        <w:t>, la deuxième, d’ajouter un mot de passe, la troisième, de supprimer un mot de passe, et la dernière, de quitter le programme.</w:t>
+      </w:r>
+    </w:p>
+    <w:p>
+      <w:pPr>
+        <w:pStyle w:val="Corpsdetexte"/>
+      </w:pPr>
+      <w:r>
+        <w:t xml:space="preserve">Pour le moment, le menu est brut et sans réelles dynamicités. La création du menu est </w:t>
+      </w:r>
+      <w:r>
+        <w:t>importante et prioritaire</w:t>
+      </w:r>
+      <w:r>
+        <w:t>, une fois cela fini, je me consacre à la création de fichier avec C#, chose que je n’ai jamais faîte, et ça risque de m’intéresser.</w:t>
       </w:r>
     </w:p>
     <w:p>
@@ -1052,14 +1070,12 @@
             <w:pStyle w:val="En-tte"/>
             <w:jc w:val="center"/>
           </w:pPr>
-          <w:proofErr w:type="spellStart"/>
           <w:r>
             <w:t>P_</w:t>
           </w:r>
           <w:r>
             <w:t>GestMDP</w:t>
           </w:r>
-          <w:proofErr w:type="spellEnd"/>
         </w:p>
       </w:tc>
       <w:tc>
@@ -1109,7 +1125,7 @@
         <v:path o:extrusionok="f" gradientshapeok="t" o:connecttype="rect"/>
         <o:lock v:ext="edit" aspectratio="t"/>
       </v:shapetype>
-      <v:shape id="_x0000_i1039" type="#_x0000_t75" style="width:11.25pt;height:11.25pt" o:bullet="t">
+      <v:shape id="_x0000_i1031" type="#_x0000_t75" style="width:11.25pt;height:11.25pt" o:bullet="t">
         <v:imagedata r:id="rId1" o:title="BD10263_"/>
       </v:shape>
     </w:pict>
@@ -5299,6 +5315,18 @@
 </file>
 
 <file path=customXml/item1.xml><?xml version="1.0" encoding="utf-8"?>
+<p:properties xmlns:p="http://schemas.microsoft.com/office/2006/metadata/properties" xmlns:xsi="http://www.w3.org/2001/XMLSchema-instance" xmlns:pc="http://schemas.microsoft.com/office/infopath/2007/PartnerControls">
+  <documentManagement>
+    <Total xmlns="98d92101-24da-4498-9971-a24673344bd8" xsi:nil="true"/>
+    <TaxCatchAll xmlns="dfa80de1-e9bb-4cf2-893d-d06220b3971a" xsi:nil="true"/>
+    <lcf76f155ced4ddcb4097134ff3c332f xmlns="98d92101-24da-4498-9971-a24673344bd8">
+      <Terms xmlns="http://schemas.microsoft.com/office/infopath/2007/PartnerControls"/>
+    </lcf76f155ced4ddcb4097134ff3c332f>
+  </documentManagement>
+</p:properties>
+</file>
+
+<file path=customXml/item2.xml><?xml version="1.0" encoding="utf-8"?>
 <ct:contentTypeSchema xmlns:ct="http://schemas.microsoft.com/office/2006/metadata/contentType" xmlns:ma="http://schemas.microsoft.com/office/2006/metadata/properties/metaAttributes" ct:_="" ma:_="" ma:contentTypeName="Document" ma:contentTypeID="0x010100E529CC47EA4E614CBF50FAFAB9B8F32B" ma:contentTypeVersion="13" ma:contentTypeDescription="Crée un document." ma:contentTypeScope="" ma:versionID="6a4cac78e8e76547514939bcab636e7b">
   <xsd:schema xmlns:xsd="http://www.w3.org/2001/XMLSchema" xmlns:xs="http://www.w3.org/2001/XMLSchema" xmlns:p="http://schemas.microsoft.com/office/2006/metadata/properties" xmlns:ns2="98d92101-24da-4498-9971-a24673344bd8" xmlns:ns3="dfa80de1-e9bb-4cf2-893d-d06220b3971a" targetNamespace="http://schemas.microsoft.com/office/2006/metadata/properties" ma:root="true" ma:fieldsID="a8fdc2b16e66b7bdb77d3717a31ab696" ns2:_="" ns3:_="">
     <xsd:import namespace="98d92101-24da-4498-9971-a24673344bd8"/>
@@ -5521,19 +5549,11 @@
 </ct:contentTypeSchema>
 </file>
 
-<file path=customXml/item2.xml><?xml version="1.0" encoding="utf-8"?>
-<p:properties xmlns:p="http://schemas.microsoft.com/office/2006/metadata/properties" xmlns:xsi="http://www.w3.org/2001/XMLSchema-instance" xmlns:pc="http://schemas.microsoft.com/office/infopath/2007/PartnerControls">
-  <documentManagement>
-    <Total xmlns="98d92101-24da-4498-9971-a24673344bd8" xsi:nil="true"/>
-    <TaxCatchAll xmlns="dfa80de1-e9bb-4cf2-893d-d06220b3971a" xsi:nil="true"/>
-    <lcf76f155ced4ddcb4097134ff3c332f xmlns="98d92101-24da-4498-9971-a24673344bd8">
-      <Terms xmlns="http://schemas.microsoft.com/office/infopath/2007/PartnerControls"/>
-    </lcf76f155ced4ddcb4097134ff3c332f>
-  </documentManagement>
-</p:properties>
+<file path=customXml/item3.xml><?xml version="1.0" encoding="utf-8"?>
+<b:Sources xmlns:b="http://schemas.openxmlformats.org/officeDocument/2006/bibliography" xmlns="http://schemas.openxmlformats.org/officeDocument/2006/bibliography" SelectedStyle="\APA.XSL" StyleName="APA"/>
 </file>
 
-<file path=customXml/item3.xml><?xml version="1.0" encoding="utf-8"?>
+<file path=customXml/item4.xml><?xml version="1.0" encoding="utf-8"?>
 <?mso-contentType ?>
 <FormTemplates xmlns="http://schemas.microsoft.com/sharepoint/v3/contenttype/forms">
   <Display>DocumentLibraryForm</Display>
@@ -5542,11 +5562,18 @@
 </FormTemplates>
 </file>
 
-<file path=customXml/item4.xml><?xml version="1.0" encoding="utf-8"?>
-<b:Sources xmlns:b="http://schemas.openxmlformats.org/officeDocument/2006/bibliography" xmlns="http://schemas.openxmlformats.org/officeDocument/2006/bibliography" SelectedStyle="\APA.XSL" StyleName="APA"/>
+<file path=customXml/itemProps1.xml><?xml version="1.0" encoding="utf-8"?>
+<ds:datastoreItem xmlns:ds="http://schemas.openxmlformats.org/officeDocument/2006/customXml" ds:itemID="{E4C379ED-99CE-474E-BE51-D6618EB059A5}">
+  <ds:schemaRefs>
+    <ds:schemaRef ds:uri="http://schemas.microsoft.com/office/2006/metadata/properties"/>
+    <ds:schemaRef ds:uri="http://schemas.microsoft.com/office/infopath/2007/PartnerControls"/>
+    <ds:schemaRef ds:uri="98d92101-24da-4498-9971-a24673344bd8"/>
+    <ds:schemaRef ds:uri="dfa80de1-e9bb-4cf2-893d-d06220b3971a"/>
+  </ds:schemaRefs>
+</ds:datastoreItem>
 </file>
 
-<file path=customXml/itemProps1.xml><?xml version="1.0" encoding="utf-8"?>
+<file path=customXml/itemProps2.xml><?xml version="1.0" encoding="utf-8"?>
 <ds:datastoreItem xmlns:ds="http://schemas.openxmlformats.org/officeDocument/2006/customXml" ds:itemID="{DB88091B-7A0B-40E0-A22E-B64A876609B4}">
   <ds:schemaRefs>
     <ds:schemaRef ds:uri="http://schemas.microsoft.com/office/2006/metadata/contentType"/>
@@ -5565,29 +5592,18 @@
 </ds:datastoreItem>
 </file>
 
-<file path=customXml/itemProps2.xml><?xml version="1.0" encoding="utf-8"?>
-<ds:datastoreItem xmlns:ds="http://schemas.openxmlformats.org/officeDocument/2006/customXml" ds:itemID="{E4C379ED-99CE-474E-BE51-D6618EB059A5}">
+<file path=customXml/itemProps3.xml><?xml version="1.0" encoding="utf-8"?>
+<ds:datastoreItem xmlns:ds="http://schemas.openxmlformats.org/officeDocument/2006/customXml" ds:itemID="{742E9764-2B52-4BB1-A7DC-ADF880092330}">
   <ds:schemaRefs>
-    <ds:schemaRef ds:uri="http://schemas.microsoft.com/office/2006/metadata/properties"/>
-    <ds:schemaRef ds:uri="http://schemas.microsoft.com/office/infopath/2007/PartnerControls"/>
-    <ds:schemaRef ds:uri="98d92101-24da-4498-9971-a24673344bd8"/>
-    <ds:schemaRef ds:uri="dfa80de1-e9bb-4cf2-893d-d06220b3971a"/>
+    <ds:schemaRef ds:uri="http://schemas.openxmlformats.org/officeDocument/2006/bibliography"/>
   </ds:schemaRefs>
 </ds:datastoreItem>
 </file>
 
-<file path=customXml/itemProps3.xml><?xml version="1.0" encoding="utf-8"?>
+<file path=customXml/itemProps4.xml><?xml version="1.0" encoding="utf-8"?>
 <ds:datastoreItem xmlns:ds="http://schemas.openxmlformats.org/officeDocument/2006/customXml" ds:itemID="{17BB236F-1E40-438F-95F2-06C15F3EF314}">
   <ds:schemaRefs>
     <ds:schemaRef ds:uri="http://schemas.microsoft.com/sharepoint/v3/contenttype/forms"/>
   </ds:schemaRefs>
 </ds:datastoreItem>
-</file>
-
-<file path=customXml/itemProps4.xml><?xml version="1.0" encoding="utf-8"?>
-<ds:datastoreItem xmlns:ds="http://schemas.openxmlformats.org/officeDocument/2006/customXml" ds:itemID="{742E9764-2B52-4BB1-A7DC-ADF880092330}">
-  <ds:schemaRefs>
-    <ds:schemaRef ds:uri="http://schemas.openxmlformats.org/officeDocument/2006/bibliography"/>
-  </ds:schemaRefs>
-</ds:datastoreItem>
 </file>
</xml_diff>

<commit_message>
Améliorations du menu, changements mineurs
</commit_message>
<xml_diff>
--- a/X-P_GestMDP-amizeqiri-rapport.docx
+++ b/X-P_GestMDP-amizeqiri-rapport.docx
@@ -12,9 +12,11 @@
       <w:r>
         <w:t xml:space="preserve">Projet </w:t>
       </w:r>
+      <w:proofErr w:type="spellStart"/>
       <w:r>
         <w:t>GestMDP</w:t>
       </w:r>
+      <w:proofErr w:type="spellEnd"/>
     </w:p>
     <w:p>
       <w:pPr>
@@ -41,7 +43,7 @@
           <w:noProof/>
         </w:rPr>
         <w:drawing>
-          <wp:inline distT="0" distB="0" distL="0" distR="0" wp14:anchorId="733F270C" wp14:editId="461B5BF2">
+          <wp:inline distT="0" distB="0" distL="0" distR="0" wp14:anchorId="733F270C" wp14:editId="361DDEA6">
             <wp:extent cx="4123750" cy="2166580"/>
             <wp:effectExtent l="0" t="0" r="0" b="5715"/>
             <wp:docPr id="6" name="Image 6"/>
@@ -852,43 +854,286 @@
     </w:p>
     <w:p>
       <w:pPr>
-        <w:pStyle w:val="Corpsdetexte"/>
-      </w:pPr>
-      <w:r>
-        <w:t>J’ai commencé cette application par créer son menu composé de 4 actions. La première permettra de consulter un mot de passe</w:t>
-      </w:r>
-      <w:r>
-        <w:t xml:space="preserve"> et de si l’on souhaite, en modifier un</w:t>
-      </w:r>
-      <w:r>
-        <w:t>, la deuxième, d’ajouter un mot de passe, la troisième, de supprimer un mot de passe, et la dernière, de quitter le programme.</w:t>
+        <w:pStyle w:val="Titre2"/>
+      </w:pPr>
+      <w:r>
+        <w:t>Menu</w:t>
       </w:r>
     </w:p>
     <w:p>
       <w:pPr>
         <w:pStyle w:val="Corpsdetexte"/>
-      </w:pPr>
-      <w:r>
-        <w:t xml:space="preserve">Pour le moment, le menu est brut et sans réelles dynamicités. La création du menu est </w:t>
-      </w:r>
-      <w:r>
-        <w:t>importante et prioritaire</w:t>
-      </w:r>
-      <w:r>
-        <w:t>, une fois cela fini, je me consacre à la création de fichier avec C#, chose que je n’ai jamais faîte, et ça risque de m’intéresser.</w:t>
+        <w:ind w:left="1134"/>
+      </w:pPr>
+      <w:r>
+        <w:t>J’ai commencé cette application par créer son menu composé de 4 actions.</w:t>
       </w:r>
     </w:p>
     <w:p>
       <w:pPr>
         <w:pStyle w:val="Corpsdetexte"/>
-      </w:pPr>
+        <w:ind w:left="1134"/>
+      </w:pPr>
+      <w:r>
+        <w:t>La première permettra de consulter un mot de passe</w:t>
+      </w:r>
+      <w:r>
+        <w:t xml:space="preserve"> et de si l’on souhaite, en modifier un</w:t>
+      </w:r>
+      <w:r>
+        <w:t>. La</w:t>
+      </w:r>
+      <w:r>
+        <w:t xml:space="preserve"> deuxième, d’ajouter un mot de passe</w:t>
+      </w:r>
+      <w:r>
+        <w:t>.</w:t>
+      </w:r>
+      <w:r>
+        <w:t xml:space="preserve"> </w:t>
+      </w:r>
+      <w:r>
+        <w:t>La</w:t>
+      </w:r>
+      <w:r>
+        <w:t xml:space="preserve"> troisième, de supprimer un mot de passe, et </w:t>
+      </w:r>
+      <w:r>
+        <w:t xml:space="preserve">pour finir, </w:t>
+      </w:r>
+      <w:r>
+        <w:t>la dernière, de quitter le programme.</w:t>
+      </w:r>
     </w:p>
     <w:p>
       <w:pPr>
+        <w:pStyle w:val="Corpsdetexte"/>
+        <w:ind w:left="1134"/>
+      </w:pPr>
+      <w:r>
+        <w:t xml:space="preserve">Pour le moment, le menu est brut et sans réelles dynamicités. La création du menu est </w:t>
+      </w:r>
+      <w:r>
+        <w:t>importante et prioritaire</w:t>
+      </w:r>
+      <w:r>
+        <w:t>, une fois cela fini, je me consacre à la création de fichier avec C#, chose que je n’ai jamais faîte, et ça risque de m’intéresser.</w:t>
+      </w:r>
+    </w:p>
+    <w:p>
+      <w:pPr>
+        <w:pStyle w:val="Corpsdetexte"/>
+        <w:ind w:left="1134"/>
+        <w:jc w:val="left"/>
+      </w:pPr>
+      <w:r>
+        <w:t>Voici</w:t>
+      </w:r>
+      <w:r>
+        <w:t>, à l’instant, mon menu :</w:t>
+      </w:r>
+      <w:r>
+        <w:drawing>
+          <wp:inline distT="0" distB="0" distL="0" distR="0" wp14:anchorId="0C013E33" wp14:editId="019FB518">
+            <wp:extent cx="2935719" cy="1238250"/>
+            <wp:effectExtent l="152400" t="152400" r="360045" b="361950"/>
+            <wp:docPr id="1" name="Image 1"/>
+            <wp:cNvGraphicFramePr>
+              <a:graphicFrameLocks xmlns:a="http://schemas.openxmlformats.org/drawingml/2006/main" noChangeAspect="1"/>
+            </wp:cNvGraphicFramePr>
+            <a:graphic xmlns:a="http://schemas.openxmlformats.org/drawingml/2006/main">
+              <a:graphicData uri="http://schemas.openxmlformats.org/drawingml/2006/picture">
+                <pic:pic xmlns:pic="http://schemas.openxmlformats.org/drawingml/2006/picture">
+                  <pic:nvPicPr>
+                    <pic:cNvPr id="1" name=""/>
+                    <pic:cNvPicPr/>
+                  </pic:nvPicPr>
+                  <pic:blipFill>
+                    <a:blip r:embed="rId13"/>
+                    <a:stretch>
+                      <a:fillRect/>
+                    </a:stretch>
+                  </pic:blipFill>
+                  <pic:spPr>
+                    <a:xfrm>
+                      <a:off x="0" y="0"/>
+                      <a:ext cx="2954830" cy="1246311"/>
+                    </a:xfrm>
+                    <a:prstGeom prst="rect">
+                      <a:avLst/>
+                    </a:prstGeom>
+                    <a:ln>
+                      <a:noFill/>
+                    </a:ln>
+                    <a:effectLst>
+                      <a:outerShdw blurRad="292100" dist="139700" dir="2700000" algn="tl" rotWithShape="0">
+                        <a:srgbClr val="333333">
+                          <a:alpha val="65000"/>
+                        </a:srgbClr>
+                      </a:outerShdw>
+                    </a:effectLst>
+                  </pic:spPr>
+                </pic:pic>
+              </a:graphicData>
+            </a:graphic>
+          </wp:inline>
+        </w:drawing>
+      </w:r>
+    </w:p>
+    <w:p>
+      <w:pPr>
+        <w:pStyle w:val="Corpsdetexte"/>
+        <w:jc w:val="left"/>
+      </w:pPr>
+      <w:r>
+        <w:t>Et voici si l’on choisit l’action 1 "Consulter les mots de passe" :</w:t>
+      </w:r>
+    </w:p>
+    <w:p>
+      <w:pPr>
+        <w:pStyle w:val="Corpsdetexte"/>
+      </w:pPr>
+      <w:r>
+        <w:lastRenderedPageBreak/>
+        <w:drawing>
+          <wp:inline distT="0" distB="0" distL="0" distR="0" wp14:anchorId="5956087A" wp14:editId="7A2989B7">
+            <wp:extent cx="3672397" cy="2162175"/>
+            <wp:effectExtent l="152400" t="152400" r="366395" b="352425"/>
+            <wp:docPr id="2" name="Image 2"/>
+            <wp:cNvGraphicFramePr>
+              <a:graphicFrameLocks xmlns:a="http://schemas.openxmlformats.org/drawingml/2006/main" noChangeAspect="1"/>
+            </wp:cNvGraphicFramePr>
+            <a:graphic xmlns:a="http://schemas.openxmlformats.org/drawingml/2006/main">
+              <a:graphicData uri="http://schemas.openxmlformats.org/drawingml/2006/picture">
+                <pic:pic xmlns:pic="http://schemas.openxmlformats.org/drawingml/2006/picture">
+                  <pic:nvPicPr>
+                    <pic:cNvPr id="1" name=""/>
+                    <pic:cNvPicPr/>
+                  </pic:nvPicPr>
+                  <pic:blipFill>
+                    <a:blip r:embed="rId14"/>
+                    <a:stretch>
+                      <a:fillRect/>
+                    </a:stretch>
+                  </pic:blipFill>
+                  <pic:spPr>
+                    <a:xfrm>
+                      <a:off x="0" y="0"/>
+                      <a:ext cx="3697593" cy="2177010"/>
+                    </a:xfrm>
+                    <a:prstGeom prst="rect">
+                      <a:avLst/>
+                    </a:prstGeom>
+                    <a:ln>
+                      <a:noFill/>
+                    </a:ln>
+                    <a:effectLst>
+                      <a:outerShdw blurRad="292100" dist="139700" dir="2700000" algn="tl" rotWithShape="0">
+                        <a:srgbClr val="333333">
+                          <a:alpha val="65000"/>
+                        </a:srgbClr>
+                      </a:outerShdw>
+                    </a:effectLst>
+                  </pic:spPr>
+                </pic:pic>
+              </a:graphicData>
+            </a:graphic>
+          </wp:inline>
+        </w:drawing>
+      </w:r>
+    </w:p>
+    <w:p>
+      <w:pPr>
+        <w:pStyle w:val="Corpsdetexte"/>
+        <w:ind w:left="708"/>
+      </w:pPr>
+      <w:r>
+        <w:t>Tout est affiché en dur pour le moment.</w:t>
+      </w:r>
+    </w:p>
+    <w:p>
+      <w:pPr>
+        <w:pStyle w:val="Corpsdetexte"/>
+        <w:ind w:left="708"/>
+      </w:pPr>
+      <w:r>
+        <w:t xml:space="preserve">Après une discussion avec M. Chenaux sur mon menu. Il a été nécessaire de </w:t>
+      </w:r>
+      <w:r>
+        <w:t xml:space="preserve">le </w:t>
+      </w:r>
+      <w:r>
+        <w:t>changer. En effet je n’utilise plus la sentence "if" mais plutôt "switch" qui lui est beaucoup plus adapté et ergonomique pour les menus.</w:t>
+      </w:r>
+    </w:p>
+    <w:p>
+      <w:pPr>
+        <w:pStyle w:val="Corpsdetexte"/>
+        <w:ind w:left="708"/>
+      </w:pPr>
+      <w:r>
+        <w:t>Voici donc à quoi ressemble mon menu :</w:t>
+      </w:r>
+    </w:p>
+    <w:p>
+      <w:pPr>
+        <w:pStyle w:val="Corpsdetexte"/>
+      </w:pPr>
+      <w:r>
+        <w:drawing>
+          <wp:inline distT="0" distB="0" distL="0" distR="0" wp14:anchorId="1652F1E7" wp14:editId="4F0ED0DB">
+            <wp:extent cx="3618222" cy="4276725"/>
+            <wp:effectExtent l="152400" t="152400" r="363855" b="352425"/>
+            <wp:docPr id="3" name="Image 3"/>
+            <wp:cNvGraphicFramePr>
+              <a:graphicFrameLocks xmlns:a="http://schemas.openxmlformats.org/drawingml/2006/main" noChangeAspect="1"/>
+            </wp:cNvGraphicFramePr>
+            <a:graphic xmlns:a="http://schemas.openxmlformats.org/drawingml/2006/main">
+              <a:graphicData uri="http://schemas.openxmlformats.org/drawingml/2006/picture">
+                <pic:pic xmlns:pic="http://schemas.openxmlformats.org/drawingml/2006/picture">
+                  <pic:nvPicPr>
+                    <pic:cNvPr id="1" name=""/>
+                    <pic:cNvPicPr/>
+                  </pic:nvPicPr>
+                  <pic:blipFill>
+                    <a:blip r:embed="rId15"/>
+                    <a:stretch>
+                      <a:fillRect/>
+                    </a:stretch>
+                  </pic:blipFill>
+                  <pic:spPr>
+                    <a:xfrm>
+                      <a:off x="0" y="0"/>
+                      <a:ext cx="3620340" cy="4279229"/>
+                    </a:xfrm>
+                    <a:prstGeom prst="rect">
+                      <a:avLst/>
+                    </a:prstGeom>
+                    <a:ln>
+                      <a:noFill/>
+                    </a:ln>
+                    <a:effectLst>
+                      <a:outerShdw blurRad="292100" dist="139700" dir="2700000" algn="tl" rotWithShape="0">
+                        <a:srgbClr val="333333">
+                          <a:alpha val="65000"/>
+                        </a:srgbClr>
+                      </a:outerShdw>
+                    </a:effectLst>
+                  </pic:spPr>
+                </pic:pic>
+              </a:graphicData>
+            </a:graphic>
+          </wp:inline>
+        </w:drawing>
+      </w:r>
+    </w:p>
+    <w:p>
+      <w:pPr>
         <w:pStyle w:val="Titre1"/>
       </w:pPr>
       <w:bookmarkStart w:id="5" w:name="_Toc175571187"/>
       <w:r>
+        <w:lastRenderedPageBreak/>
         <w:t>Sources</w:t>
       </w:r>
       <w:r>
@@ -900,6 +1145,40 @@
       <w:pPr>
         <w:pStyle w:val="Corpsdetexte"/>
       </w:pPr>
+      <w:hyperlink r:id="rId16" w:history="1">
+        <w:proofErr w:type="spellStart"/>
+        <w:r>
+          <w:rPr>
+            <w:rStyle w:val="Lienhypertexte"/>
+          </w:rPr>
+          <w:t>S</w:t>
+        </w:r>
+        <w:r>
+          <w:rPr>
+            <w:rStyle w:val="Lienhypertexte"/>
+          </w:rPr>
+          <w:t>tackoverflow</w:t>
+        </w:r>
+        <w:proofErr w:type="spellEnd"/>
+      </w:hyperlink>
+      <w:r>
+        <w:t xml:space="preserve"> : </w:t>
+      </w:r>
+      <w:r>
+        <w:t>Ce site m’a apporté pa</w:t>
+      </w:r>
+      <w:r>
+        <w:t>s mal de chose</w:t>
+      </w:r>
+      <w:r>
+        <w:t>. Comme certaines notions pour le menu.</w:t>
+      </w:r>
+    </w:p>
+    <w:p>
+      <w:pPr>
+        <w:pStyle w:val="Corpsdetexte"/>
+        <w:ind w:left="0"/>
+      </w:pPr>
     </w:p>
     <w:p>
       <w:pPr>
@@ -915,10 +1194,19 @@
       <w:pPr>
         <w:pStyle w:val="Corpsdetexte"/>
       </w:pPr>
+      <w:r>
+        <w:t>Pas encore de conclusion</w:t>
+      </w:r>
+      <w:r>
+        <w:t>.</w:t>
+      </w:r>
+      <w:r>
+        <w:t xml:space="preserve"> Projet pas fini.</w:t>
+      </w:r>
     </w:p>
     <w:sectPr>
-      <w:headerReference w:type="default" r:id="rId13"/>
-      <w:footerReference w:type="default" r:id="rId14"/>
+      <w:headerReference w:type="default" r:id="rId17"/>
+      <w:footerReference w:type="default" r:id="rId18"/>
       <w:pgSz w:w="11906" w:h="16838" w:code="9"/>
       <w:pgMar w:top="1418" w:right="1418" w:bottom="1418" w:left="1418" w:header="709" w:footer="709" w:gutter="0"/>
       <w:cols w:space="708"/>
@@ -1070,12 +1358,14 @@
             <w:pStyle w:val="En-tte"/>
             <w:jc w:val="center"/>
           </w:pPr>
+          <w:proofErr w:type="spellStart"/>
           <w:r>
             <w:t>P_</w:t>
           </w:r>
           <w:r>
             <w:t>GestMDP</w:t>
           </w:r>
+          <w:proofErr w:type="spellEnd"/>
         </w:p>
       </w:tc>
       <w:tc>
@@ -1125,7 +1415,7 @@
         <v:path o:extrusionok="f" gradientshapeok="t" o:connecttype="rect"/>
         <o:lock v:ext="edit" aspectratio="t"/>
       </v:shapetype>
-      <v:shape id="_x0000_i1031" type="#_x0000_t75" style="width:11.25pt;height:11.25pt" o:bullet="t">
+      <v:shape id="_x0000_i1060" type="#_x0000_t75" style="width:11.25pt;height:11.25pt" o:bullet="t">
         <v:imagedata r:id="rId1" o:title="BD10263_"/>
       </v:shape>
     </w:pict>
@@ -5025,6 +5315,18 @@
       <w:iCs/>
     </w:rPr>
   </w:style>
+  <w:style w:type="character" w:styleId="Mentionnonrsolue">
+    <w:name w:val="Unresolved Mention"/>
+    <w:basedOn w:val="Policepardfaut"/>
+    <w:uiPriority w:val="99"/>
+    <w:semiHidden/>
+    <w:unhideWhenUsed/>
+    <w:rsid w:val="002B31A5"/>
+    <w:rPr>
+      <w:color w:val="605E5C"/>
+      <w:shd w:val="clear" w:color="auto" w:fill="E1DFDD"/>
+    </w:rPr>
+  </w:style>
 </w:styles>
 </file>
 
@@ -5315,18 +5617,6 @@
 </file>
 
 <file path=customXml/item1.xml><?xml version="1.0" encoding="utf-8"?>
-<p:properties xmlns:p="http://schemas.microsoft.com/office/2006/metadata/properties" xmlns:xsi="http://www.w3.org/2001/XMLSchema-instance" xmlns:pc="http://schemas.microsoft.com/office/infopath/2007/PartnerControls">
-  <documentManagement>
-    <Total xmlns="98d92101-24da-4498-9971-a24673344bd8" xsi:nil="true"/>
-    <TaxCatchAll xmlns="dfa80de1-e9bb-4cf2-893d-d06220b3971a" xsi:nil="true"/>
-    <lcf76f155ced4ddcb4097134ff3c332f xmlns="98d92101-24da-4498-9971-a24673344bd8">
-      <Terms xmlns="http://schemas.microsoft.com/office/infopath/2007/PartnerControls"/>
-    </lcf76f155ced4ddcb4097134ff3c332f>
-  </documentManagement>
-</p:properties>
-</file>
-
-<file path=customXml/item2.xml><?xml version="1.0" encoding="utf-8"?>
 <ct:contentTypeSchema xmlns:ct="http://schemas.microsoft.com/office/2006/metadata/contentType" xmlns:ma="http://schemas.microsoft.com/office/2006/metadata/properties/metaAttributes" ct:_="" ma:_="" ma:contentTypeName="Document" ma:contentTypeID="0x010100E529CC47EA4E614CBF50FAFAB9B8F32B" ma:contentTypeVersion="13" ma:contentTypeDescription="Crée un document." ma:contentTypeScope="" ma:versionID="6a4cac78e8e76547514939bcab636e7b">
   <xsd:schema xmlns:xsd="http://www.w3.org/2001/XMLSchema" xmlns:xs="http://www.w3.org/2001/XMLSchema" xmlns:p="http://schemas.microsoft.com/office/2006/metadata/properties" xmlns:ns2="98d92101-24da-4498-9971-a24673344bd8" xmlns:ns3="dfa80de1-e9bb-4cf2-893d-d06220b3971a" targetNamespace="http://schemas.microsoft.com/office/2006/metadata/properties" ma:root="true" ma:fieldsID="a8fdc2b16e66b7bdb77d3717a31ab696" ns2:_="" ns3:_="">
     <xsd:import namespace="98d92101-24da-4498-9971-a24673344bd8"/>
@@ -5549,11 +5839,19 @@
 </ct:contentTypeSchema>
 </file>
 
-<file path=customXml/item3.xml><?xml version="1.0" encoding="utf-8"?>
-<b:Sources xmlns:b="http://schemas.openxmlformats.org/officeDocument/2006/bibliography" xmlns="http://schemas.openxmlformats.org/officeDocument/2006/bibliography" SelectedStyle="\APA.XSL" StyleName="APA"/>
+<file path=customXml/item2.xml><?xml version="1.0" encoding="utf-8"?>
+<p:properties xmlns:p="http://schemas.microsoft.com/office/2006/metadata/properties" xmlns:xsi="http://www.w3.org/2001/XMLSchema-instance" xmlns:pc="http://schemas.microsoft.com/office/infopath/2007/PartnerControls">
+  <documentManagement>
+    <Total xmlns="98d92101-24da-4498-9971-a24673344bd8" xsi:nil="true"/>
+    <TaxCatchAll xmlns="dfa80de1-e9bb-4cf2-893d-d06220b3971a" xsi:nil="true"/>
+    <lcf76f155ced4ddcb4097134ff3c332f xmlns="98d92101-24da-4498-9971-a24673344bd8">
+      <Terms xmlns="http://schemas.microsoft.com/office/infopath/2007/PartnerControls"/>
+    </lcf76f155ced4ddcb4097134ff3c332f>
+  </documentManagement>
+</p:properties>
 </file>
 
-<file path=customXml/item4.xml><?xml version="1.0" encoding="utf-8"?>
+<file path=customXml/item3.xml><?xml version="1.0" encoding="utf-8"?>
 <?mso-contentType ?>
 <FormTemplates xmlns="http://schemas.microsoft.com/sharepoint/v3/contenttype/forms">
   <Display>DocumentLibraryForm</Display>
@@ -5562,18 +5860,11 @@
 </FormTemplates>
 </file>
 
-<file path=customXml/itemProps1.xml><?xml version="1.0" encoding="utf-8"?>
-<ds:datastoreItem xmlns:ds="http://schemas.openxmlformats.org/officeDocument/2006/customXml" ds:itemID="{E4C379ED-99CE-474E-BE51-D6618EB059A5}">
-  <ds:schemaRefs>
-    <ds:schemaRef ds:uri="http://schemas.microsoft.com/office/2006/metadata/properties"/>
-    <ds:schemaRef ds:uri="http://schemas.microsoft.com/office/infopath/2007/PartnerControls"/>
-    <ds:schemaRef ds:uri="98d92101-24da-4498-9971-a24673344bd8"/>
-    <ds:schemaRef ds:uri="dfa80de1-e9bb-4cf2-893d-d06220b3971a"/>
-  </ds:schemaRefs>
-</ds:datastoreItem>
+<file path=customXml/item4.xml><?xml version="1.0" encoding="utf-8"?>
+<b:Sources xmlns:b="http://schemas.openxmlformats.org/officeDocument/2006/bibliography" xmlns="http://schemas.openxmlformats.org/officeDocument/2006/bibliography" SelectedStyle="\APA.XSL" StyleName="APA"/>
 </file>
 
-<file path=customXml/itemProps2.xml><?xml version="1.0" encoding="utf-8"?>
+<file path=customXml/itemProps1.xml><?xml version="1.0" encoding="utf-8"?>
 <ds:datastoreItem xmlns:ds="http://schemas.openxmlformats.org/officeDocument/2006/customXml" ds:itemID="{DB88091B-7A0B-40E0-A22E-B64A876609B4}">
   <ds:schemaRefs>
     <ds:schemaRef ds:uri="http://schemas.microsoft.com/office/2006/metadata/contentType"/>
@@ -5592,18 +5883,29 @@
 </ds:datastoreItem>
 </file>
 
+<file path=customXml/itemProps2.xml><?xml version="1.0" encoding="utf-8"?>
+<ds:datastoreItem xmlns:ds="http://schemas.openxmlformats.org/officeDocument/2006/customXml" ds:itemID="{E4C379ED-99CE-474E-BE51-D6618EB059A5}">
+  <ds:schemaRefs>
+    <ds:schemaRef ds:uri="http://schemas.microsoft.com/office/2006/metadata/properties"/>
+    <ds:schemaRef ds:uri="http://schemas.microsoft.com/office/infopath/2007/PartnerControls"/>
+    <ds:schemaRef ds:uri="98d92101-24da-4498-9971-a24673344bd8"/>
+    <ds:schemaRef ds:uri="dfa80de1-e9bb-4cf2-893d-d06220b3971a"/>
+  </ds:schemaRefs>
+</ds:datastoreItem>
+</file>
+
 <file path=customXml/itemProps3.xml><?xml version="1.0" encoding="utf-8"?>
+<ds:datastoreItem xmlns:ds="http://schemas.openxmlformats.org/officeDocument/2006/customXml" ds:itemID="{17BB236F-1E40-438F-95F2-06C15F3EF314}">
+  <ds:schemaRefs>
+    <ds:schemaRef ds:uri="http://schemas.microsoft.com/sharepoint/v3/contenttype/forms"/>
+  </ds:schemaRefs>
+</ds:datastoreItem>
+</file>
+
+<file path=customXml/itemProps4.xml><?xml version="1.0" encoding="utf-8"?>
 <ds:datastoreItem xmlns:ds="http://schemas.openxmlformats.org/officeDocument/2006/customXml" ds:itemID="{742E9764-2B52-4BB1-A7DC-ADF880092330}">
   <ds:schemaRefs>
     <ds:schemaRef ds:uri="http://schemas.openxmlformats.org/officeDocument/2006/bibliography"/>
   </ds:schemaRefs>
 </ds:datastoreItem>
-</file>
-
-<file path=customXml/itemProps4.xml><?xml version="1.0" encoding="utf-8"?>
-<ds:datastoreItem xmlns:ds="http://schemas.openxmlformats.org/officeDocument/2006/customXml" ds:itemID="{17BB236F-1E40-438F-95F2-06C15F3EF314}">
-  <ds:schemaRefs>
-    <ds:schemaRef ds:uri="http://schemas.microsoft.com/sharepoint/v3/contenttype/forms"/>
-  </ds:schemaRefs>
-</ds:datastoreItem>
 </file>
</xml_diff>

<commit_message>
Rapport, journal de travail
</commit_message>
<xml_diff>
--- a/X-P_GestMDP-amizeqiri-rapport.docx
+++ b/X-P_GestMDP-amizeqiri-rapport.docx
@@ -43,7 +43,7 @@
           <w:noProof/>
         </w:rPr>
         <w:drawing>
-          <wp:inline distT="0" distB="0" distL="0" distR="0" wp14:anchorId="733F270C" wp14:editId="72C463F0">
+          <wp:inline distT="0" distB="0" distL="0" distR="0" wp14:anchorId="733F270C" wp14:editId="0D8D3C53">
             <wp:extent cx="4123750" cy="2166580"/>
             <wp:effectExtent l="0" t="0" r="0" b="5715"/>
             <wp:docPr id="6" name="Image 6"/>
@@ -231,7 +231,7 @@
         </w:rPr>
         <w:fldChar w:fldCharType="separate"/>
       </w:r>
-      <w:hyperlink w:anchor="_Toc179199574" w:history="1">
+      <w:hyperlink w:anchor="_Toc181017285" w:history="1">
         <w:r>
           <w:rPr>
             <w:rStyle w:val="Lienhypertexte"/>
@@ -277,7 +277,7 @@
             <w:noProof/>
             <w:webHidden/>
           </w:rPr>
-          <w:instrText xml:space="preserve"> PAGEREF _Toc179199574 \h </w:instrText>
+          <w:instrText xml:space="preserve"> PAGEREF _Toc181017285 \h </w:instrText>
         </w:r>
         <w:r>
           <w:rPr>
@@ -323,7 +323,7 @@
           <w14:ligatures w14:val="standardContextual"/>
         </w:rPr>
       </w:pPr>
-      <w:hyperlink w:anchor="_Toc179199575" w:history="1">
+      <w:hyperlink w:anchor="_Toc181017286" w:history="1">
         <w:r>
           <w:rPr>
             <w:rStyle w:val="Lienhypertexte"/>
@@ -367,7 +367,7 @@
             <w:noProof/>
             <w:webHidden/>
           </w:rPr>
-          <w:instrText xml:space="preserve"> PAGEREF _Toc179199575 \h </w:instrText>
+          <w:instrText xml:space="preserve"> PAGEREF _Toc181017286 \h </w:instrText>
         </w:r>
         <w:r>
           <w:rPr>
@@ -413,7 +413,7 @@
           <w14:ligatures w14:val="standardContextual"/>
         </w:rPr>
       </w:pPr>
-      <w:hyperlink w:anchor="_Toc179199576" w:history="1">
+      <w:hyperlink w:anchor="_Toc181017287" w:history="1">
         <w:r>
           <w:rPr>
             <w:rStyle w:val="Lienhypertexte"/>
@@ -457,7 +457,7 @@
             <w:noProof/>
             <w:webHidden/>
           </w:rPr>
-          <w:instrText xml:space="preserve"> PAGEREF _Toc179199576 \h </w:instrText>
+          <w:instrText xml:space="preserve"> PAGEREF _Toc181017287 \h </w:instrText>
         </w:r>
         <w:r>
           <w:rPr>
@@ -505,7 +505,7 @@
           <w14:ligatures w14:val="standardContextual"/>
         </w:rPr>
       </w:pPr>
-      <w:hyperlink w:anchor="_Toc179199577" w:history="1">
+      <w:hyperlink w:anchor="_Toc181017288" w:history="1">
         <w:r>
           <w:rPr>
             <w:rStyle w:val="Lienhypertexte"/>
@@ -551,7 +551,7 @@
             <w:noProof/>
             <w:webHidden/>
           </w:rPr>
-          <w:instrText xml:space="preserve"> PAGEREF _Toc179199577 \h </w:instrText>
+          <w:instrText xml:space="preserve"> PAGEREF _Toc181017288 \h </w:instrText>
         </w:r>
         <w:r>
           <w:rPr>
@@ -597,7 +597,7 @@
           <w14:ligatures w14:val="standardContextual"/>
         </w:rPr>
       </w:pPr>
-      <w:hyperlink w:anchor="_Toc179199578" w:history="1">
+      <w:hyperlink w:anchor="_Toc181017289" w:history="1">
         <w:r>
           <w:rPr>
             <w:rStyle w:val="Lienhypertexte"/>
@@ -641,7 +641,7 @@
             <w:noProof/>
             <w:webHidden/>
           </w:rPr>
-          <w:instrText xml:space="preserve"> PAGEREF _Toc179199578 \h </w:instrText>
+          <w:instrText xml:space="preserve"> PAGEREF _Toc181017289 \h </w:instrText>
         </w:r>
         <w:r>
           <w:rPr>
@@ -689,7 +689,7 @@
           <w14:ligatures w14:val="standardContextual"/>
         </w:rPr>
       </w:pPr>
-      <w:hyperlink w:anchor="_Toc179199579" w:history="1">
+      <w:hyperlink w:anchor="_Toc181017290" w:history="1">
         <w:r>
           <w:rPr>
             <w:rStyle w:val="Lienhypertexte"/>
@@ -735,7 +735,7 @@
             <w:noProof/>
             <w:webHidden/>
           </w:rPr>
-          <w:instrText xml:space="preserve"> PAGEREF _Toc179199579 \h </w:instrText>
+          <w:instrText xml:space="preserve"> PAGEREF _Toc181017290 \h </w:instrText>
         </w:r>
         <w:r>
           <w:rPr>
@@ -783,7 +783,7 @@
           <w14:ligatures w14:val="standardContextual"/>
         </w:rPr>
       </w:pPr>
-      <w:hyperlink w:anchor="_Toc179199580" w:history="1">
+      <w:hyperlink w:anchor="_Toc181017291" w:history="1">
         <w:r>
           <w:rPr>
             <w:rStyle w:val="Lienhypertexte"/>
@@ -829,7 +829,7 @@
             <w:noProof/>
             <w:webHidden/>
           </w:rPr>
-          <w:instrText xml:space="preserve"> PAGEREF _Toc179199580 \h </w:instrText>
+          <w:instrText xml:space="preserve"> PAGEREF _Toc181017291 \h </w:instrText>
         </w:r>
         <w:r>
           <w:rPr>
@@ -881,7 +881,7 @@
       <w:pPr>
         <w:pStyle w:val="Titre1"/>
       </w:pPr>
-      <w:bookmarkStart w:id="1" w:name="_Toc179199574"/>
+      <w:bookmarkStart w:id="1" w:name="_Toc181017285"/>
       <w:r>
         <w:lastRenderedPageBreak/>
         <w:t>Description du projet dans son ensemble</w:t>
@@ -892,7 +892,7 @@
       <w:pPr>
         <w:pStyle w:val="Titre2"/>
       </w:pPr>
-      <w:bookmarkStart w:id="2" w:name="_Toc179199575"/>
+      <w:bookmarkStart w:id="2" w:name="_Toc181017286"/>
       <w:r>
         <w:t>Titre</w:t>
       </w:r>
@@ -911,7 +911,7 @@
       <w:pPr>
         <w:pStyle w:val="Titre2"/>
       </w:pPr>
-      <w:bookmarkStart w:id="3" w:name="_Toc179199576"/>
+      <w:bookmarkStart w:id="3" w:name="_Toc181017287"/>
       <w:r>
         <w:t>Sujet</w:t>
       </w:r>
@@ -936,21 +936,24 @@
       <w:pPr>
         <w:pStyle w:val="Titre1"/>
       </w:pPr>
-      <w:bookmarkStart w:id="4" w:name="_Toc179199577"/>
       <w:r>
-        <w:t>Support de cours</w:t>
+        <w:t>Explications</w:t>
       </w:r>
-      <w:bookmarkEnd w:id="4"/>
     </w:p>
     <w:p>
       <w:pPr>
+        <w:pStyle w:val="Retraitcorpsdetexte"/>
+      </w:pPr>
+    </w:p>
+    <w:p>
+      <w:pPr>
         <w:pStyle w:val="Titre2"/>
       </w:pPr>
-      <w:bookmarkStart w:id="5" w:name="_Toc179199578"/>
+      <w:bookmarkStart w:id="4" w:name="_Toc181017289"/>
       <w:r>
         <w:t>Menu</w:t>
       </w:r>
-      <w:bookmarkEnd w:id="5"/>
+      <w:bookmarkEnd w:id="4"/>
     </w:p>
     <w:p>
       <w:pPr>
@@ -1778,6 +1781,7 @@
                 <w:color w:val="000000"/>
                 <w:sz w:val="16"/>
                 <w:szCs w:val="16"/>
+                <w:lang w:val="en-US"/>
               </w:rPr>
             </w:pPr>
             <w:r>
@@ -1796,6 +1800,7 @@
                 <w:color w:val="000000"/>
                 <w:sz w:val="16"/>
                 <w:szCs w:val="16"/>
+                <w:lang w:val="en-US"/>
               </w:rPr>
               <w:t>Console.Clear</w:t>
             </w:r>
@@ -1806,6 +1811,7 @@
                 <w:color w:val="000000"/>
                 <w:sz w:val="16"/>
                 <w:szCs w:val="16"/>
+                <w:lang w:val="en-US"/>
               </w:rPr>
               <w:t>(</w:t>
             </w:r>
@@ -1816,6 +1822,7 @@
                 <w:color w:val="000000"/>
                 <w:sz w:val="16"/>
                 <w:szCs w:val="16"/>
+                <w:lang w:val="en-US"/>
               </w:rPr>
               <w:t>);</w:t>
             </w:r>
@@ -1831,75 +1838,93 @@
                 <w:color w:val="000000"/>
                 <w:sz w:val="16"/>
                 <w:szCs w:val="16"/>
-              </w:rPr>
-            </w:pPr>
-            <w:r>
-              <w:rPr>
-                <w:rFonts w:ascii="Cascadia Mono" w:hAnsi="Cascadia Mono" w:cs="Cascadia Mono"/>
-                <w:color w:val="000000"/>
-                <w:sz w:val="16"/>
-                <w:szCs w:val="16"/>
+                <w:lang w:val="en-US"/>
+              </w:rPr>
+            </w:pPr>
+            <w:r>
+              <w:rPr>
+                <w:rFonts w:ascii="Cascadia Mono" w:hAnsi="Cascadia Mono" w:cs="Cascadia Mono"/>
+                <w:color w:val="000000"/>
+                <w:sz w:val="16"/>
+                <w:szCs w:val="16"/>
+                <w:lang w:val="en-US"/>
               </w:rPr>
               <w:t xml:space="preserve">            </w:t>
             </w:r>
+            <w:r>
+              <w:rPr>
+                <w:rFonts w:ascii="Cascadia Mono" w:hAnsi="Cascadia Mono" w:cs="Cascadia Mono"/>
+                <w:color w:val="0000FF"/>
+                <w:sz w:val="16"/>
+                <w:szCs w:val="16"/>
+                <w:lang w:val="en-US"/>
+              </w:rPr>
+              <w:t>string</w:t>
+            </w:r>
+            <w:r>
+              <w:rPr>
+                <w:rFonts w:ascii="Cascadia Mono" w:hAnsi="Cascadia Mono" w:cs="Cascadia Mono"/>
+                <w:color w:val="000000"/>
+                <w:sz w:val="16"/>
+                <w:szCs w:val="16"/>
+                <w:lang w:val="en-US"/>
+              </w:rPr>
+              <w:t xml:space="preserve"> </w:t>
+            </w:r>
+            <w:proofErr w:type="spellStart"/>
+            <w:r>
+              <w:rPr>
+                <w:rFonts w:ascii="Cascadia Mono" w:hAnsi="Cascadia Mono" w:cs="Cascadia Mono"/>
+                <w:color w:val="000000"/>
+                <w:sz w:val="16"/>
+                <w:szCs w:val="16"/>
+                <w:lang w:val="en-US"/>
+              </w:rPr>
+              <w:t>directoryPath</w:t>
+            </w:r>
+            <w:proofErr w:type="spellEnd"/>
+            <w:r>
+              <w:rPr>
+                <w:rFonts w:ascii="Cascadia Mono" w:hAnsi="Cascadia Mono" w:cs="Cascadia Mono"/>
+                <w:color w:val="000000"/>
+                <w:sz w:val="16"/>
+                <w:szCs w:val="16"/>
+                <w:lang w:val="en-US"/>
+              </w:rPr>
+              <w:t xml:space="preserve"> = </w:t>
+            </w:r>
+            <w:r>
+              <w:rPr>
+                <w:rFonts w:ascii="Cascadia Mono" w:hAnsi="Cascadia Mono" w:cs="Cascadia Mono"/>
+                <w:color w:val="800000"/>
+                <w:sz w:val="16"/>
+                <w:szCs w:val="16"/>
+                <w:lang w:val="en-US"/>
+              </w:rPr>
+              <w:t>@"C:\Users\amizeqiri\Desktop\GitHub\P_GestMDP_114\P_GestMDP\password</w:t>
+            </w:r>
             <w:proofErr w:type="gramStart"/>
             <w:r>
               <w:rPr>
                 <w:rFonts w:ascii="Cascadia Mono" w:hAnsi="Cascadia Mono" w:cs="Cascadia Mono"/>
-                <w:color w:val="0000FF"/>
-                <w:sz w:val="16"/>
-                <w:szCs w:val="16"/>
-              </w:rPr>
-              <w:t>string</w:t>
+                <w:color w:val="800000"/>
+                <w:sz w:val="16"/>
+                <w:szCs w:val="16"/>
+                <w:lang w:val="en-US"/>
+              </w:rPr>
+              <w:t>"</w:t>
+            </w:r>
+            <w:r>
+              <w:rPr>
+                <w:rFonts w:ascii="Cascadia Mono" w:hAnsi="Cascadia Mono" w:cs="Cascadia Mono"/>
+                <w:color w:val="000000"/>
+                <w:sz w:val="16"/>
+                <w:szCs w:val="16"/>
+                <w:lang w:val="en-US"/>
+              </w:rPr>
+              <w:t>;</w:t>
             </w:r>
             <w:proofErr w:type="gramEnd"/>
-            <w:r>
-              <w:rPr>
-                <w:rFonts w:ascii="Cascadia Mono" w:hAnsi="Cascadia Mono" w:cs="Cascadia Mono"/>
-                <w:color w:val="000000"/>
-                <w:sz w:val="16"/>
-                <w:szCs w:val="16"/>
-              </w:rPr>
-              <w:t xml:space="preserve"> </w:t>
-            </w:r>
-            <w:proofErr w:type="spellStart"/>
-            <w:r>
-              <w:rPr>
-                <w:rFonts w:ascii="Cascadia Mono" w:hAnsi="Cascadia Mono" w:cs="Cascadia Mono"/>
-                <w:color w:val="000000"/>
-                <w:sz w:val="16"/>
-                <w:szCs w:val="16"/>
-              </w:rPr>
-              <w:t>directoryPath</w:t>
-            </w:r>
-            <w:proofErr w:type="spellEnd"/>
-            <w:r>
-              <w:rPr>
-                <w:rFonts w:ascii="Cascadia Mono" w:hAnsi="Cascadia Mono" w:cs="Cascadia Mono"/>
-                <w:color w:val="000000"/>
-                <w:sz w:val="16"/>
-                <w:szCs w:val="16"/>
-              </w:rPr>
-              <w:t xml:space="preserve"> = </w:t>
-            </w:r>
-            <w:r>
-              <w:rPr>
-                <w:rFonts w:ascii="Cascadia Mono" w:hAnsi="Cascadia Mono" w:cs="Cascadia Mono"/>
-                <w:color w:val="800000"/>
-                <w:sz w:val="16"/>
-                <w:szCs w:val="16"/>
-              </w:rPr>
-              <w:t>@"C:\Users\amizeqiri\Desktop\GitHub\P_GestMDP_114\P_GestMDP\password"</w:t>
-            </w:r>
-            <w:r>
-              <w:rPr>
-                <w:rFonts w:ascii="Cascadia Mono" w:hAnsi="Cascadia Mono" w:cs="Cascadia Mono"/>
-                <w:color w:val="000000"/>
-                <w:sz w:val="16"/>
-                <w:szCs w:val="16"/>
-              </w:rPr>
-              <w:t>;</w:t>
-            </w:r>
           </w:p>
           <w:p>
             <w:pPr>
@@ -1911,6 +1936,7 @@
                 <w:color w:val="000000"/>
                 <w:sz w:val="16"/>
                 <w:szCs w:val="16"/>
+                <w:lang w:val="en-US"/>
               </w:rPr>
             </w:pPr>
           </w:p>
@@ -1924,30 +1950,29 @@
                 <w:color w:val="000000"/>
                 <w:sz w:val="16"/>
                 <w:szCs w:val="16"/>
-              </w:rPr>
-            </w:pPr>
-            <w:r>
-              <w:rPr>
-                <w:rFonts w:ascii="Cascadia Mono" w:hAnsi="Cascadia Mono" w:cs="Cascadia Mono"/>
-                <w:color w:val="000000"/>
-                <w:sz w:val="16"/>
-                <w:szCs w:val="16"/>
+                <w:lang w:val="en-US"/>
+              </w:rPr>
+            </w:pPr>
+            <w:r>
+              <w:rPr>
+                <w:rFonts w:ascii="Cascadia Mono" w:hAnsi="Cascadia Mono" w:cs="Cascadia Mono"/>
+                <w:color w:val="000000"/>
+                <w:sz w:val="16"/>
+                <w:szCs w:val="16"/>
+                <w:lang w:val="en-US"/>
               </w:rPr>
               <w:t xml:space="preserve">            </w:t>
             </w:r>
-            <w:proofErr w:type="spellStart"/>
-            <w:proofErr w:type="gramStart"/>
             <w:r>
               <w:rPr>
                 <w:rFonts w:ascii="Cascadia Mono" w:hAnsi="Cascadia Mono" w:cs="Cascadia Mono"/>
                 <w:color w:val="0000FF"/>
                 <w:sz w:val="16"/>
                 <w:szCs w:val="16"/>
+                <w:lang w:val="en-US"/>
               </w:rPr>
               <w:t>try</w:t>
             </w:r>
-            <w:proofErr w:type="spellEnd"/>
-            <w:proofErr w:type="gramEnd"/>
           </w:p>
           <w:p>
             <w:pPr>
@@ -1959,14 +1984,16 @@
                 <w:color w:val="000000"/>
                 <w:sz w:val="16"/>
                 <w:szCs w:val="16"/>
-              </w:rPr>
-            </w:pPr>
-            <w:r>
-              <w:rPr>
-                <w:rFonts w:ascii="Cascadia Mono" w:hAnsi="Cascadia Mono" w:cs="Cascadia Mono"/>
-                <w:color w:val="000000"/>
-                <w:sz w:val="16"/>
-                <w:szCs w:val="16"/>
+                <w:lang w:val="en-US"/>
+              </w:rPr>
+            </w:pPr>
+            <w:r>
+              <w:rPr>
+                <w:rFonts w:ascii="Cascadia Mono" w:hAnsi="Cascadia Mono" w:cs="Cascadia Mono"/>
+                <w:color w:val="000000"/>
+                <w:sz w:val="16"/>
+                <w:szCs w:val="16"/>
+                <w:lang w:val="en-US"/>
               </w:rPr>
               <w:t xml:space="preserve">            {</w:t>
             </w:r>
@@ -1981,34 +2008,36 @@
                 <w:color w:val="000000"/>
                 <w:sz w:val="16"/>
                 <w:szCs w:val="16"/>
-              </w:rPr>
-            </w:pPr>
-            <w:r>
-              <w:rPr>
-                <w:rFonts w:ascii="Cascadia Mono" w:hAnsi="Cascadia Mono" w:cs="Cascadia Mono"/>
-                <w:color w:val="000000"/>
-                <w:sz w:val="16"/>
-                <w:szCs w:val="16"/>
+                <w:lang w:val="en-US"/>
+              </w:rPr>
+            </w:pPr>
+            <w:r>
+              <w:rPr>
+                <w:rFonts w:ascii="Cascadia Mono" w:hAnsi="Cascadia Mono" w:cs="Cascadia Mono"/>
+                <w:color w:val="000000"/>
+                <w:sz w:val="16"/>
+                <w:szCs w:val="16"/>
+                <w:lang w:val="en-US"/>
               </w:rPr>
               <w:t xml:space="preserve">                </w:t>
             </w:r>
-            <w:proofErr w:type="gramStart"/>
             <w:r>
               <w:rPr>
                 <w:rFonts w:ascii="Cascadia Mono" w:hAnsi="Cascadia Mono" w:cs="Cascadia Mono"/>
                 <w:color w:val="0000FF"/>
                 <w:sz w:val="16"/>
                 <w:szCs w:val="16"/>
+                <w:lang w:val="en-US"/>
               </w:rPr>
               <w:t>if</w:t>
             </w:r>
-            <w:proofErr w:type="gramEnd"/>
-            <w:r>
-              <w:rPr>
-                <w:rFonts w:ascii="Cascadia Mono" w:hAnsi="Cascadia Mono" w:cs="Cascadia Mono"/>
-                <w:color w:val="000000"/>
-                <w:sz w:val="16"/>
-                <w:szCs w:val="16"/>
+            <w:r>
+              <w:rPr>
+                <w:rFonts w:ascii="Cascadia Mono" w:hAnsi="Cascadia Mono" w:cs="Cascadia Mono"/>
+                <w:color w:val="000000"/>
+                <w:sz w:val="16"/>
+                <w:szCs w:val="16"/>
+                <w:lang w:val="en-US"/>
               </w:rPr>
               <w:t xml:space="preserve"> (</w:t>
             </w:r>
@@ -2019,6 +2048,7 @@
                 <w:color w:val="000000"/>
                 <w:sz w:val="16"/>
                 <w:szCs w:val="16"/>
+                <w:lang w:val="en-US"/>
               </w:rPr>
               <w:t>Directory.Exists</w:t>
             </w:r>
@@ -2029,6 +2059,7 @@
                 <w:color w:val="000000"/>
                 <w:sz w:val="16"/>
                 <w:szCs w:val="16"/>
+                <w:lang w:val="en-US"/>
               </w:rPr>
               <w:t>(</w:t>
             </w:r>
@@ -2039,6 +2070,7 @@
                 <w:color w:val="000000"/>
                 <w:sz w:val="16"/>
                 <w:szCs w:val="16"/>
+                <w:lang w:val="en-US"/>
               </w:rPr>
               <w:t>directoryPath</w:t>
             </w:r>
@@ -2049,6 +2081,7 @@
                 <w:color w:val="000000"/>
                 <w:sz w:val="16"/>
                 <w:szCs w:val="16"/>
+                <w:lang w:val="en-US"/>
               </w:rPr>
               <w:t>))</w:t>
             </w:r>
@@ -2063,14 +2096,16 @@
                 <w:color w:val="000000"/>
                 <w:sz w:val="16"/>
                 <w:szCs w:val="16"/>
-              </w:rPr>
-            </w:pPr>
-            <w:r>
-              <w:rPr>
-                <w:rFonts w:ascii="Cascadia Mono" w:hAnsi="Cascadia Mono" w:cs="Cascadia Mono"/>
-                <w:color w:val="000000"/>
-                <w:sz w:val="16"/>
-                <w:szCs w:val="16"/>
+                <w:lang w:val="en-US"/>
+              </w:rPr>
+            </w:pPr>
+            <w:r>
+              <w:rPr>
+                <w:rFonts w:ascii="Cascadia Mono" w:hAnsi="Cascadia Mono" w:cs="Cascadia Mono"/>
+                <w:color w:val="000000"/>
+                <w:sz w:val="16"/>
+                <w:szCs w:val="16"/>
+                <w:lang w:val="en-US"/>
               </w:rPr>
               <w:t xml:space="preserve">                {</w:t>
             </w:r>
@@ -2085,14 +2120,16 @@
                 <w:color w:val="000000"/>
                 <w:sz w:val="16"/>
                 <w:szCs w:val="16"/>
-              </w:rPr>
-            </w:pPr>
-            <w:r>
-              <w:rPr>
-                <w:rFonts w:ascii="Cascadia Mono" w:hAnsi="Cascadia Mono" w:cs="Cascadia Mono"/>
-                <w:color w:val="000000"/>
-                <w:sz w:val="16"/>
-                <w:szCs w:val="16"/>
+                <w:lang w:val="en-US"/>
+              </w:rPr>
+            </w:pPr>
+            <w:r>
+              <w:rPr>
+                <w:rFonts w:ascii="Cascadia Mono" w:hAnsi="Cascadia Mono" w:cs="Cascadia Mono"/>
+                <w:color w:val="000000"/>
+                <w:sz w:val="16"/>
+                <w:szCs w:val="16"/>
+                <w:lang w:val="en-US"/>
               </w:rPr>
               <w:t xml:space="preserve">                    </w:t>
             </w:r>
@@ -2103,6 +2140,7 @@
                 <w:color w:val="0000FF"/>
                 <w:sz w:val="16"/>
                 <w:szCs w:val="16"/>
+                <w:lang w:val="en-US"/>
               </w:rPr>
               <w:t>string</w:t>
             </w:r>
@@ -2112,6 +2150,7 @@
                 <w:color w:val="000000"/>
                 <w:sz w:val="16"/>
                 <w:szCs w:val="16"/>
+                <w:lang w:val="en-US"/>
               </w:rPr>
               <w:t>[</w:t>
             </w:r>
@@ -2122,6 +2161,7 @@
                 <w:color w:val="000000"/>
                 <w:sz w:val="16"/>
                 <w:szCs w:val="16"/>
+                <w:lang w:val="en-US"/>
               </w:rPr>
               <w:t xml:space="preserve">] files = </w:t>
             </w:r>
@@ -2132,6 +2172,7 @@
                 <w:color w:val="000000"/>
                 <w:sz w:val="16"/>
                 <w:szCs w:val="16"/>
+                <w:lang w:val="en-US"/>
               </w:rPr>
               <w:t>Directory.GetFiles</w:t>
             </w:r>
@@ -2142,6 +2183,7 @@
                 <w:color w:val="000000"/>
                 <w:sz w:val="16"/>
                 <w:szCs w:val="16"/>
+                <w:lang w:val="en-US"/>
               </w:rPr>
               <w:t>(</w:t>
             </w:r>
@@ -2152,6 +2194,7 @@
                 <w:color w:val="000000"/>
                 <w:sz w:val="16"/>
                 <w:szCs w:val="16"/>
+                <w:lang w:val="en-US"/>
               </w:rPr>
               <w:t>directoryPath</w:t>
             </w:r>
@@ -2162,6 +2205,7 @@
                 <w:color w:val="000000"/>
                 <w:sz w:val="16"/>
                 <w:szCs w:val="16"/>
+                <w:lang w:val="en-US"/>
               </w:rPr>
               <w:t xml:space="preserve">, </w:t>
             </w:r>
@@ -2171,6 +2215,7 @@
                 <w:color w:val="A31515"/>
                 <w:sz w:val="16"/>
                 <w:szCs w:val="16"/>
+                <w:lang w:val="en-US"/>
               </w:rPr>
               <w:t>"*"</w:t>
             </w:r>
@@ -2180,6 +2225,7 @@
                 <w:color w:val="000000"/>
                 <w:sz w:val="16"/>
                 <w:szCs w:val="16"/>
+                <w:lang w:val="en-US"/>
               </w:rPr>
               <w:t>);</w:t>
             </w:r>
@@ -2202,6 +2248,7 @@
                 <w:color w:val="000000"/>
                 <w:sz w:val="16"/>
                 <w:szCs w:val="16"/>
+                <w:lang w:val="en-US"/>
               </w:rPr>
               <w:t xml:space="preserve">                    </w:t>
             </w:r>
@@ -2499,6 +2546,7 @@
                 <w:color w:val="000000"/>
                 <w:sz w:val="16"/>
                 <w:szCs w:val="16"/>
+                <w:lang w:val="en-US"/>
               </w:rPr>
             </w:pPr>
             <w:r>
@@ -2510,16 +2558,103 @@
               </w:rPr>
               <w:t xml:space="preserve">                        </w:t>
             </w:r>
+            <w:r>
+              <w:rPr>
+                <w:rFonts w:ascii="Cascadia Mono" w:hAnsi="Cascadia Mono" w:cs="Cascadia Mono"/>
+                <w:color w:val="0000FF"/>
+                <w:sz w:val="16"/>
+                <w:szCs w:val="16"/>
+                <w:lang w:val="en-US"/>
+              </w:rPr>
+              <w:t>for</w:t>
+            </w:r>
+            <w:r>
+              <w:rPr>
+                <w:rFonts w:ascii="Cascadia Mono" w:hAnsi="Cascadia Mono" w:cs="Cascadia Mono"/>
+                <w:color w:val="000000"/>
+                <w:sz w:val="16"/>
+                <w:szCs w:val="16"/>
+                <w:lang w:val="en-US"/>
+              </w:rPr>
+              <w:t xml:space="preserve"> (</w:t>
+            </w:r>
+            <w:r>
+              <w:rPr>
+                <w:rFonts w:ascii="Cascadia Mono" w:hAnsi="Cascadia Mono" w:cs="Cascadia Mono"/>
+                <w:color w:val="0000FF"/>
+                <w:sz w:val="16"/>
+                <w:szCs w:val="16"/>
+                <w:lang w:val="en-US"/>
+              </w:rPr>
+              <w:t>int</w:t>
+            </w:r>
+            <w:r>
+              <w:rPr>
+                <w:rFonts w:ascii="Cascadia Mono" w:hAnsi="Cascadia Mono" w:cs="Cascadia Mono"/>
+                <w:color w:val="000000"/>
+                <w:sz w:val="16"/>
+                <w:szCs w:val="16"/>
+                <w:lang w:val="en-US"/>
+              </w:rPr>
+              <w:t xml:space="preserve"> </w:t>
+            </w:r>
+            <w:proofErr w:type="spellStart"/>
+            <w:r>
+              <w:rPr>
+                <w:rFonts w:ascii="Cascadia Mono" w:hAnsi="Cascadia Mono" w:cs="Cascadia Mono"/>
+                <w:color w:val="000000"/>
+                <w:sz w:val="16"/>
+                <w:szCs w:val="16"/>
+                <w:lang w:val="en-US"/>
+              </w:rPr>
+              <w:t>i</w:t>
+            </w:r>
+            <w:proofErr w:type="spellEnd"/>
+            <w:r>
+              <w:rPr>
+                <w:rFonts w:ascii="Cascadia Mono" w:hAnsi="Cascadia Mono" w:cs="Cascadia Mono"/>
+                <w:color w:val="000000"/>
+                <w:sz w:val="16"/>
+                <w:szCs w:val="16"/>
+                <w:lang w:val="en-US"/>
+              </w:rPr>
+              <w:t xml:space="preserve"> = 0; </w:t>
+            </w:r>
+            <w:proofErr w:type="spellStart"/>
+            <w:r>
+              <w:rPr>
+                <w:rFonts w:ascii="Cascadia Mono" w:hAnsi="Cascadia Mono" w:cs="Cascadia Mono"/>
+                <w:color w:val="000000"/>
+                <w:sz w:val="16"/>
+                <w:szCs w:val="16"/>
+                <w:lang w:val="en-US"/>
+              </w:rPr>
+              <w:t>i</w:t>
+            </w:r>
+            <w:proofErr w:type="spellEnd"/>
+            <w:r>
+              <w:rPr>
+                <w:rFonts w:ascii="Cascadia Mono" w:hAnsi="Cascadia Mono" w:cs="Cascadia Mono"/>
+                <w:color w:val="000000"/>
+                <w:sz w:val="16"/>
+                <w:szCs w:val="16"/>
+                <w:lang w:val="en-US"/>
+              </w:rPr>
+              <w:t xml:space="preserve"> &lt; </w:t>
+            </w:r>
+            <w:proofErr w:type="spellStart"/>
             <w:proofErr w:type="gramStart"/>
             <w:r>
               <w:rPr>
                 <w:rFonts w:ascii="Cascadia Mono" w:hAnsi="Cascadia Mono" w:cs="Cascadia Mono"/>
-                <w:color w:val="0000FF"/>
-                <w:sz w:val="16"/>
-                <w:szCs w:val="16"/>
-              </w:rPr>
-              <w:t>for</w:t>
-            </w:r>
+                <w:color w:val="000000"/>
+                <w:sz w:val="16"/>
+                <w:szCs w:val="16"/>
+                <w:lang w:val="en-US"/>
+              </w:rPr>
+              <w:t>files.Length</w:t>
+            </w:r>
+            <w:proofErr w:type="spellEnd"/>
             <w:proofErr w:type="gramEnd"/>
             <w:r>
               <w:rPr>
@@ -2527,18 +2662,20 @@
                 <w:color w:val="000000"/>
                 <w:sz w:val="16"/>
                 <w:szCs w:val="16"/>
-              </w:rPr>
-              <w:t xml:space="preserve"> (</w:t>
+                <w:lang w:val="en-US"/>
+              </w:rPr>
+              <w:t xml:space="preserve">; </w:t>
             </w:r>
             <w:proofErr w:type="spellStart"/>
             <w:r>
               <w:rPr>
                 <w:rFonts w:ascii="Cascadia Mono" w:hAnsi="Cascadia Mono" w:cs="Cascadia Mono"/>
-                <w:color w:val="0000FF"/>
-                <w:sz w:val="16"/>
-                <w:szCs w:val="16"/>
-              </w:rPr>
-              <w:t>int</w:t>
+                <w:color w:val="000000"/>
+                <w:sz w:val="16"/>
+                <w:szCs w:val="16"/>
+                <w:lang w:val="en-US"/>
+              </w:rPr>
+              <w:t>i</w:t>
             </w:r>
             <w:proofErr w:type="spellEnd"/>
             <w:r>
@@ -2547,28 +2684,9 @@
                 <w:color w:val="000000"/>
                 <w:sz w:val="16"/>
                 <w:szCs w:val="16"/>
-              </w:rPr>
-              <w:t xml:space="preserve"> i = 0; i &lt; </w:t>
-            </w:r>
-            <w:proofErr w:type="spellStart"/>
-            <w:r>
-              <w:rPr>
-                <w:rFonts w:ascii="Cascadia Mono" w:hAnsi="Cascadia Mono" w:cs="Cascadia Mono"/>
-                <w:color w:val="000000"/>
-                <w:sz w:val="16"/>
-                <w:szCs w:val="16"/>
-              </w:rPr>
-              <w:t>files.Length</w:t>
-            </w:r>
-            <w:proofErr w:type="spellEnd"/>
-            <w:r>
-              <w:rPr>
-                <w:rFonts w:ascii="Cascadia Mono" w:hAnsi="Cascadia Mono" w:cs="Cascadia Mono"/>
-                <w:color w:val="000000"/>
-                <w:sz w:val="16"/>
-                <w:szCs w:val="16"/>
-              </w:rPr>
-              <w:t>; i++)</w:t>
+                <w:lang w:val="en-US"/>
+              </w:rPr>
+              <w:t>++)</w:t>
             </w:r>
           </w:p>
           <w:p>
@@ -2589,8 +2707,18 @@
                 <w:color w:val="000000"/>
                 <w:sz w:val="16"/>
                 <w:szCs w:val="16"/>
-              </w:rPr>
-              <w:t xml:space="preserve">                        {</w:t>
+                <w:lang w:val="en-US"/>
+              </w:rPr>
+              <w:t xml:space="preserve">                        </w:t>
+            </w:r>
+            <w:r>
+              <w:rPr>
+                <w:rFonts w:ascii="Cascadia Mono" w:hAnsi="Cascadia Mono" w:cs="Cascadia Mono"/>
+                <w:color w:val="000000"/>
+                <w:sz w:val="16"/>
+                <w:szCs w:val="16"/>
+              </w:rPr>
+              <w:t>{</w:t>
             </w:r>
           </w:p>
           <w:p>
@@ -3102,6 +3230,7 @@
                 <w:color w:val="000000"/>
                 <w:sz w:val="16"/>
                 <w:szCs w:val="16"/>
+                <w:lang w:val="en-US"/>
               </w:rPr>
             </w:pPr>
             <w:r>
@@ -3113,15 +3242,58 @@
               </w:rPr>
               <w:t xml:space="preserve">                            </w:t>
             </w:r>
+            <w:r>
+              <w:rPr>
+                <w:rFonts w:ascii="Cascadia Mono" w:hAnsi="Cascadia Mono" w:cs="Cascadia Mono"/>
+                <w:color w:val="0000FF"/>
+                <w:sz w:val="16"/>
+                <w:szCs w:val="16"/>
+                <w:lang w:val="en-US"/>
+              </w:rPr>
+              <w:t>string</w:t>
+            </w:r>
+            <w:r>
+              <w:rPr>
+                <w:rFonts w:ascii="Cascadia Mono" w:hAnsi="Cascadia Mono" w:cs="Cascadia Mono"/>
+                <w:color w:val="000000"/>
+                <w:sz w:val="16"/>
+                <w:szCs w:val="16"/>
+                <w:lang w:val="en-US"/>
+              </w:rPr>
+              <w:t xml:space="preserve"> </w:t>
+            </w:r>
+            <w:proofErr w:type="spellStart"/>
+            <w:r>
+              <w:rPr>
+                <w:rFonts w:ascii="Cascadia Mono" w:hAnsi="Cascadia Mono" w:cs="Cascadia Mono"/>
+                <w:color w:val="000000"/>
+                <w:sz w:val="16"/>
+                <w:szCs w:val="16"/>
+                <w:lang w:val="en-US"/>
+              </w:rPr>
+              <w:t>filePath</w:t>
+            </w:r>
+            <w:proofErr w:type="spellEnd"/>
+            <w:r>
+              <w:rPr>
+                <w:rFonts w:ascii="Cascadia Mono" w:hAnsi="Cascadia Mono" w:cs="Cascadia Mono"/>
+                <w:color w:val="000000"/>
+                <w:sz w:val="16"/>
+                <w:szCs w:val="16"/>
+                <w:lang w:val="en-US"/>
+              </w:rPr>
+              <w:t xml:space="preserve"> = </w:t>
+            </w:r>
             <w:proofErr w:type="gramStart"/>
             <w:r>
               <w:rPr>
                 <w:rFonts w:ascii="Cascadia Mono" w:hAnsi="Cascadia Mono" w:cs="Cascadia Mono"/>
-                <w:color w:val="0000FF"/>
-                <w:sz w:val="16"/>
-                <w:szCs w:val="16"/>
-              </w:rPr>
-              <w:t>string</w:t>
+                <w:color w:val="000000"/>
+                <w:sz w:val="16"/>
+                <w:szCs w:val="16"/>
+                <w:lang w:val="en-US"/>
+              </w:rPr>
+              <w:t>files[</w:t>
             </w:r>
             <w:proofErr w:type="gramEnd"/>
             <w:r>
@@ -3130,28 +3302,9 @@
                 <w:color w:val="000000"/>
                 <w:sz w:val="16"/>
                 <w:szCs w:val="16"/>
-              </w:rPr>
-              <w:t xml:space="preserve"> </w:t>
-            </w:r>
-            <w:proofErr w:type="spellStart"/>
-            <w:r>
-              <w:rPr>
-                <w:rFonts w:ascii="Cascadia Mono" w:hAnsi="Cascadia Mono" w:cs="Cascadia Mono"/>
-                <w:color w:val="000000"/>
-                <w:sz w:val="16"/>
-                <w:szCs w:val="16"/>
-              </w:rPr>
-              <w:t>filePath</w:t>
-            </w:r>
-            <w:proofErr w:type="spellEnd"/>
-            <w:r>
-              <w:rPr>
-                <w:rFonts w:ascii="Cascadia Mono" w:hAnsi="Cascadia Mono" w:cs="Cascadia Mono"/>
-                <w:color w:val="000000"/>
-                <w:sz w:val="16"/>
-                <w:szCs w:val="16"/>
-              </w:rPr>
-              <w:t xml:space="preserve"> = files[index - 1];</w:t>
+                <w:lang w:val="en-US"/>
+              </w:rPr>
+              <w:t>index - 1];</w:t>
             </w:r>
           </w:p>
           <w:p>
@@ -3164,97 +3317,107 @@
                 <w:color w:val="000000"/>
                 <w:sz w:val="16"/>
                 <w:szCs w:val="16"/>
-              </w:rPr>
-            </w:pPr>
-            <w:r>
-              <w:rPr>
-                <w:rFonts w:ascii="Cascadia Mono" w:hAnsi="Cascadia Mono" w:cs="Cascadia Mono"/>
-                <w:color w:val="000000"/>
-                <w:sz w:val="16"/>
-                <w:szCs w:val="16"/>
+                <w:lang w:val="en-US"/>
+              </w:rPr>
+            </w:pPr>
+            <w:r>
+              <w:rPr>
+                <w:rFonts w:ascii="Cascadia Mono" w:hAnsi="Cascadia Mono" w:cs="Cascadia Mono"/>
+                <w:color w:val="000000"/>
+                <w:sz w:val="16"/>
+                <w:szCs w:val="16"/>
+                <w:lang w:val="en-US"/>
               </w:rPr>
               <w:t xml:space="preserve">                            </w:t>
             </w:r>
+            <w:r>
+              <w:rPr>
+                <w:rFonts w:ascii="Cascadia Mono" w:hAnsi="Cascadia Mono" w:cs="Cascadia Mono"/>
+                <w:color w:val="0000FF"/>
+                <w:sz w:val="16"/>
+                <w:szCs w:val="16"/>
+                <w:lang w:val="en-US"/>
+              </w:rPr>
+              <w:t>string</w:t>
+            </w:r>
+            <w:r>
+              <w:rPr>
+                <w:rFonts w:ascii="Cascadia Mono" w:hAnsi="Cascadia Mono" w:cs="Cascadia Mono"/>
+                <w:color w:val="000000"/>
+                <w:sz w:val="16"/>
+                <w:szCs w:val="16"/>
+                <w:lang w:val="en-US"/>
+              </w:rPr>
+              <w:t xml:space="preserve"> </w:t>
+            </w:r>
+            <w:proofErr w:type="spellStart"/>
+            <w:r>
+              <w:rPr>
+                <w:rFonts w:ascii="Cascadia Mono" w:hAnsi="Cascadia Mono" w:cs="Cascadia Mono"/>
+                <w:color w:val="000000"/>
+                <w:sz w:val="16"/>
+                <w:szCs w:val="16"/>
+                <w:lang w:val="en-US"/>
+              </w:rPr>
+              <w:t>fileContent</w:t>
+            </w:r>
+            <w:proofErr w:type="spellEnd"/>
+            <w:r>
+              <w:rPr>
+                <w:rFonts w:ascii="Cascadia Mono" w:hAnsi="Cascadia Mono" w:cs="Cascadia Mono"/>
+                <w:color w:val="000000"/>
+                <w:sz w:val="16"/>
+                <w:szCs w:val="16"/>
+                <w:lang w:val="en-US"/>
+              </w:rPr>
+              <w:t xml:space="preserve"> = </w:t>
+            </w:r>
+            <w:proofErr w:type="spellStart"/>
+            <w:r>
+              <w:rPr>
+                <w:rFonts w:ascii="Cascadia Mono" w:hAnsi="Cascadia Mono" w:cs="Cascadia Mono"/>
+                <w:color w:val="000000"/>
+                <w:sz w:val="16"/>
+                <w:szCs w:val="16"/>
+                <w:lang w:val="en-US"/>
+              </w:rPr>
+              <w:t>File.ReadAllText</w:t>
+            </w:r>
+            <w:proofErr w:type="spellEnd"/>
+            <w:r>
+              <w:rPr>
+                <w:rFonts w:ascii="Cascadia Mono" w:hAnsi="Cascadia Mono" w:cs="Cascadia Mono"/>
+                <w:color w:val="000000"/>
+                <w:sz w:val="16"/>
+                <w:szCs w:val="16"/>
+                <w:lang w:val="en-US"/>
+              </w:rPr>
+              <w:t>(</w:t>
+            </w:r>
+            <w:proofErr w:type="spellStart"/>
+            <w:r>
+              <w:rPr>
+                <w:rFonts w:ascii="Cascadia Mono" w:hAnsi="Cascadia Mono" w:cs="Cascadia Mono"/>
+                <w:color w:val="000000"/>
+                <w:sz w:val="16"/>
+                <w:szCs w:val="16"/>
+                <w:lang w:val="en-US"/>
+              </w:rPr>
+              <w:t>filePath</w:t>
+            </w:r>
+            <w:proofErr w:type="spellEnd"/>
             <w:proofErr w:type="gramStart"/>
             <w:r>
               <w:rPr>
                 <w:rFonts w:ascii="Cascadia Mono" w:hAnsi="Cascadia Mono" w:cs="Cascadia Mono"/>
-                <w:color w:val="0000FF"/>
-                <w:sz w:val="16"/>
-                <w:szCs w:val="16"/>
-              </w:rPr>
-              <w:t>string</w:t>
+                <w:color w:val="000000"/>
+                <w:sz w:val="16"/>
+                <w:szCs w:val="16"/>
+                <w:lang w:val="en-US"/>
+              </w:rPr>
+              <w:t>);</w:t>
             </w:r>
             <w:proofErr w:type="gramEnd"/>
-            <w:r>
-              <w:rPr>
-                <w:rFonts w:ascii="Cascadia Mono" w:hAnsi="Cascadia Mono" w:cs="Cascadia Mono"/>
-                <w:color w:val="000000"/>
-                <w:sz w:val="16"/>
-                <w:szCs w:val="16"/>
-              </w:rPr>
-              <w:t xml:space="preserve"> </w:t>
-            </w:r>
-            <w:proofErr w:type="spellStart"/>
-            <w:r>
-              <w:rPr>
-                <w:rFonts w:ascii="Cascadia Mono" w:hAnsi="Cascadia Mono" w:cs="Cascadia Mono"/>
-                <w:color w:val="000000"/>
-                <w:sz w:val="16"/>
-                <w:szCs w:val="16"/>
-              </w:rPr>
-              <w:t>fileContent</w:t>
-            </w:r>
-            <w:proofErr w:type="spellEnd"/>
-            <w:r>
-              <w:rPr>
-                <w:rFonts w:ascii="Cascadia Mono" w:hAnsi="Cascadia Mono" w:cs="Cascadia Mono"/>
-                <w:color w:val="000000"/>
-                <w:sz w:val="16"/>
-                <w:szCs w:val="16"/>
-              </w:rPr>
-              <w:t xml:space="preserve"> = </w:t>
-            </w:r>
-            <w:proofErr w:type="spellStart"/>
-            <w:r>
-              <w:rPr>
-                <w:rFonts w:ascii="Cascadia Mono" w:hAnsi="Cascadia Mono" w:cs="Cascadia Mono"/>
-                <w:color w:val="000000"/>
-                <w:sz w:val="16"/>
-                <w:szCs w:val="16"/>
-              </w:rPr>
-              <w:t>File.ReadAllText</w:t>
-            </w:r>
-            <w:proofErr w:type="spellEnd"/>
-            <w:r>
-              <w:rPr>
-                <w:rFonts w:ascii="Cascadia Mono" w:hAnsi="Cascadia Mono" w:cs="Cascadia Mono"/>
-                <w:color w:val="000000"/>
-                <w:sz w:val="16"/>
-                <w:szCs w:val="16"/>
-              </w:rPr>
-              <w:t>(</w:t>
-            </w:r>
-            <w:proofErr w:type="spellStart"/>
-            <w:r>
-              <w:rPr>
-                <w:rFonts w:ascii="Cascadia Mono" w:hAnsi="Cascadia Mono" w:cs="Cascadia Mono"/>
-                <w:color w:val="000000"/>
-                <w:sz w:val="16"/>
-                <w:szCs w:val="16"/>
-              </w:rPr>
-              <w:t>filePath</w:t>
-            </w:r>
-            <w:proofErr w:type="spellEnd"/>
-            <w:r>
-              <w:rPr>
-                <w:rFonts w:ascii="Cascadia Mono" w:hAnsi="Cascadia Mono" w:cs="Cascadia Mono"/>
-                <w:color w:val="000000"/>
-                <w:sz w:val="16"/>
-                <w:szCs w:val="16"/>
-              </w:rPr>
-              <w:t>);</w:t>
-            </w:r>
           </w:p>
           <w:p>
             <w:pPr>
@@ -3274,6 +3437,7 @@
                 <w:color w:val="000000"/>
                 <w:sz w:val="16"/>
                 <w:szCs w:val="16"/>
+                <w:lang w:val="en-US"/>
               </w:rPr>
               <w:t xml:space="preserve">                            </w:t>
             </w:r>
@@ -3809,6 +3973,7 @@
                 <w:color w:val="000000"/>
                 <w:sz w:val="16"/>
                 <w:szCs w:val="16"/>
+                <w:lang w:val="en-US"/>
               </w:rPr>
             </w:pPr>
             <w:r>
@@ -3820,66 +3985,82 @@
               </w:rPr>
               <w:t xml:space="preserve">                            </w:t>
             </w:r>
+            <w:r>
+              <w:rPr>
+                <w:rFonts w:ascii="Cascadia Mono" w:hAnsi="Cascadia Mono" w:cs="Cascadia Mono"/>
+                <w:color w:val="0000FF"/>
+                <w:sz w:val="16"/>
+                <w:szCs w:val="16"/>
+                <w:lang w:val="en-US"/>
+              </w:rPr>
+              <w:t>string</w:t>
+            </w:r>
+            <w:r>
+              <w:rPr>
+                <w:rFonts w:ascii="Cascadia Mono" w:hAnsi="Cascadia Mono" w:cs="Cascadia Mono"/>
+                <w:color w:val="000000"/>
+                <w:sz w:val="16"/>
+                <w:szCs w:val="16"/>
+                <w:lang w:val="en-US"/>
+              </w:rPr>
+              <w:t xml:space="preserve"> </w:t>
+            </w:r>
+            <w:proofErr w:type="spellStart"/>
+            <w:r>
+              <w:rPr>
+                <w:rFonts w:ascii="Cascadia Mono" w:hAnsi="Cascadia Mono" w:cs="Cascadia Mono"/>
+                <w:color w:val="000000"/>
+                <w:sz w:val="16"/>
+                <w:szCs w:val="16"/>
+                <w:lang w:val="en-US"/>
+              </w:rPr>
+              <w:t>newMotDePasse</w:t>
+            </w:r>
+            <w:proofErr w:type="spellEnd"/>
+            <w:r>
+              <w:rPr>
+                <w:rFonts w:ascii="Cascadia Mono" w:hAnsi="Cascadia Mono" w:cs="Cascadia Mono"/>
+                <w:color w:val="000000"/>
+                <w:sz w:val="16"/>
+                <w:szCs w:val="16"/>
+                <w:lang w:val="en-US"/>
+              </w:rPr>
+              <w:t xml:space="preserve"> = </w:t>
+            </w:r>
+            <w:proofErr w:type="spellStart"/>
+            <w:r>
+              <w:rPr>
+                <w:rFonts w:ascii="Cascadia Mono" w:hAnsi="Cascadia Mono" w:cs="Cascadia Mono"/>
+                <w:color w:val="000000"/>
+                <w:sz w:val="16"/>
+                <w:szCs w:val="16"/>
+                <w:lang w:val="en-US"/>
+              </w:rPr>
+              <w:t>Console.ReadLine</w:t>
+            </w:r>
+            <w:proofErr w:type="spellEnd"/>
+            <w:r>
+              <w:rPr>
+                <w:rFonts w:ascii="Cascadia Mono" w:hAnsi="Cascadia Mono" w:cs="Cascadia Mono"/>
+                <w:color w:val="000000"/>
+                <w:sz w:val="16"/>
+                <w:szCs w:val="16"/>
+                <w:lang w:val="en-US"/>
+              </w:rPr>
+              <w:t>(</w:t>
+            </w:r>
             <w:proofErr w:type="gramStart"/>
             <w:r>
               <w:rPr>
                 <w:rFonts w:ascii="Cascadia Mono" w:hAnsi="Cascadia Mono" w:cs="Cascadia Mono"/>
-                <w:color w:val="0000FF"/>
-                <w:sz w:val="16"/>
-                <w:szCs w:val="16"/>
-              </w:rPr>
-              <w:t>string</w:t>
+                <w:color w:val="000000"/>
+                <w:sz w:val="16"/>
+                <w:szCs w:val="16"/>
+                <w:lang w:val="en-US"/>
+              </w:rPr>
+              <w:t>);</w:t>
             </w:r>
             <w:proofErr w:type="gramEnd"/>
-            <w:r>
-              <w:rPr>
-                <w:rFonts w:ascii="Cascadia Mono" w:hAnsi="Cascadia Mono" w:cs="Cascadia Mono"/>
-                <w:color w:val="000000"/>
-                <w:sz w:val="16"/>
-                <w:szCs w:val="16"/>
-              </w:rPr>
-              <w:t xml:space="preserve"> </w:t>
-            </w:r>
-            <w:proofErr w:type="spellStart"/>
-            <w:r>
-              <w:rPr>
-                <w:rFonts w:ascii="Cascadia Mono" w:hAnsi="Cascadia Mono" w:cs="Cascadia Mono"/>
-                <w:color w:val="000000"/>
-                <w:sz w:val="16"/>
-                <w:szCs w:val="16"/>
-              </w:rPr>
-              <w:t>newMotDePasse</w:t>
-            </w:r>
-            <w:proofErr w:type="spellEnd"/>
-            <w:r>
-              <w:rPr>
-                <w:rFonts w:ascii="Cascadia Mono" w:hAnsi="Cascadia Mono" w:cs="Cascadia Mono"/>
-                <w:color w:val="000000"/>
-                <w:sz w:val="16"/>
-                <w:szCs w:val="16"/>
-              </w:rPr>
-              <w:t xml:space="preserve"> = </w:t>
-            </w:r>
-            <w:proofErr w:type="spellStart"/>
-            <w:r>
-              <w:rPr>
-                <w:rFonts w:ascii="Cascadia Mono" w:hAnsi="Cascadia Mono" w:cs="Cascadia Mono"/>
-                <w:color w:val="000000"/>
-                <w:sz w:val="16"/>
-                <w:szCs w:val="16"/>
-              </w:rPr>
-              <w:t>Console.ReadLine</w:t>
-            </w:r>
-            <w:proofErr w:type="spellEnd"/>
-            <w:r>
-              <w:rPr>
-                <w:rFonts w:ascii="Cascadia Mono" w:hAnsi="Cascadia Mono" w:cs="Cascadia Mono"/>
-                <w:color w:val="000000"/>
-                <w:sz w:val="16"/>
-                <w:szCs w:val="16"/>
-              </w:rPr>
-              <w:t>();</w:t>
-            </w:r>
           </w:p>
           <w:p>
             <w:pPr>
@@ -3891,6 +4072,7 @@
                 <w:color w:val="000000"/>
                 <w:sz w:val="16"/>
                 <w:szCs w:val="16"/>
+                <w:lang w:val="en-US"/>
               </w:rPr>
             </w:pPr>
           </w:p>
@@ -3904,14 +4086,16 @@
                 <w:color w:val="000000"/>
                 <w:sz w:val="16"/>
                 <w:szCs w:val="16"/>
-              </w:rPr>
-            </w:pPr>
-            <w:r>
-              <w:rPr>
-                <w:rFonts w:ascii="Cascadia Mono" w:hAnsi="Cascadia Mono" w:cs="Cascadia Mono"/>
-                <w:color w:val="000000"/>
-                <w:sz w:val="16"/>
-                <w:szCs w:val="16"/>
+                <w:lang w:val="en-US"/>
+              </w:rPr>
+            </w:pPr>
+            <w:r>
+              <w:rPr>
+                <w:rFonts w:ascii="Cascadia Mono" w:hAnsi="Cascadia Mono" w:cs="Cascadia Mono"/>
+                <w:color w:val="000000"/>
+                <w:sz w:val="16"/>
+                <w:szCs w:val="16"/>
+                <w:lang w:val="en-US"/>
               </w:rPr>
               <w:t xml:space="preserve">                            </w:t>
             </w:r>
@@ -3922,6 +4106,7 @@
                 <w:color w:val="0000FF"/>
                 <w:sz w:val="16"/>
                 <w:szCs w:val="16"/>
+                <w:lang w:val="en-US"/>
               </w:rPr>
               <w:t>string</w:t>
             </w:r>
@@ -3931,6 +4116,7 @@
                 <w:color w:val="000000"/>
                 <w:sz w:val="16"/>
                 <w:szCs w:val="16"/>
+                <w:lang w:val="en-US"/>
               </w:rPr>
               <w:t>[</w:t>
             </w:r>
@@ -3941,8 +4127,9 @@
                 <w:color w:val="000000"/>
                 <w:sz w:val="16"/>
                 <w:szCs w:val="16"/>
-              </w:rPr>
-              <w:t xml:space="preserve">] </w:t>
+                <w:lang w:val="en-US"/>
+              </w:rPr>
+              <w:t xml:space="preserve">] lines = </w:t>
             </w:r>
             <w:proofErr w:type="spellStart"/>
             <w:r>
@@ -3951,8 +4138,9 @@
                 <w:color w:val="000000"/>
                 <w:sz w:val="16"/>
                 <w:szCs w:val="16"/>
-              </w:rPr>
-              <w:t>lines</w:t>
+                <w:lang w:val="en-US"/>
+              </w:rPr>
+              <w:t>fileContent.Split</w:t>
             </w:r>
             <w:proofErr w:type="spellEnd"/>
             <w:r>
@@ -3961,8 +4149,29 @@
                 <w:color w:val="000000"/>
                 <w:sz w:val="16"/>
                 <w:szCs w:val="16"/>
-              </w:rPr>
-              <w:t xml:space="preserve"> = </w:t>
+                <w:lang w:val="en-US"/>
+              </w:rPr>
+              <w:t>(</w:t>
+            </w:r>
+            <w:r>
+              <w:rPr>
+                <w:rFonts w:ascii="Cascadia Mono" w:hAnsi="Cascadia Mono" w:cs="Cascadia Mono"/>
+                <w:color w:val="0000FF"/>
+                <w:sz w:val="16"/>
+                <w:szCs w:val="16"/>
+                <w:lang w:val="en-US"/>
+              </w:rPr>
+              <w:t>new</w:t>
+            </w:r>
+            <w:r>
+              <w:rPr>
+                <w:rFonts w:ascii="Cascadia Mono" w:hAnsi="Cascadia Mono" w:cs="Cascadia Mono"/>
+                <w:color w:val="000000"/>
+                <w:sz w:val="16"/>
+                <w:szCs w:val="16"/>
+                <w:lang w:val="en-US"/>
+              </w:rPr>
+              <w:t xml:space="preserve">[] { </w:t>
             </w:r>
             <w:proofErr w:type="spellStart"/>
             <w:r>
@@ -3971,8 +4180,9 @@
                 <w:color w:val="000000"/>
                 <w:sz w:val="16"/>
                 <w:szCs w:val="16"/>
-              </w:rPr>
-              <w:t>fileContent.Split</w:t>
+                <w:lang w:val="en-US"/>
+              </w:rPr>
+              <w:t>Environment.NewLine</w:t>
             </w:r>
             <w:proofErr w:type="spellEnd"/>
             <w:r>
@@ -3981,26 +4191,9 @@
                 <w:color w:val="000000"/>
                 <w:sz w:val="16"/>
                 <w:szCs w:val="16"/>
-              </w:rPr>
-              <w:t>(</w:t>
-            </w:r>
-            <w:r>
-              <w:rPr>
-                <w:rFonts w:ascii="Cascadia Mono" w:hAnsi="Cascadia Mono" w:cs="Cascadia Mono"/>
-                <w:color w:val="0000FF"/>
-                <w:sz w:val="16"/>
-                <w:szCs w:val="16"/>
-              </w:rPr>
-              <w:t>new</w:t>
-            </w:r>
-            <w:r>
-              <w:rPr>
-                <w:rFonts w:ascii="Cascadia Mono" w:hAnsi="Cascadia Mono" w:cs="Cascadia Mono"/>
-                <w:color w:val="000000"/>
-                <w:sz w:val="16"/>
-                <w:szCs w:val="16"/>
-              </w:rPr>
-              <w:t xml:space="preserve">[] { </w:t>
+                <w:lang w:val="en-US"/>
+              </w:rPr>
+              <w:t xml:space="preserve"> }, </w:t>
             </w:r>
             <w:proofErr w:type="spellStart"/>
             <w:r>
@@ -4009,8 +4202,9 @@
                 <w:color w:val="000000"/>
                 <w:sz w:val="16"/>
                 <w:szCs w:val="16"/>
-              </w:rPr>
-              <w:t>Environment.NewLine</w:t>
+                <w:lang w:val="en-US"/>
+              </w:rPr>
+              <w:t>StringSplitOptions.None</w:t>
             </w:r>
             <w:proofErr w:type="spellEnd"/>
             <w:r>
@@ -4019,26 +4213,7 @@
                 <w:color w:val="000000"/>
                 <w:sz w:val="16"/>
                 <w:szCs w:val="16"/>
-              </w:rPr>
-              <w:t xml:space="preserve"> }, </w:t>
-            </w:r>
-            <w:proofErr w:type="spellStart"/>
-            <w:r>
-              <w:rPr>
-                <w:rFonts w:ascii="Cascadia Mono" w:hAnsi="Cascadia Mono" w:cs="Cascadia Mono"/>
-                <w:color w:val="000000"/>
-                <w:sz w:val="16"/>
-                <w:szCs w:val="16"/>
-              </w:rPr>
-              <w:t>StringSplitOptions.None</w:t>
-            </w:r>
-            <w:proofErr w:type="spellEnd"/>
-            <w:r>
-              <w:rPr>
-                <w:rFonts w:ascii="Cascadia Mono" w:hAnsi="Cascadia Mono" w:cs="Cascadia Mono"/>
-                <w:color w:val="000000"/>
-                <w:sz w:val="16"/>
-                <w:szCs w:val="16"/>
+                <w:lang w:val="en-US"/>
               </w:rPr>
               <w:t>);</w:t>
             </w:r>
@@ -4061,6 +4236,7 @@
                 <w:color w:val="000000"/>
                 <w:sz w:val="16"/>
                 <w:szCs w:val="16"/>
+                <w:lang w:val="en-US"/>
               </w:rPr>
               <w:t xml:space="preserve">                            </w:t>
             </w:r>
@@ -4166,6 +4342,7 @@
                 <w:color w:val="000000"/>
                 <w:sz w:val="16"/>
                 <w:szCs w:val="16"/>
+                <w:lang w:val="en-US"/>
               </w:rPr>
             </w:pPr>
             <w:r>
@@ -4177,16 +4354,58 @@
               </w:rPr>
               <w:t xml:space="preserve">                                </w:t>
             </w:r>
+            <w:proofErr w:type="gramStart"/>
+            <w:r>
+              <w:rPr>
+                <w:rFonts w:ascii="Cascadia Mono" w:hAnsi="Cascadia Mono" w:cs="Cascadia Mono"/>
+                <w:color w:val="000000"/>
+                <w:sz w:val="16"/>
+                <w:szCs w:val="16"/>
+                <w:lang w:val="en-US"/>
+              </w:rPr>
+              <w:t>lines[</w:t>
+            </w:r>
+            <w:proofErr w:type="gramEnd"/>
+            <w:r>
+              <w:rPr>
+                <w:rFonts w:ascii="Cascadia Mono" w:hAnsi="Cascadia Mono" w:cs="Cascadia Mono"/>
+                <w:color w:val="000000"/>
+                <w:sz w:val="16"/>
+                <w:szCs w:val="16"/>
+                <w:lang w:val="en-US"/>
+              </w:rPr>
+              <w:t xml:space="preserve">0] = </w:t>
+            </w:r>
+            <w:r>
+              <w:rPr>
+                <w:rFonts w:ascii="Cascadia Mono" w:hAnsi="Cascadia Mono" w:cs="Cascadia Mono"/>
+                <w:color w:val="A31515"/>
+                <w:sz w:val="16"/>
+                <w:szCs w:val="16"/>
+                <w:lang w:val="en-US"/>
+              </w:rPr>
+              <w:t>"URL : "</w:t>
+            </w:r>
+            <w:r>
+              <w:rPr>
+                <w:rFonts w:ascii="Cascadia Mono" w:hAnsi="Cascadia Mono" w:cs="Cascadia Mono"/>
+                <w:color w:val="000000"/>
+                <w:sz w:val="16"/>
+                <w:szCs w:val="16"/>
+                <w:lang w:val="en-US"/>
+              </w:rPr>
+              <w:t xml:space="preserve"> + </w:t>
+            </w:r>
             <w:proofErr w:type="spellStart"/>
-            <w:proofErr w:type="gramStart"/>
-            <w:r>
-              <w:rPr>
-                <w:rFonts w:ascii="Cascadia Mono" w:hAnsi="Cascadia Mono" w:cs="Cascadia Mono"/>
-                <w:color w:val="000000"/>
-                <w:sz w:val="16"/>
-                <w:szCs w:val="16"/>
-              </w:rPr>
-              <w:t>lines</w:t>
+            <w:r>
+              <w:rPr>
+                <w:rFonts w:ascii="Cascadia Mono" w:hAnsi="Cascadia Mono" w:cs="Cascadia Mono"/>
+                <w:color w:val="000000"/>
+                <w:sz w:val="16"/>
+                <w:szCs w:val="16"/>
+                <w:lang w:val="en-US"/>
+              </w:rPr>
+              <w:t>newUrl</w:t>
             </w:r>
             <w:proofErr w:type="spellEnd"/>
             <w:r>
@@ -4195,54 +4414,7 @@
                 <w:color w:val="000000"/>
                 <w:sz w:val="16"/>
                 <w:szCs w:val="16"/>
-              </w:rPr>
-              <w:t>[</w:t>
-            </w:r>
-            <w:proofErr w:type="gramEnd"/>
-            <w:r>
-              <w:rPr>
-                <w:rFonts w:ascii="Cascadia Mono" w:hAnsi="Cascadia Mono" w:cs="Cascadia Mono"/>
-                <w:color w:val="000000"/>
-                <w:sz w:val="16"/>
-                <w:szCs w:val="16"/>
-              </w:rPr>
-              <w:t xml:space="preserve">0] = </w:t>
-            </w:r>
-            <w:r>
-              <w:rPr>
-                <w:rFonts w:ascii="Cascadia Mono" w:hAnsi="Cascadia Mono" w:cs="Cascadia Mono"/>
-                <w:color w:val="A31515"/>
-                <w:sz w:val="16"/>
-                <w:szCs w:val="16"/>
-              </w:rPr>
-              <w:t>"URL : "</w:t>
-            </w:r>
-            <w:r>
-              <w:rPr>
-                <w:rFonts w:ascii="Cascadia Mono" w:hAnsi="Cascadia Mono" w:cs="Cascadia Mono"/>
-                <w:color w:val="000000"/>
-                <w:sz w:val="16"/>
-                <w:szCs w:val="16"/>
-              </w:rPr>
-              <w:t xml:space="preserve"> + </w:t>
-            </w:r>
-            <w:proofErr w:type="spellStart"/>
-            <w:r>
-              <w:rPr>
-                <w:rFonts w:ascii="Cascadia Mono" w:hAnsi="Cascadia Mono" w:cs="Cascadia Mono"/>
-                <w:color w:val="000000"/>
-                <w:sz w:val="16"/>
-                <w:szCs w:val="16"/>
-              </w:rPr>
-              <w:t>newUrl</w:t>
-            </w:r>
-            <w:proofErr w:type="spellEnd"/>
-            <w:r>
-              <w:rPr>
-                <w:rFonts w:ascii="Cascadia Mono" w:hAnsi="Cascadia Mono" w:cs="Cascadia Mono"/>
-                <w:color w:val="000000"/>
-                <w:sz w:val="16"/>
-                <w:szCs w:val="16"/>
+                <w:lang w:val="en-US"/>
               </w:rPr>
               <w:t>;</w:t>
             </w:r>
@@ -4257,77 +4429,85 @@
                 <w:color w:val="000000"/>
                 <w:sz w:val="16"/>
                 <w:szCs w:val="16"/>
-              </w:rPr>
-            </w:pPr>
-            <w:r>
-              <w:rPr>
-                <w:rFonts w:ascii="Cascadia Mono" w:hAnsi="Cascadia Mono" w:cs="Cascadia Mono"/>
-                <w:color w:val="000000"/>
-                <w:sz w:val="16"/>
-                <w:szCs w:val="16"/>
+                <w:lang w:val="en-US"/>
+              </w:rPr>
+            </w:pPr>
+            <w:r>
+              <w:rPr>
+                <w:rFonts w:ascii="Cascadia Mono" w:hAnsi="Cascadia Mono" w:cs="Cascadia Mono"/>
+                <w:color w:val="000000"/>
+                <w:sz w:val="16"/>
+                <w:szCs w:val="16"/>
+                <w:lang w:val="en-US"/>
               </w:rPr>
               <w:t xml:space="preserve">                                </w:t>
             </w:r>
+            <w:r>
+              <w:rPr>
+                <w:rFonts w:ascii="Cascadia Mono" w:hAnsi="Cascadia Mono" w:cs="Cascadia Mono"/>
+                <w:color w:val="0000FF"/>
+                <w:sz w:val="16"/>
+                <w:szCs w:val="16"/>
+                <w:lang w:val="en-US"/>
+              </w:rPr>
+              <w:t>string</w:t>
+            </w:r>
+            <w:r>
+              <w:rPr>
+                <w:rFonts w:ascii="Cascadia Mono" w:hAnsi="Cascadia Mono" w:cs="Cascadia Mono"/>
+                <w:color w:val="000000"/>
+                <w:sz w:val="16"/>
+                <w:szCs w:val="16"/>
+                <w:lang w:val="en-US"/>
+              </w:rPr>
+              <w:t xml:space="preserve"> </w:t>
+            </w:r>
+            <w:proofErr w:type="spellStart"/>
+            <w:r>
+              <w:rPr>
+                <w:rFonts w:ascii="Cascadia Mono" w:hAnsi="Cascadia Mono" w:cs="Cascadia Mono"/>
+                <w:color w:val="000000"/>
+                <w:sz w:val="16"/>
+                <w:szCs w:val="16"/>
+                <w:lang w:val="en-US"/>
+              </w:rPr>
+              <w:t>newFileName</w:t>
+            </w:r>
+            <w:proofErr w:type="spellEnd"/>
+            <w:r>
+              <w:rPr>
+                <w:rFonts w:ascii="Cascadia Mono" w:hAnsi="Cascadia Mono" w:cs="Cascadia Mono"/>
+                <w:color w:val="000000"/>
+                <w:sz w:val="16"/>
+                <w:szCs w:val="16"/>
+                <w:lang w:val="en-US"/>
+              </w:rPr>
+              <w:t xml:space="preserve"> = </w:t>
+            </w:r>
+            <w:proofErr w:type="spellStart"/>
             <w:proofErr w:type="gramStart"/>
             <w:r>
               <w:rPr>
                 <w:rFonts w:ascii="Cascadia Mono" w:hAnsi="Cascadia Mono" w:cs="Cascadia Mono"/>
-                <w:color w:val="0000FF"/>
-                <w:sz w:val="16"/>
-                <w:szCs w:val="16"/>
-              </w:rPr>
-              <w:t>string</w:t>
+                <w:color w:val="000000"/>
+                <w:sz w:val="16"/>
+                <w:szCs w:val="16"/>
+                <w:lang w:val="en-US"/>
+              </w:rPr>
+              <w:t>newUrl</w:t>
+            </w:r>
+            <w:proofErr w:type="spellEnd"/>
+            <w:r>
+              <w:rPr>
+                <w:rFonts w:ascii="Cascadia Mono" w:hAnsi="Cascadia Mono" w:cs="Cascadia Mono"/>
+                <w:color w:val="000000"/>
+                <w:sz w:val="16"/>
+                <w:szCs w:val="16"/>
+                <w:lang w:val="en-US"/>
+              </w:rPr>
+              <w:t>;</w:t>
             </w:r>
             <w:proofErr w:type="gramEnd"/>
-            <w:r>
-              <w:rPr>
-                <w:rFonts w:ascii="Cascadia Mono" w:hAnsi="Cascadia Mono" w:cs="Cascadia Mono"/>
-                <w:color w:val="000000"/>
-                <w:sz w:val="16"/>
-                <w:szCs w:val="16"/>
-              </w:rPr>
-              <w:t xml:space="preserve"> </w:t>
-            </w:r>
-            <w:proofErr w:type="spellStart"/>
-            <w:r>
-              <w:rPr>
-                <w:rFonts w:ascii="Cascadia Mono" w:hAnsi="Cascadia Mono" w:cs="Cascadia Mono"/>
-                <w:color w:val="000000"/>
-                <w:sz w:val="16"/>
-                <w:szCs w:val="16"/>
-              </w:rPr>
-              <w:t>newFileName</w:t>
-            </w:r>
-            <w:proofErr w:type="spellEnd"/>
-            <w:r>
-              <w:rPr>
-                <w:rFonts w:ascii="Cascadia Mono" w:hAnsi="Cascadia Mono" w:cs="Cascadia Mono"/>
-                <w:color w:val="000000"/>
-                <w:sz w:val="16"/>
-                <w:szCs w:val="16"/>
-              </w:rPr>
-              <w:t xml:space="preserve"> = </w:t>
-            </w:r>
-            <w:proofErr w:type="spellStart"/>
-            <w:r>
-              <w:rPr>
-                <w:rFonts w:ascii="Cascadia Mono" w:hAnsi="Cascadia Mono" w:cs="Cascadia Mono"/>
-                <w:color w:val="000000"/>
-                <w:sz w:val="16"/>
-                <w:szCs w:val="16"/>
-              </w:rPr>
-              <w:t>newUrl</w:t>
-            </w:r>
-            <w:proofErr w:type="spellEnd"/>
-            <w:r>
-              <w:rPr>
-                <w:rFonts w:ascii="Cascadia Mono" w:hAnsi="Cascadia Mono" w:cs="Cascadia Mono"/>
-                <w:color w:val="000000"/>
-                <w:sz w:val="16"/>
-                <w:szCs w:val="16"/>
-              </w:rPr>
-              <w:t>;</w:t>
-            </w:r>
           </w:p>
           <w:p>
             <w:pPr>
@@ -4339,117 +4519,129 @@
                 <w:color w:val="000000"/>
                 <w:sz w:val="16"/>
                 <w:szCs w:val="16"/>
-              </w:rPr>
-            </w:pPr>
-            <w:r>
-              <w:rPr>
-                <w:rFonts w:ascii="Cascadia Mono" w:hAnsi="Cascadia Mono" w:cs="Cascadia Mono"/>
-                <w:color w:val="000000"/>
-                <w:sz w:val="16"/>
-                <w:szCs w:val="16"/>
+                <w:lang w:val="en-US"/>
+              </w:rPr>
+            </w:pPr>
+            <w:r>
+              <w:rPr>
+                <w:rFonts w:ascii="Cascadia Mono" w:hAnsi="Cascadia Mono" w:cs="Cascadia Mono"/>
+                <w:color w:val="000000"/>
+                <w:sz w:val="16"/>
+                <w:szCs w:val="16"/>
+                <w:lang w:val="en-US"/>
               </w:rPr>
               <w:t xml:space="preserve">                                </w:t>
             </w:r>
+            <w:r>
+              <w:rPr>
+                <w:rFonts w:ascii="Cascadia Mono" w:hAnsi="Cascadia Mono" w:cs="Cascadia Mono"/>
+                <w:color w:val="0000FF"/>
+                <w:sz w:val="16"/>
+                <w:szCs w:val="16"/>
+                <w:lang w:val="en-US"/>
+              </w:rPr>
+              <w:t>string</w:t>
+            </w:r>
+            <w:r>
+              <w:rPr>
+                <w:rFonts w:ascii="Cascadia Mono" w:hAnsi="Cascadia Mono" w:cs="Cascadia Mono"/>
+                <w:color w:val="000000"/>
+                <w:sz w:val="16"/>
+                <w:szCs w:val="16"/>
+                <w:lang w:val="en-US"/>
+              </w:rPr>
+              <w:t xml:space="preserve"> </w:t>
+            </w:r>
+            <w:proofErr w:type="spellStart"/>
+            <w:r>
+              <w:rPr>
+                <w:rFonts w:ascii="Cascadia Mono" w:hAnsi="Cascadia Mono" w:cs="Cascadia Mono"/>
+                <w:color w:val="000000"/>
+                <w:sz w:val="16"/>
+                <w:szCs w:val="16"/>
+                <w:lang w:val="en-US"/>
+              </w:rPr>
+              <w:t>newFilePath</w:t>
+            </w:r>
+            <w:proofErr w:type="spellEnd"/>
+            <w:r>
+              <w:rPr>
+                <w:rFonts w:ascii="Cascadia Mono" w:hAnsi="Cascadia Mono" w:cs="Cascadia Mono"/>
+                <w:color w:val="000000"/>
+                <w:sz w:val="16"/>
+                <w:szCs w:val="16"/>
+                <w:lang w:val="en-US"/>
+              </w:rPr>
+              <w:t xml:space="preserve"> = </w:t>
+            </w:r>
+            <w:proofErr w:type="spellStart"/>
+            <w:r>
+              <w:rPr>
+                <w:rFonts w:ascii="Cascadia Mono" w:hAnsi="Cascadia Mono" w:cs="Cascadia Mono"/>
+                <w:color w:val="000000"/>
+                <w:sz w:val="16"/>
+                <w:szCs w:val="16"/>
+                <w:lang w:val="en-US"/>
+              </w:rPr>
+              <w:t>Path.Combine</w:t>
+            </w:r>
+            <w:proofErr w:type="spellEnd"/>
+            <w:r>
+              <w:rPr>
+                <w:rFonts w:ascii="Cascadia Mono" w:hAnsi="Cascadia Mono" w:cs="Cascadia Mono"/>
+                <w:color w:val="000000"/>
+                <w:sz w:val="16"/>
+                <w:szCs w:val="16"/>
+                <w:lang w:val="en-US"/>
+              </w:rPr>
+              <w:t>(</w:t>
+            </w:r>
+            <w:proofErr w:type="spellStart"/>
+            <w:r>
+              <w:rPr>
+                <w:rFonts w:ascii="Cascadia Mono" w:hAnsi="Cascadia Mono" w:cs="Cascadia Mono"/>
+                <w:color w:val="000000"/>
+                <w:sz w:val="16"/>
+                <w:szCs w:val="16"/>
+                <w:lang w:val="en-US"/>
+              </w:rPr>
+              <w:t>directoryPath</w:t>
+            </w:r>
+            <w:proofErr w:type="spellEnd"/>
+            <w:r>
+              <w:rPr>
+                <w:rFonts w:ascii="Cascadia Mono" w:hAnsi="Cascadia Mono" w:cs="Cascadia Mono"/>
+                <w:color w:val="000000"/>
+                <w:sz w:val="16"/>
+                <w:szCs w:val="16"/>
+                <w:lang w:val="en-US"/>
+              </w:rPr>
+              <w:t xml:space="preserve">, </w:t>
+            </w:r>
+            <w:proofErr w:type="spellStart"/>
+            <w:r>
+              <w:rPr>
+                <w:rFonts w:ascii="Cascadia Mono" w:hAnsi="Cascadia Mono" w:cs="Cascadia Mono"/>
+                <w:color w:val="000000"/>
+                <w:sz w:val="16"/>
+                <w:szCs w:val="16"/>
+                <w:lang w:val="en-US"/>
+              </w:rPr>
+              <w:t>newFileName</w:t>
+            </w:r>
+            <w:proofErr w:type="spellEnd"/>
             <w:proofErr w:type="gramStart"/>
             <w:r>
               <w:rPr>
                 <w:rFonts w:ascii="Cascadia Mono" w:hAnsi="Cascadia Mono" w:cs="Cascadia Mono"/>
-                <w:color w:val="0000FF"/>
-                <w:sz w:val="16"/>
-                <w:szCs w:val="16"/>
-              </w:rPr>
-              <w:t>string</w:t>
+                <w:color w:val="000000"/>
+                <w:sz w:val="16"/>
+                <w:szCs w:val="16"/>
+                <w:lang w:val="en-US"/>
+              </w:rPr>
+              <w:t>);</w:t>
             </w:r>
             <w:proofErr w:type="gramEnd"/>
-            <w:r>
-              <w:rPr>
-                <w:rFonts w:ascii="Cascadia Mono" w:hAnsi="Cascadia Mono" w:cs="Cascadia Mono"/>
-                <w:color w:val="000000"/>
-                <w:sz w:val="16"/>
-                <w:szCs w:val="16"/>
-              </w:rPr>
-              <w:t xml:space="preserve"> </w:t>
-            </w:r>
-            <w:proofErr w:type="spellStart"/>
-            <w:r>
-              <w:rPr>
-                <w:rFonts w:ascii="Cascadia Mono" w:hAnsi="Cascadia Mono" w:cs="Cascadia Mono"/>
-                <w:color w:val="000000"/>
-                <w:sz w:val="16"/>
-                <w:szCs w:val="16"/>
-              </w:rPr>
-              <w:t>newFilePath</w:t>
-            </w:r>
-            <w:proofErr w:type="spellEnd"/>
-            <w:r>
-              <w:rPr>
-                <w:rFonts w:ascii="Cascadia Mono" w:hAnsi="Cascadia Mono" w:cs="Cascadia Mono"/>
-                <w:color w:val="000000"/>
-                <w:sz w:val="16"/>
-                <w:szCs w:val="16"/>
-              </w:rPr>
-              <w:t xml:space="preserve"> = </w:t>
-            </w:r>
-            <w:proofErr w:type="spellStart"/>
-            <w:r>
-              <w:rPr>
-                <w:rFonts w:ascii="Cascadia Mono" w:hAnsi="Cascadia Mono" w:cs="Cascadia Mono"/>
-                <w:color w:val="000000"/>
-                <w:sz w:val="16"/>
-                <w:szCs w:val="16"/>
-              </w:rPr>
-              <w:t>Path.Combine</w:t>
-            </w:r>
-            <w:proofErr w:type="spellEnd"/>
-            <w:r>
-              <w:rPr>
-                <w:rFonts w:ascii="Cascadia Mono" w:hAnsi="Cascadia Mono" w:cs="Cascadia Mono"/>
-                <w:color w:val="000000"/>
-                <w:sz w:val="16"/>
-                <w:szCs w:val="16"/>
-              </w:rPr>
-              <w:t>(</w:t>
-            </w:r>
-            <w:proofErr w:type="spellStart"/>
-            <w:r>
-              <w:rPr>
-                <w:rFonts w:ascii="Cascadia Mono" w:hAnsi="Cascadia Mono" w:cs="Cascadia Mono"/>
-                <w:color w:val="000000"/>
-                <w:sz w:val="16"/>
-                <w:szCs w:val="16"/>
-              </w:rPr>
-              <w:t>directoryPath</w:t>
-            </w:r>
-            <w:proofErr w:type="spellEnd"/>
-            <w:r>
-              <w:rPr>
-                <w:rFonts w:ascii="Cascadia Mono" w:hAnsi="Cascadia Mono" w:cs="Cascadia Mono"/>
-                <w:color w:val="000000"/>
-                <w:sz w:val="16"/>
-                <w:szCs w:val="16"/>
-              </w:rPr>
-              <w:t xml:space="preserve">, </w:t>
-            </w:r>
-            <w:proofErr w:type="spellStart"/>
-            <w:r>
-              <w:rPr>
-                <w:rFonts w:ascii="Cascadia Mono" w:hAnsi="Cascadia Mono" w:cs="Cascadia Mono"/>
-                <w:color w:val="000000"/>
-                <w:sz w:val="16"/>
-                <w:szCs w:val="16"/>
-              </w:rPr>
-              <w:t>newFileName</w:t>
-            </w:r>
-            <w:proofErr w:type="spellEnd"/>
-            <w:r>
-              <w:rPr>
-                <w:rFonts w:ascii="Cascadia Mono" w:hAnsi="Cascadia Mono" w:cs="Cascadia Mono"/>
-                <w:color w:val="000000"/>
-                <w:sz w:val="16"/>
-                <w:szCs w:val="16"/>
-              </w:rPr>
-              <w:t>);</w:t>
-            </w:r>
           </w:p>
           <w:p>
             <w:pPr>
@@ -4461,14 +4653,16 @@
                 <w:color w:val="000000"/>
                 <w:sz w:val="16"/>
                 <w:szCs w:val="16"/>
-              </w:rPr>
-            </w:pPr>
-            <w:r>
-              <w:rPr>
-                <w:rFonts w:ascii="Cascadia Mono" w:hAnsi="Cascadia Mono" w:cs="Cascadia Mono"/>
-                <w:color w:val="000000"/>
-                <w:sz w:val="16"/>
-                <w:szCs w:val="16"/>
+                <w:lang w:val="en-US"/>
+              </w:rPr>
+            </w:pPr>
+            <w:r>
+              <w:rPr>
+                <w:rFonts w:ascii="Cascadia Mono" w:hAnsi="Cascadia Mono" w:cs="Cascadia Mono"/>
+                <w:color w:val="000000"/>
+                <w:sz w:val="16"/>
+                <w:szCs w:val="16"/>
+                <w:lang w:val="en-US"/>
               </w:rPr>
               <w:t xml:space="preserve">                                </w:t>
             </w:r>
@@ -4479,6 +4673,7 @@
                 <w:color w:val="000000"/>
                 <w:sz w:val="16"/>
                 <w:szCs w:val="16"/>
+                <w:lang w:val="en-US"/>
               </w:rPr>
               <w:t>File.Delete</w:t>
             </w:r>
@@ -4489,6 +4684,7 @@
                 <w:color w:val="000000"/>
                 <w:sz w:val="16"/>
                 <w:szCs w:val="16"/>
+                <w:lang w:val="en-US"/>
               </w:rPr>
               <w:t>(</w:t>
             </w:r>
@@ -4499,6 +4695,7 @@
                 <w:color w:val="000000"/>
                 <w:sz w:val="16"/>
                 <w:szCs w:val="16"/>
+                <w:lang w:val="en-US"/>
               </w:rPr>
               <w:t>filePath</w:t>
             </w:r>
@@ -4510,6 +4707,7 @@
                 <w:color w:val="000000"/>
                 <w:sz w:val="16"/>
                 <w:szCs w:val="16"/>
+                <w:lang w:val="en-US"/>
               </w:rPr>
               <w:t>);</w:t>
             </w:r>
@@ -4525,14 +4723,16 @@
                 <w:color w:val="000000"/>
                 <w:sz w:val="16"/>
                 <w:szCs w:val="16"/>
-              </w:rPr>
-            </w:pPr>
-            <w:r>
-              <w:rPr>
-                <w:rFonts w:ascii="Cascadia Mono" w:hAnsi="Cascadia Mono" w:cs="Cascadia Mono"/>
-                <w:color w:val="000000"/>
-                <w:sz w:val="16"/>
-                <w:szCs w:val="16"/>
+                <w:lang w:val="en-US"/>
+              </w:rPr>
+            </w:pPr>
+            <w:r>
+              <w:rPr>
+                <w:rFonts w:ascii="Cascadia Mono" w:hAnsi="Cascadia Mono" w:cs="Cascadia Mono"/>
+                <w:color w:val="000000"/>
+                <w:sz w:val="16"/>
+                <w:szCs w:val="16"/>
+                <w:lang w:val="en-US"/>
               </w:rPr>
               <w:t xml:space="preserve">                                </w:t>
             </w:r>
@@ -4543,6 +4743,7 @@
                 <w:color w:val="000000"/>
                 <w:sz w:val="16"/>
                 <w:szCs w:val="16"/>
+                <w:lang w:val="en-US"/>
               </w:rPr>
               <w:t>File.WriteAllLines</w:t>
             </w:r>
@@ -4553,6 +4754,7 @@
                 <w:color w:val="000000"/>
                 <w:sz w:val="16"/>
                 <w:szCs w:val="16"/>
+                <w:lang w:val="en-US"/>
               </w:rPr>
               <w:t>(</w:t>
             </w:r>
@@ -4563,6 +4765,7 @@
                 <w:color w:val="000000"/>
                 <w:sz w:val="16"/>
                 <w:szCs w:val="16"/>
+                <w:lang w:val="en-US"/>
               </w:rPr>
               <w:t>newFilePath</w:t>
             </w:r>
@@ -4573,20 +4776,10 @@
                 <w:color w:val="000000"/>
                 <w:sz w:val="16"/>
                 <w:szCs w:val="16"/>
-              </w:rPr>
-              <w:t xml:space="preserve">, </w:t>
-            </w:r>
-            <w:proofErr w:type="spellStart"/>
-            <w:r>
-              <w:rPr>
-                <w:rFonts w:ascii="Cascadia Mono" w:hAnsi="Cascadia Mono" w:cs="Cascadia Mono"/>
-                <w:color w:val="000000"/>
-                <w:sz w:val="16"/>
-                <w:szCs w:val="16"/>
-              </w:rPr>
-              <w:t>lines</w:t>
-            </w:r>
-            <w:proofErr w:type="spellEnd"/>
+                <w:lang w:val="en-US"/>
+              </w:rPr>
+              <w:t>, lines</w:t>
+            </w:r>
             <w:proofErr w:type="gramStart"/>
             <w:r>
               <w:rPr>
@@ -4594,6 +4787,7 @@
                 <w:color w:val="000000"/>
                 <w:sz w:val="16"/>
                 <w:szCs w:val="16"/>
+                <w:lang w:val="en-US"/>
               </w:rPr>
               <w:t>);</w:t>
             </w:r>
@@ -4617,6 +4811,7 @@
                 <w:color w:val="000000"/>
                 <w:sz w:val="16"/>
                 <w:szCs w:val="16"/>
+                <w:lang w:val="en-US"/>
               </w:rPr>
               <w:t xml:space="preserve">                                </w:t>
             </w:r>
@@ -4671,16 +4866,27 @@
                 <w:color w:val="000000"/>
                 <w:sz w:val="16"/>
                 <w:szCs w:val="16"/>
-              </w:rPr>
-            </w:pPr>
-            <w:r>
-              <w:rPr>
-                <w:rFonts w:ascii="Cascadia Mono" w:hAnsi="Cascadia Mono" w:cs="Cascadia Mono"/>
-                <w:color w:val="000000"/>
-                <w:sz w:val="16"/>
-                <w:szCs w:val="16"/>
-              </w:rPr>
-              <w:t xml:space="preserve">                            }</w:t>
+                <w:lang w:val="en-US"/>
+              </w:rPr>
+            </w:pPr>
+            <w:r>
+              <w:rPr>
+                <w:rFonts w:ascii="Cascadia Mono" w:hAnsi="Cascadia Mono" w:cs="Cascadia Mono"/>
+                <w:color w:val="000000"/>
+                <w:sz w:val="16"/>
+                <w:szCs w:val="16"/>
+              </w:rPr>
+              <w:t xml:space="preserve">                            </w:t>
+            </w:r>
+            <w:r>
+              <w:rPr>
+                <w:rFonts w:ascii="Cascadia Mono" w:hAnsi="Cascadia Mono" w:cs="Cascadia Mono"/>
+                <w:color w:val="000000"/>
+                <w:sz w:val="16"/>
+                <w:szCs w:val="16"/>
+                <w:lang w:val="en-US"/>
+              </w:rPr>
+              <w:t>}</w:t>
             </w:r>
           </w:p>
           <w:p>
@@ -4693,30 +4899,29 @@
                 <w:color w:val="000000"/>
                 <w:sz w:val="16"/>
                 <w:szCs w:val="16"/>
-              </w:rPr>
-            </w:pPr>
-            <w:r>
-              <w:rPr>
-                <w:rFonts w:ascii="Cascadia Mono" w:hAnsi="Cascadia Mono" w:cs="Cascadia Mono"/>
-                <w:color w:val="000000"/>
-                <w:sz w:val="16"/>
-                <w:szCs w:val="16"/>
+                <w:lang w:val="en-US"/>
+              </w:rPr>
+            </w:pPr>
+            <w:r>
+              <w:rPr>
+                <w:rFonts w:ascii="Cascadia Mono" w:hAnsi="Cascadia Mono" w:cs="Cascadia Mono"/>
+                <w:color w:val="000000"/>
+                <w:sz w:val="16"/>
+                <w:szCs w:val="16"/>
+                <w:lang w:val="en-US"/>
               </w:rPr>
               <w:t xml:space="preserve">                            </w:t>
             </w:r>
-            <w:proofErr w:type="spellStart"/>
-            <w:proofErr w:type="gramStart"/>
             <w:r>
               <w:rPr>
                 <w:rFonts w:ascii="Cascadia Mono" w:hAnsi="Cascadia Mono" w:cs="Cascadia Mono"/>
                 <w:color w:val="0000FF"/>
                 <w:sz w:val="16"/>
                 <w:szCs w:val="16"/>
+                <w:lang w:val="en-US"/>
               </w:rPr>
               <w:t>else</w:t>
             </w:r>
-            <w:proofErr w:type="spellEnd"/>
-            <w:proofErr w:type="gramEnd"/>
           </w:p>
           <w:p>
             <w:pPr>
@@ -4728,14 +4933,16 @@
                 <w:color w:val="000000"/>
                 <w:sz w:val="16"/>
                 <w:szCs w:val="16"/>
-              </w:rPr>
-            </w:pPr>
-            <w:r>
-              <w:rPr>
-                <w:rFonts w:ascii="Cascadia Mono" w:hAnsi="Cascadia Mono" w:cs="Cascadia Mono"/>
-                <w:color w:val="000000"/>
-                <w:sz w:val="16"/>
-                <w:szCs w:val="16"/>
+                <w:lang w:val="en-US"/>
+              </w:rPr>
+            </w:pPr>
+            <w:r>
+              <w:rPr>
+                <w:rFonts w:ascii="Cascadia Mono" w:hAnsi="Cascadia Mono" w:cs="Cascadia Mono"/>
+                <w:color w:val="000000"/>
+                <w:sz w:val="16"/>
+                <w:szCs w:val="16"/>
+                <w:lang w:val="en-US"/>
               </w:rPr>
               <w:t xml:space="preserve">                            {</w:t>
             </w:r>
@@ -4750,26 +4957,60 @@
                 <w:color w:val="000000"/>
                 <w:sz w:val="16"/>
                 <w:szCs w:val="16"/>
-              </w:rPr>
-            </w:pPr>
-            <w:r>
-              <w:rPr>
-                <w:rFonts w:ascii="Cascadia Mono" w:hAnsi="Cascadia Mono" w:cs="Cascadia Mono"/>
-                <w:color w:val="000000"/>
-                <w:sz w:val="16"/>
-                <w:szCs w:val="16"/>
+                <w:lang w:val="en-US"/>
+              </w:rPr>
+            </w:pPr>
+            <w:r>
+              <w:rPr>
+                <w:rFonts w:ascii="Cascadia Mono" w:hAnsi="Cascadia Mono" w:cs="Cascadia Mono"/>
+                <w:color w:val="000000"/>
+                <w:sz w:val="16"/>
+                <w:szCs w:val="16"/>
+                <w:lang w:val="en-US"/>
               </w:rPr>
               <w:t xml:space="preserve">                                </w:t>
             </w:r>
+            <w:r>
+              <w:rPr>
+                <w:rFonts w:ascii="Cascadia Mono" w:hAnsi="Cascadia Mono" w:cs="Cascadia Mono"/>
+                <w:color w:val="0000FF"/>
+                <w:sz w:val="16"/>
+                <w:szCs w:val="16"/>
+                <w:lang w:val="en-US"/>
+              </w:rPr>
+              <w:t>if</w:t>
+            </w:r>
+            <w:r>
+              <w:rPr>
+                <w:rFonts w:ascii="Cascadia Mono" w:hAnsi="Cascadia Mono" w:cs="Cascadia Mono"/>
+                <w:color w:val="000000"/>
+                <w:sz w:val="16"/>
+                <w:szCs w:val="16"/>
+                <w:lang w:val="en-US"/>
+              </w:rPr>
+              <w:t xml:space="preserve"> </w:t>
+            </w:r>
             <w:proofErr w:type="gramStart"/>
             <w:r>
               <w:rPr>
                 <w:rFonts w:ascii="Cascadia Mono" w:hAnsi="Cascadia Mono" w:cs="Cascadia Mono"/>
+                <w:color w:val="000000"/>
+                <w:sz w:val="16"/>
+                <w:szCs w:val="16"/>
+                <w:lang w:val="en-US"/>
+              </w:rPr>
+              <w:t>(!</w:t>
+            </w:r>
+            <w:proofErr w:type="spellStart"/>
+            <w:r>
+              <w:rPr>
+                <w:rFonts w:ascii="Cascadia Mono" w:hAnsi="Cascadia Mono" w:cs="Cascadia Mono"/>
                 <w:color w:val="0000FF"/>
                 <w:sz w:val="16"/>
                 <w:szCs w:val="16"/>
-              </w:rPr>
-              <w:t>if</w:t>
+                <w:lang w:val="en-US"/>
+              </w:rPr>
+              <w:t>string</w:t>
             </w:r>
             <w:proofErr w:type="gramEnd"/>
             <w:r>
@@ -4778,27 +5019,31 @@
                 <w:color w:val="000000"/>
                 <w:sz w:val="16"/>
                 <w:szCs w:val="16"/>
-              </w:rPr>
-              <w:t xml:space="preserve"> (!</w:t>
+                <w:lang w:val="en-US"/>
+              </w:rPr>
+              <w:t>.IsNullOrWhiteSpace</w:t>
+            </w:r>
+            <w:proofErr w:type="spellEnd"/>
+            <w:r>
+              <w:rPr>
+                <w:rFonts w:ascii="Cascadia Mono" w:hAnsi="Cascadia Mono" w:cs="Cascadia Mono"/>
+                <w:color w:val="000000"/>
+                <w:sz w:val="16"/>
+                <w:szCs w:val="16"/>
+                <w:lang w:val="en-US"/>
+              </w:rPr>
+              <w:t>(</w:t>
             </w:r>
             <w:proofErr w:type="spellStart"/>
             <w:r>
               <w:rPr>
                 <w:rFonts w:ascii="Cascadia Mono" w:hAnsi="Cascadia Mono" w:cs="Cascadia Mono"/>
-                <w:color w:val="0000FF"/>
-                <w:sz w:val="16"/>
-                <w:szCs w:val="16"/>
-              </w:rPr>
-              <w:t>string</w:t>
-            </w:r>
-            <w:r>
-              <w:rPr>
-                <w:rFonts w:ascii="Cascadia Mono" w:hAnsi="Cascadia Mono" w:cs="Cascadia Mono"/>
-                <w:color w:val="000000"/>
-                <w:sz w:val="16"/>
-                <w:szCs w:val="16"/>
-              </w:rPr>
-              <w:t>.IsNullOrWhiteSpace</w:t>
+                <w:color w:val="000000"/>
+                <w:sz w:val="16"/>
+                <w:szCs w:val="16"/>
+                <w:lang w:val="en-US"/>
+              </w:rPr>
+              <w:t>newIdentifiant</w:t>
             </w:r>
             <w:proofErr w:type="spellEnd"/>
             <w:r>
@@ -4807,26 +5052,7 @@
                 <w:color w:val="000000"/>
                 <w:sz w:val="16"/>
                 <w:szCs w:val="16"/>
-              </w:rPr>
-              <w:t>(</w:t>
-            </w:r>
-            <w:proofErr w:type="spellStart"/>
-            <w:r>
-              <w:rPr>
-                <w:rFonts w:ascii="Cascadia Mono" w:hAnsi="Cascadia Mono" w:cs="Cascadia Mono"/>
-                <w:color w:val="000000"/>
-                <w:sz w:val="16"/>
-                <w:szCs w:val="16"/>
-              </w:rPr>
-              <w:t>newIdentifiant</w:t>
-            </w:r>
-            <w:proofErr w:type="spellEnd"/>
-            <w:r>
-              <w:rPr>
-                <w:rFonts w:ascii="Cascadia Mono" w:hAnsi="Cascadia Mono" w:cs="Cascadia Mono"/>
-                <w:color w:val="000000"/>
-                <w:sz w:val="16"/>
-                <w:szCs w:val="16"/>
+                <w:lang w:val="en-US"/>
               </w:rPr>
               <w:t>))</w:t>
             </w:r>
@@ -4841,14 +5067,16 @@
                 <w:color w:val="000000"/>
                 <w:sz w:val="16"/>
                 <w:szCs w:val="16"/>
-              </w:rPr>
-            </w:pPr>
-            <w:r>
-              <w:rPr>
-                <w:rFonts w:ascii="Cascadia Mono" w:hAnsi="Cascadia Mono" w:cs="Cascadia Mono"/>
-                <w:color w:val="000000"/>
-                <w:sz w:val="16"/>
-                <w:szCs w:val="16"/>
+                <w:lang w:val="en-US"/>
+              </w:rPr>
+            </w:pPr>
+            <w:r>
+              <w:rPr>
+                <w:rFonts w:ascii="Cascadia Mono" w:hAnsi="Cascadia Mono" w:cs="Cascadia Mono"/>
+                <w:color w:val="000000"/>
+                <w:sz w:val="16"/>
+                <w:szCs w:val="16"/>
+                <w:lang w:val="en-US"/>
               </w:rPr>
               <w:t xml:space="preserve">                                {</w:t>
             </w:r>
@@ -4863,63 +5091,80 @@
                 <w:color w:val="000000"/>
                 <w:sz w:val="16"/>
                 <w:szCs w:val="16"/>
-              </w:rPr>
-            </w:pPr>
-            <w:r>
-              <w:rPr>
-                <w:rFonts w:ascii="Cascadia Mono" w:hAnsi="Cascadia Mono" w:cs="Cascadia Mono"/>
-                <w:color w:val="000000"/>
-                <w:sz w:val="16"/>
-                <w:szCs w:val="16"/>
+                <w:lang w:val="en-US"/>
+              </w:rPr>
+            </w:pPr>
+            <w:r>
+              <w:rPr>
+                <w:rFonts w:ascii="Cascadia Mono" w:hAnsi="Cascadia Mono" w:cs="Cascadia Mono"/>
+                <w:color w:val="000000"/>
+                <w:sz w:val="16"/>
+                <w:szCs w:val="16"/>
+                <w:lang w:val="en-US"/>
               </w:rPr>
               <w:t xml:space="preserve">                                    </w:t>
             </w:r>
+            <w:proofErr w:type="gramStart"/>
+            <w:r>
+              <w:rPr>
+                <w:rFonts w:ascii="Cascadia Mono" w:hAnsi="Cascadia Mono" w:cs="Cascadia Mono"/>
+                <w:color w:val="000000"/>
+                <w:sz w:val="16"/>
+                <w:szCs w:val="16"/>
+                <w:lang w:val="en-US"/>
+              </w:rPr>
+              <w:t>lines[</w:t>
+            </w:r>
+            <w:proofErr w:type="gramEnd"/>
+            <w:r>
+              <w:rPr>
+                <w:rFonts w:ascii="Cascadia Mono" w:hAnsi="Cascadia Mono" w:cs="Cascadia Mono"/>
+                <w:color w:val="000000"/>
+                <w:sz w:val="16"/>
+                <w:szCs w:val="16"/>
+                <w:lang w:val="en-US"/>
+              </w:rPr>
+              <w:t xml:space="preserve">1] = </w:t>
+            </w:r>
+            <w:r>
+              <w:rPr>
+                <w:rFonts w:ascii="Cascadia Mono" w:hAnsi="Cascadia Mono" w:cs="Cascadia Mono"/>
+                <w:color w:val="A31515"/>
+                <w:sz w:val="16"/>
+                <w:szCs w:val="16"/>
+                <w:lang w:val="en-US"/>
+              </w:rPr>
+              <w:t>"</w:t>
+            </w:r>
             <w:proofErr w:type="spellStart"/>
-            <w:proofErr w:type="gramStart"/>
-            <w:r>
-              <w:rPr>
-                <w:rFonts w:ascii="Cascadia Mono" w:hAnsi="Cascadia Mono" w:cs="Cascadia Mono"/>
-                <w:color w:val="000000"/>
-                <w:sz w:val="16"/>
-                <w:szCs w:val="16"/>
-              </w:rPr>
-              <w:t>lines</w:t>
+            <w:r>
+              <w:rPr>
+                <w:rFonts w:ascii="Cascadia Mono" w:hAnsi="Cascadia Mono" w:cs="Cascadia Mono"/>
+                <w:color w:val="A31515"/>
+                <w:sz w:val="16"/>
+                <w:szCs w:val="16"/>
+                <w:lang w:val="en-US"/>
+              </w:rPr>
+              <w:t>Identifiant</w:t>
             </w:r>
             <w:proofErr w:type="spellEnd"/>
             <w:r>
               <w:rPr>
                 <w:rFonts w:ascii="Cascadia Mono" w:hAnsi="Cascadia Mono" w:cs="Cascadia Mono"/>
-                <w:color w:val="000000"/>
-                <w:sz w:val="16"/>
-                <w:szCs w:val="16"/>
-              </w:rPr>
-              <w:t>[</w:t>
-            </w:r>
-            <w:proofErr w:type="gramEnd"/>
-            <w:r>
-              <w:rPr>
-                <w:rFonts w:ascii="Cascadia Mono" w:hAnsi="Cascadia Mono" w:cs="Cascadia Mono"/>
-                <w:color w:val="000000"/>
-                <w:sz w:val="16"/>
-                <w:szCs w:val="16"/>
-              </w:rPr>
-              <w:t xml:space="preserve">1] = </w:t>
-            </w:r>
-            <w:r>
-              <w:rPr>
-                <w:rFonts w:ascii="Cascadia Mono" w:hAnsi="Cascadia Mono" w:cs="Cascadia Mono"/>
                 <w:color w:val="A31515"/>
                 <w:sz w:val="16"/>
                 <w:szCs w:val="16"/>
-              </w:rPr>
-              <w:t>"Identifiant : "</w:t>
-            </w:r>
-            <w:r>
-              <w:rPr>
-                <w:rFonts w:ascii="Cascadia Mono" w:hAnsi="Cascadia Mono" w:cs="Cascadia Mono"/>
-                <w:color w:val="000000"/>
-                <w:sz w:val="16"/>
-                <w:szCs w:val="16"/>
+                <w:lang w:val="en-US"/>
+              </w:rPr>
+              <w:t xml:space="preserve"> : "</w:t>
+            </w:r>
+            <w:r>
+              <w:rPr>
+                <w:rFonts w:ascii="Cascadia Mono" w:hAnsi="Cascadia Mono" w:cs="Cascadia Mono"/>
+                <w:color w:val="000000"/>
+                <w:sz w:val="16"/>
+                <w:szCs w:val="16"/>
+                <w:lang w:val="en-US"/>
               </w:rPr>
               <w:t xml:space="preserve"> + </w:t>
             </w:r>
@@ -4930,6 +5175,7 @@
                 <w:color w:val="000000"/>
                 <w:sz w:val="16"/>
                 <w:szCs w:val="16"/>
+                <w:lang w:val="en-US"/>
               </w:rPr>
               <w:t>newIdentifiant</w:t>
             </w:r>
@@ -4940,6 +5186,7 @@
                 <w:color w:val="000000"/>
                 <w:sz w:val="16"/>
                 <w:szCs w:val="16"/>
+                <w:lang w:val="en-US"/>
               </w:rPr>
               <w:t>;</w:t>
             </w:r>
@@ -4954,14 +5201,16 @@
                 <w:color w:val="000000"/>
                 <w:sz w:val="16"/>
                 <w:szCs w:val="16"/>
-              </w:rPr>
-            </w:pPr>
-            <w:r>
-              <w:rPr>
-                <w:rFonts w:ascii="Cascadia Mono" w:hAnsi="Cascadia Mono" w:cs="Cascadia Mono"/>
-                <w:color w:val="000000"/>
-                <w:sz w:val="16"/>
-                <w:szCs w:val="16"/>
+                <w:lang w:val="en-US"/>
+              </w:rPr>
+            </w:pPr>
+            <w:r>
+              <w:rPr>
+                <w:rFonts w:ascii="Cascadia Mono" w:hAnsi="Cascadia Mono" w:cs="Cascadia Mono"/>
+                <w:color w:val="000000"/>
+                <w:sz w:val="16"/>
+                <w:szCs w:val="16"/>
+                <w:lang w:val="en-US"/>
               </w:rPr>
               <w:t xml:space="preserve">                                }</w:t>
             </w:r>
@@ -4976,26 +5225,60 @@
                 <w:color w:val="000000"/>
                 <w:sz w:val="16"/>
                 <w:szCs w:val="16"/>
-              </w:rPr>
-            </w:pPr>
-            <w:r>
-              <w:rPr>
-                <w:rFonts w:ascii="Cascadia Mono" w:hAnsi="Cascadia Mono" w:cs="Cascadia Mono"/>
-                <w:color w:val="000000"/>
-                <w:sz w:val="16"/>
-                <w:szCs w:val="16"/>
+                <w:lang w:val="en-US"/>
+              </w:rPr>
+            </w:pPr>
+            <w:r>
+              <w:rPr>
+                <w:rFonts w:ascii="Cascadia Mono" w:hAnsi="Cascadia Mono" w:cs="Cascadia Mono"/>
+                <w:color w:val="000000"/>
+                <w:sz w:val="16"/>
+                <w:szCs w:val="16"/>
+                <w:lang w:val="en-US"/>
               </w:rPr>
               <w:t xml:space="preserve">                                </w:t>
             </w:r>
+            <w:r>
+              <w:rPr>
+                <w:rFonts w:ascii="Cascadia Mono" w:hAnsi="Cascadia Mono" w:cs="Cascadia Mono"/>
+                <w:color w:val="0000FF"/>
+                <w:sz w:val="16"/>
+                <w:szCs w:val="16"/>
+                <w:lang w:val="en-US"/>
+              </w:rPr>
+              <w:t>if</w:t>
+            </w:r>
+            <w:r>
+              <w:rPr>
+                <w:rFonts w:ascii="Cascadia Mono" w:hAnsi="Cascadia Mono" w:cs="Cascadia Mono"/>
+                <w:color w:val="000000"/>
+                <w:sz w:val="16"/>
+                <w:szCs w:val="16"/>
+                <w:lang w:val="en-US"/>
+              </w:rPr>
+              <w:t xml:space="preserve"> </w:t>
+            </w:r>
             <w:proofErr w:type="gramStart"/>
             <w:r>
               <w:rPr>
                 <w:rFonts w:ascii="Cascadia Mono" w:hAnsi="Cascadia Mono" w:cs="Cascadia Mono"/>
+                <w:color w:val="000000"/>
+                <w:sz w:val="16"/>
+                <w:szCs w:val="16"/>
+                <w:lang w:val="en-US"/>
+              </w:rPr>
+              <w:t>(!</w:t>
+            </w:r>
+            <w:proofErr w:type="spellStart"/>
+            <w:r>
+              <w:rPr>
+                <w:rFonts w:ascii="Cascadia Mono" w:hAnsi="Cascadia Mono" w:cs="Cascadia Mono"/>
                 <w:color w:val="0000FF"/>
                 <w:sz w:val="16"/>
                 <w:szCs w:val="16"/>
-              </w:rPr>
-              <w:t>if</w:t>
+                <w:lang w:val="en-US"/>
+              </w:rPr>
+              <w:t>string</w:t>
             </w:r>
             <w:proofErr w:type="gramEnd"/>
             <w:r>
@@ -5004,27 +5287,31 @@
                 <w:color w:val="000000"/>
                 <w:sz w:val="16"/>
                 <w:szCs w:val="16"/>
-              </w:rPr>
-              <w:t xml:space="preserve"> (!</w:t>
+                <w:lang w:val="en-US"/>
+              </w:rPr>
+              <w:t>.IsNullOrWhiteSpace</w:t>
+            </w:r>
+            <w:proofErr w:type="spellEnd"/>
+            <w:r>
+              <w:rPr>
+                <w:rFonts w:ascii="Cascadia Mono" w:hAnsi="Cascadia Mono" w:cs="Cascadia Mono"/>
+                <w:color w:val="000000"/>
+                <w:sz w:val="16"/>
+                <w:szCs w:val="16"/>
+                <w:lang w:val="en-US"/>
+              </w:rPr>
+              <w:t>(</w:t>
             </w:r>
             <w:proofErr w:type="spellStart"/>
             <w:r>
               <w:rPr>
                 <w:rFonts w:ascii="Cascadia Mono" w:hAnsi="Cascadia Mono" w:cs="Cascadia Mono"/>
-                <w:color w:val="0000FF"/>
-                <w:sz w:val="16"/>
-                <w:szCs w:val="16"/>
-              </w:rPr>
-              <w:t>string</w:t>
-            </w:r>
-            <w:r>
-              <w:rPr>
-                <w:rFonts w:ascii="Cascadia Mono" w:hAnsi="Cascadia Mono" w:cs="Cascadia Mono"/>
-                <w:color w:val="000000"/>
-                <w:sz w:val="16"/>
-                <w:szCs w:val="16"/>
-              </w:rPr>
-              <w:t>.IsNullOrWhiteSpace</w:t>
+                <w:color w:val="000000"/>
+                <w:sz w:val="16"/>
+                <w:szCs w:val="16"/>
+                <w:lang w:val="en-US"/>
+              </w:rPr>
+              <w:t>newMotDePasse</w:t>
             </w:r>
             <w:proofErr w:type="spellEnd"/>
             <w:r>
@@ -5033,26 +5320,7 @@
                 <w:color w:val="000000"/>
                 <w:sz w:val="16"/>
                 <w:szCs w:val="16"/>
-              </w:rPr>
-              <w:t>(</w:t>
-            </w:r>
-            <w:proofErr w:type="spellStart"/>
-            <w:r>
-              <w:rPr>
-                <w:rFonts w:ascii="Cascadia Mono" w:hAnsi="Cascadia Mono" w:cs="Cascadia Mono"/>
-                <w:color w:val="000000"/>
-                <w:sz w:val="16"/>
-                <w:szCs w:val="16"/>
-              </w:rPr>
-              <w:t>newMotDePasse</w:t>
-            </w:r>
-            <w:proofErr w:type="spellEnd"/>
-            <w:r>
-              <w:rPr>
-                <w:rFonts w:ascii="Cascadia Mono" w:hAnsi="Cascadia Mono" w:cs="Cascadia Mono"/>
-                <w:color w:val="000000"/>
-                <w:sz w:val="16"/>
-                <w:szCs w:val="16"/>
+                <w:lang w:val="en-US"/>
               </w:rPr>
               <w:t>))</w:t>
             </w:r>
@@ -5067,14 +5335,16 @@
                 <w:color w:val="000000"/>
                 <w:sz w:val="16"/>
                 <w:szCs w:val="16"/>
-              </w:rPr>
-            </w:pPr>
-            <w:r>
-              <w:rPr>
-                <w:rFonts w:ascii="Cascadia Mono" w:hAnsi="Cascadia Mono" w:cs="Cascadia Mono"/>
-                <w:color w:val="000000"/>
-                <w:sz w:val="16"/>
-                <w:szCs w:val="16"/>
+                <w:lang w:val="en-US"/>
+              </w:rPr>
+            </w:pPr>
+            <w:r>
+              <w:rPr>
+                <w:rFonts w:ascii="Cascadia Mono" w:hAnsi="Cascadia Mono" w:cs="Cascadia Mono"/>
+                <w:color w:val="000000"/>
+                <w:sz w:val="16"/>
+                <w:szCs w:val="16"/>
+                <w:lang w:val="en-US"/>
               </w:rPr>
               <w:t xml:space="preserve">                                {</w:t>
             </w:r>
@@ -5097,6 +5367,7 @@
                 <w:color w:val="000000"/>
                 <w:sz w:val="16"/>
                 <w:szCs w:val="16"/>
+                <w:lang w:val="en-US"/>
               </w:rPr>
               <w:t xml:space="preserve">                                    </w:t>
             </w:r>
@@ -5401,6 +5672,7 @@
                 <w:sz w:val="16"/>
                 <w:szCs w:val="16"/>
               </w:rPr>
+              <w:lastRenderedPageBreak/>
               <w:t xml:space="preserve">                        </w:t>
             </w:r>
             <w:proofErr w:type="spellStart"/>
@@ -5458,7 +5730,6 @@
                 <w:sz w:val="16"/>
                 <w:szCs w:val="16"/>
               </w:rPr>
-              <w:lastRenderedPageBreak/>
               <w:t xml:space="preserve">                            </w:t>
             </w:r>
             <w:proofErr w:type="spellStart"/>
@@ -6880,6 +7151,7 @@
                 <w:color w:val="000000"/>
                 <w:sz w:val="16"/>
                 <w:szCs w:val="16"/>
+                <w:lang w:val="en-US"/>
               </w:rPr>
             </w:pPr>
             <w:r>
@@ -6891,66 +7163,82 @@
               </w:rPr>
               <w:t xml:space="preserve">            </w:t>
             </w:r>
+            <w:r>
+              <w:rPr>
+                <w:rFonts w:ascii="Cascadia Mono" w:hAnsi="Cascadia Mono" w:cs="Cascadia Mono"/>
+                <w:color w:val="0000FF"/>
+                <w:sz w:val="16"/>
+                <w:szCs w:val="16"/>
+                <w:lang w:val="en-US"/>
+              </w:rPr>
+              <w:t>string</w:t>
+            </w:r>
+            <w:r>
+              <w:rPr>
+                <w:rFonts w:ascii="Cascadia Mono" w:hAnsi="Cascadia Mono" w:cs="Cascadia Mono"/>
+                <w:color w:val="000000"/>
+                <w:sz w:val="16"/>
+                <w:szCs w:val="16"/>
+                <w:lang w:val="en-US"/>
+              </w:rPr>
+              <w:t xml:space="preserve"> </w:t>
+            </w:r>
+            <w:proofErr w:type="spellStart"/>
+            <w:r>
+              <w:rPr>
+                <w:rFonts w:ascii="Cascadia Mono" w:hAnsi="Cascadia Mono" w:cs="Cascadia Mono"/>
+                <w:color w:val="000000"/>
+                <w:sz w:val="16"/>
+                <w:szCs w:val="16"/>
+                <w:lang w:val="en-US"/>
+              </w:rPr>
+              <w:t>motDePasse</w:t>
+            </w:r>
+            <w:proofErr w:type="spellEnd"/>
+            <w:r>
+              <w:rPr>
+                <w:rFonts w:ascii="Cascadia Mono" w:hAnsi="Cascadia Mono" w:cs="Cascadia Mono"/>
+                <w:color w:val="000000"/>
+                <w:sz w:val="16"/>
+                <w:szCs w:val="16"/>
+                <w:lang w:val="en-US"/>
+              </w:rPr>
+              <w:t xml:space="preserve"> = </w:t>
+            </w:r>
+            <w:proofErr w:type="spellStart"/>
+            <w:r>
+              <w:rPr>
+                <w:rFonts w:ascii="Cascadia Mono" w:hAnsi="Cascadia Mono" w:cs="Cascadia Mono"/>
+                <w:color w:val="000000"/>
+                <w:sz w:val="16"/>
+                <w:szCs w:val="16"/>
+                <w:lang w:val="en-US"/>
+              </w:rPr>
+              <w:t>Console.ReadLine</w:t>
+            </w:r>
+            <w:proofErr w:type="spellEnd"/>
+            <w:r>
+              <w:rPr>
+                <w:rFonts w:ascii="Cascadia Mono" w:hAnsi="Cascadia Mono" w:cs="Cascadia Mono"/>
+                <w:color w:val="000000"/>
+                <w:sz w:val="16"/>
+                <w:szCs w:val="16"/>
+                <w:lang w:val="en-US"/>
+              </w:rPr>
+              <w:t>(</w:t>
+            </w:r>
             <w:proofErr w:type="gramStart"/>
             <w:r>
               <w:rPr>
                 <w:rFonts w:ascii="Cascadia Mono" w:hAnsi="Cascadia Mono" w:cs="Cascadia Mono"/>
-                <w:color w:val="0000FF"/>
-                <w:sz w:val="16"/>
-                <w:szCs w:val="16"/>
-              </w:rPr>
-              <w:t>string</w:t>
+                <w:color w:val="000000"/>
+                <w:sz w:val="16"/>
+                <w:szCs w:val="16"/>
+                <w:lang w:val="en-US"/>
+              </w:rPr>
+              <w:t>);</w:t>
             </w:r>
             <w:proofErr w:type="gramEnd"/>
-            <w:r>
-              <w:rPr>
-                <w:rFonts w:ascii="Cascadia Mono" w:hAnsi="Cascadia Mono" w:cs="Cascadia Mono"/>
-                <w:color w:val="000000"/>
-                <w:sz w:val="16"/>
-                <w:szCs w:val="16"/>
-              </w:rPr>
-              <w:t xml:space="preserve"> </w:t>
-            </w:r>
-            <w:proofErr w:type="spellStart"/>
-            <w:r>
-              <w:rPr>
-                <w:rFonts w:ascii="Cascadia Mono" w:hAnsi="Cascadia Mono" w:cs="Cascadia Mono"/>
-                <w:color w:val="000000"/>
-                <w:sz w:val="16"/>
-                <w:szCs w:val="16"/>
-              </w:rPr>
-              <w:t>motDePasse</w:t>
-            </w:r>
-            <w:proofErr w:type="spellEnd"/>
-            <w:r>
-              <w:rPr>
-                <w:rFonts w:ascii="Cascadia Mono" w:hAnsi="Cascadia Mono" w:cs="Cascadia Mono"/>
-                <w:color w:val="000000"/>
-                <w:sz w:val="16"/>
-                <w:szCs w:val="16"/>
-              </w:rPr>
-              <w:t xml:space="preserve"> = </w:t>
-            </w:r>
-            <w:proofErr w:type="spellStart"/>
-            <w:r>
-              <w:rPr>
-                <w:rFonts w:ascii="Cascadia Mono" w:hAnsi="Cascadia Mono" w:cs="Cascadia Mono"/>
-                <w:color w:val="000000"/>
-                <w:sz w:val="16"/>
-                <w:szCs w:val="16"/>
-              </w:rPr>
-              <w:t>Console.ReadLine</w:t>
-            </w:r>
-            <w:proofErr w:type="spellEnd"/>
-            <w:r>
-              <w:rPr>
-                <w:rFonts w:ascii="Cascadia Mono" w:hAnsi="Cascadia Mono" w:cs="Cascadia Mono"/>
-                <w:color w:val="000000"/>
-                <w:sz w:val="16"/>
-                <w:szCs w:val="16"/>
-              </w:rPr>
-              <w:t>();</w:t>
-            </w:r>
           </w:p>
           <w:p>
             <w:pPr>
@@ -6962,6 +7250,7 @@
                 <w:color w:val="000000"/>
                 <w:sz w:val="16"/>
                 <w:szCs w:val="16"/>
+                <w:lang w:val="en-US"/>
               </w:rPr>
             </w:pPr>
           </w:p>
@@ -6975,93 +7264,103 @@
                 <w:color w:val="000000"/>
                 <w:sz w:val="16"/>
                 <w:szCs w:val="16"/>
-              </w:rPr>
-            </w:pPr>
-            <w:r>
-              <w:rPr>
-                <w:rFonts w:ascii="Cascadia Mono" w:hAnsi="Cascadia Mono" w:cs="Cascadia Mono"/>
-                <w:color w:val="000000"/>
-                <w:sz w:val="16"/>
-                <w:szCs w:val="16"/>
+                <w:lang w:val="en-US"/>
+              </w:rPr>
+            </w:pPr>
+            <w:r>
+              <w:rPr>
+                <w:rFonts w:ascii="Cascadia Mono" w:hAnsi="Cascadia Mono" w:cs="Cascadia Mono"/>
+                <w:color w:val="000000"/>
+                <w:sz w:val="16"/>
+                <w:szCs w:val="16"/>
+                <w:lang w:val="en-US"/>
               </w:rPr>
               <w:t xml:space="preserve">            </w:t>
             </w:r>
+            <w:r>
+              <w:rPr>
+                <w:rFonts w:ascii="Cascadia Mono" w:hAnsi="Cascadia Mono" w:cs="Cascadia Mono"/>
+                <w:color w:val="0000FF"/>
+                <w:sz w:val="16"/>
+                <w:szCs w:val="16"/>
+                <w:lang w:val="en-US"/>
+              </w:rPr>
+              <w:t>string</w:t>
+            </w:r>
+            <w:r>
+              <w:rPr>
+                <w:rFonts w:ascii="Cascadia Mono" w:hAnsi="Cascadia Mono" w:cs="Cascadia Mono"/>
+                <w:color w:val="000000"/>
+                <w:sz w:val="16"/>
+                <w:szCs w:val="16"/>
+                <w:lang w:val="en-US"/>
+              </w:rPr>
+              <w:t xml:space="preserve"> </w:t>
+            </w:r>
+            <w:proofErr w:type="spellStart"/>
+            <w:r>
+              <w:rPr>
+                <w:rFonts w:ascii="Cascadia Mono" w:hAnsi="Cascadia Mono" w:cs="Cascadia Mono"/>
+                <w:color w:val="000000"/>
+                <w:sz w:val="16"/>
+                <w:szCs w:val="16"/>
+                <w:lang w:val="en-US"/>
+              </w:rPr>
+              <w:t>pathFile</w:t>
+            </w:r>
+            <w:proofErr w:type="spellEnd"/>
+            <w:r>
+              <w:rPr>
+                <w:rFonts w:ascii="Cascadia Mono" w:hAnsi="Cascadia Mono" w:cs="Cascadia Mono"/>
+                <w:color w:val="000000"/>
+                <w:sz w:val="16"/>
+                <w:szCs w:val="16"/>
+                <w:lang w:val="en-US"/>
+              </w:rPr>
+              <w:t xml:space="preserve"> = </w:t>
+            </w:r>
+            <w:r>
+              <w:rPr>
+                <w:rFonts w:ascii="Cascadia Mono" w:hAnsi="Cascadia Mono" w:cs="Cascadia Mono"/>
+                <w:color w:val="800000"/>
+                <w:sz w:val="16"/>
+                <w:szCs w:val="16"/>
+                <w:lang w:val="en-US"/>
+              </w:rPr>
+              <w:t>$@"C:\Users\amizeqiri\Desktop\GitHub\P_GestMDP_114\P_GestMDP\password\</w:t>
+            </w:r>
+            <w:r>
+              <w:rPr>
+                <w:rFonts w:ascii="Cascadia Mono" w:hAnsi="Cascadia Mono" w:cs="Cascadia Mono"/>
+                <w:color w:val="000000"/>
+                <w:sz w:val="16"/>
+                <w:szCs w:val="16"/>
+                <w:lang w:val="en-US"/>
+              </w:rPr>
+              <w:t>{url}</w:t>
+            </w:r>
             <w:proofErr w:type="gramStart"/>
             <w:r>
               <w:rPr>
                 <w:rFonts w:ascii="Cascadia Mono" w:hAnsi="Cascadia Mono" w:cs="Cascadia Mono"/>
-                <w:color w:val="0000FF"/>
-                <w:sz w:val="16"/>
-                <w:szCs w:val="16"/>
-              </w:rPr>
-              <w:t>string</w:t>
+                <w:color w:val="800000"/>
+                <w:sz w:val="16"/>
+                <w:szCs w:val="16"/>
+                <w:lang w:val="en-US"/>
+              </w:rPr>
+              <w:t>"</w:t>
+            </w:r>
+            <w:r>
+              <w:rPr>
+                <w:rFonts w:ascii="Cascadia Mono" w:hAnsi="Cascadia Mono" w:cs="Cascadia Mono"/>
+                <w:color w:val="000000"/>
+                <w:sz w:val="16"/>
+                <w:szCs w:val="16"/>
+                <w:lang w:val="en-US"/>
+              </w:rPr>
+              <w:t>;</w:t>
             </w:r>
             <w:proofErr w:type="gramEnd"/>
-            <w:r>
-              <w:rPr>
-                <w:rFonts w:ascii="Cascadia Mono" w:hAnsi="Cascadia Mono" w:cs="Cascadia Mono"/>
-                <w:color w:val="000000"/>
-                <w:sz w:val="16"/>
-                <w:szCs w:val="16"/>
-              </w:rPr>
-              <w:t xml:space="preserve"> </w:t>
-            </w:r>
-            <w:proofErr w:type="spellStart"/>
-            <w:r>
-              <w:rPr>
-                <w:rFonts w:ascii="Cascadia Mono" w:hAnsi="Cascadia Mono" w:cs="Cascadia Mono"/>
-                <w:color w:val="000000"/>
-                <w:sz w:val="16"/>
-                <w:szCs w:val="16"/>
-              </w:rPr>
-              <w:t>pathFile</w:t>
-            </w:r>
-            <w:proofErr w:type="spellEnd"/>
-            <w:r>
-              <w:rPr>
-                <w:rFonts w:ascii="Cascadia Mono" w:hAnsi="Cascadia Mono" w:cs="Cascadia Mono"/>
-                <w:color w:val="000000"/>
-                <w:sz w:val="16"/>
-                <w:szCs w:val="16"/>
-              </w:rPr>
-              <w:t xml:space="preserve"> = </w:t>
-            </w:r>
-            <w:r>
-              <w:rPr>
-                <w:rFonts w:ascii="Cascadia Mono" w:hAnsi="Cascadia Mono" w:cs="Cascadia Mono"/>
-                <w:color w:val="800000"/>
-                <w:sz w:val="16"/>
-                <w:szCs w:val="16"/>
-              </w:rPr>
-              <w:t>$@"C:\Users\amizeqiri\Desktop\GitHub\P_GestMDP_114\P_GestMDP\password\</w:t>
-            </w:r>
-            <w:r>
-              <w:rPr>
-                <w:rFonts w:ascii="Cascadia Mono" w:hAnsi="Cascadia Mono" w:cs="Cascadia Mono"/>
-                <w:color w:val="000000"/>
-                <w:sz w:val="16"/>
-                <w:szCs w:val="16"/>
-              </w:rPr>
-              <w:t>{url}</w:t>
-            </w:r>
-            <w:r>
-              <w:rPr>
-                <w:rFonts w:ascii="Cascadia Mono" w:hAnsi="Cascadia Mono" w:cs="Cascadia Mono"/>
-                <w:color w:val="800000"/>
-                <w:sz w:val="16"/>
-                <w:szCs w:val="16"/>
-              </w:rPr>
-              <w:t>"</w:t>
-            </w:r>
-            <w:r>
-              <w:rPr>
-                <w:rFonts w:ascii="Cascadia Mono" w:hAnsi="Cascadia Mono" w:cs="Cascadia Mono"/>
-                <w:color w:val="000000"/>
-                <w:sz w:val="16"/>
-                <w:szCs w:val="16"/>
-              </w:rPr>
-              <w:t>;</w:t>
-            </w:r>
           </w:p>
           <w:p>
             <w:pPr>
@@ -7073,6 +7372,7 @@
                 <w:color w:val="000000"/>
                 <w:sz w:val="16"/>
                 <w:szCs w:val="16"/>
+                <w:lang w:val="en-US"/>
               </w:rPr>
             </w:pPr>
           </w:p>
@@ -7086,30 +7386,29 @@
                 <w:color w:val="000000"/>
                 <w:sz w:val="16"/>
                 <w:szCs w:val="16"/>
-              </w:rPr>
-            </w:pPr>
-            <w:r>
-              <w:rPr>
-                <w:rFonts w:ascii="Cascadia Mono" w:hAnsi="Cascadia Mono" w:cs="Cascadia Mono"/>
-                <w:color w:val="000000"/>
-                <w:sz w:val="16"/>
-                <w:szCs w:val="16"/>
+                <w:lang w:val="en-US"/>
+              </w:rPr>
+            </w:pPr>
+            <w:r>
+              <w:rPr>
+                <w:rFonts w:ascii="Cascadia Mono" w:hAnsi="Cascadia Mono" w:cs="Cascadia Mono"/>
+                <w:color w:val="000000"/>
+                <w:sz w:val="16"/>
+                <w:szCs w:val="16"/>
+                <w:lang w:val="en-US"/>
               </w:rPr>
               <w:t xml:space="preserve">            </w:t>
             </w:r>
-            <w:proofErr w:type="spellStart"/>
-            <w:proofErr w:type="gramStart"/>
             <w:r>
               <w:rPr>
                 <w:rFonts w:ascii="Cascadia Mono" w:hAnsi="Cascadia Mono" w:cs="Cascadia Mono"/>
                 <w:color w:val="0000FF"/>
                 <w:sz w:val="16"/>
                 <w:szCs w:val="16"/>
+                <w:lang w:val="en-US"/>
               </w:rPr>
               <w:t>try</w:t>
             </w:r>
-            <w:proofErr w:type="spellEnd"/>
-            <w:proofErr w:type="gramEnd"/>
           </w:p>
           <w:p>
             <w:pPr>
@@ -7121,27 +7420,18 @@
                 <w:color w:val="000000"/>
                 <w:sz w:val="16"/>
                 <w:szCs w:val="16"/>
-                <w:lang w:val="de-CH"/>
-              </w:rPr>
-            </w:pPr>
-            <w:r>
-              <w:rPr>
-                <w:rFonts w:ascii="Cascadia Mono" w:hAnsi="Cascadia Mono" w:cs="Cascadia Mono"/>
-                <w:color w:val="000000"/>
-                <w:sz w:val="16"/>
-                <w:szCs w:val="16"/>
-              </w:rPr>
-              <w:t xml:space="preserve">            </w:t>
-            </w:r>
-            <w:r>
-              <w:rPr>
-                <w:rFonts w:ascii="Cascadia Mono" w:hAnsi="Cascadia Mono" w:cs="Cascadia Mono"/>
-                <w:color w:val="000000"/>
-                <w:sz w:val="16"/>
-                <w:szCs w:val="16"/>
-                <w:lang w:val="de-CH"/>
-              </w:rPr>
-              <w:t>{</w:t>
+                <w:lang w:val="en-US"/>
+              </w:rPr>
+            </w:pPr>
+            <w:r>
+              <w:rPr>
+                <w:rFonts w:ascii="Cascadia Mono" w:hAnsi="Cascadia Mono" w:cs="Cascadia Mono"/>
+                <w:color w:val="000000"/>
+                <w:sz w:val="16"/>
+                <w:szCs w:val="16"/>
+                <w:lang w:val="en-US"/>
+              </w:rPr>
+              <w:t xml:space="preserve">            {</w:t>
             </w:r>
           </w:p>
           <w:p>
@@ -7154,29 +7444,49 @@
                 <w:color w:val="000000"/>
                 <w:sz w:val="16"/>
                 <w:szCs w:val="16"/>
-                <w:lang w:val="de-CH"/>
-              </w:rPr>
-            </w:pPr>
-            <w:r>
-              <w:rPr>
-                <w:rFonts w:ascii="Cascadia Mono" w:hAnsi="Cascadia Mono" w:cs="Cascadia Mono"/>
-                <w:color w:val="000000"/>
-                <w:sz w:val="16"/>
-                <w:szCs w:val="16"/>
-                <w:lang w:val="de-CH"/>
+                <w:lang w:val="en-US"/>
+              </w:rPr>
+            </w:pPr>
+            <w:r>
+              <w:rPr>
+                <w:rFonts w:ascii="Cascadia Mono" w:hAnsi="Cascadia Mono" w:cs="Cascadia Mono"/>
+                <w:color w:val="000000"/>
+                <w:sz w:val="16"/>
+                <w:szCs w:val="16"/>
+                <w:lang w:val="en-US"/>
               </w:rPr>
               <w:t xml:space="preserve">                </w:t>
             </w:r>
+            <w:r>
+              <w:rPr>
+                <w:rFonts w:ascii="Cascadia Mono" w:hAnsi="Cascadia Mono" w:cs="Cascadia Mono"/>
+                <w:color w:val="0000FF"/>
+                <w:sz w:val="16"/>
+                <w:szCs w:val="16"/>
+                <w:lang w:val="en-US"/>
+              </w:rPr>
+              <w:t>using</w:t>
+            </w:r>
+            <w:r>
+              <w:rPr>
+                <w:rFonts w:ascii="Cascadia Mono" w:hAnsi="Cascadia Mono" w:cs="Cascadia Mono"/>
+                <w:color w:val="000000"/>
+                <w:sz w:val="16"/>
+                <w:szCs w:val="16"/>
+                <w:lang w:val="en-US"/>
+              </w:rPr>
+              <w:t xml:space="preserve"> (</w:t>
+            </w:r>
             <w:proofErr w:type="spellStart"/>
             <w:r>
               <w:rPr>
                 <w:rFonts w:ascii="Cascadia Mono" w:hAnsi="Cascadia Mono" w:cs="Cascadia Mono"/>
-                <w:color w:val="0000FF"/>
-                <w:sz w:val="16"/>
-                <w:szCs w:val="16"/>
-                <w:lang w:val="de-CH"/>
-              </w:rPr>
-              <w:t>using</w:t>
+                <w:color w:val="000000"/>
+                <w:sz w:val="16"/>
+                <w:szCs w:val="16"/>
+                <w:lang w:val="en-US"/>
+              </w:rPr>
+              <w:t>StreamWriter</w:t>
             </w:r>
             <w:proofErr w:type="spellEnd"/>
             <w:r>
@@ -7185,9 +7495,9 @@
                 <w:color w:val="000000"/>
                 <w:sz w:val="16"/>
                 <w:szCs w:val="16"/>
-                <w:lang w:val="de-CH"/>
-              </w:rPr>
-              <w:t xml:space="preserve"> (</w:t>
+                <w:lang w:val="en-US"/>
+              </w:rPr>
+              <w:t xml:space="preserve"> </w:t>
             </w:r>
             <w:proofErr w:type="spellStart"/>
             <w:r>
@@ -7196,9 +7506,9 @@
                 <w:color w:val="000000"/>
                 <w:sz w:val="16"/>
                 <w:szCs w:val="16"/>
-                <w:lang w:val="de-CH"/>
-              </w:rPr>
-              <w:t>StreamWriter</w:t>
+                <w:lang w:val="en-US"/>
+              </w:rPr>
+              <w:t>sw</w:t>
             </w:r>
             <w:proofErr w:type="spellEnd"/>
             <w:r>
@@ -7207,9 +7517,9 @@
                 <w:color w:val="000000"/>
                 <w:sz w:val="16"/>
                 <w:szCs w:val="16"/>
-                <w:lang w:val="de-CH"/>
-              </w:rPr>
-              <w:t xml:space="preserve"> </w:t>
+                <w:lang w:val="en-US"/>
+              </w:rPr>
+              <w:t xml:space="preserve"> = </w:t>
             </w:r>
             <w:proofErr w:type="spellStart"/>
             <w:r>
@@ -7218,9 +7528,9 @@
                 <w:color w:val="000000"/>
                 <w:sz w:val="16"/>
                 <w:szCs w:val="16"/>
-                <w:lang w:val="de-CH"/>
-              </w:rPr>
-              <w:t>sw</w:t>
+                <w:lang w:val="en-US"/>
+              </w:rPr>
+              <w:t>File.AppendText</w:t>
             </w:r>
             <w:proofErr w:type="spellEnd"/>
             <w:r>
@@ -7229,9 +7539,9 @@
                 <w:color w:val="000000"/>
                 <w:sz w:val="16"/>
                 <w:szCs w:val="16"/>
-                <w:lang w:val="de-CH"/>
-              </w:rPr>
-              <w:t xml:space="preserve"> = </w:t>
+                <w:lang w:val="en-US"/>
+              </w:rPr>
+              <w:t>(</w:t>
             </w:r>
             <w:proofErr w:type="spellStart"/>
             <w:r>
@@ -7240,9 +7550,9 @@
                 <w:color w:val="000000"/>
                 <w:sz w:val="16"/>
                 <w:szCs w:val="16"/>
-                <w:lang w:val="de-CH"/>
-              </w:rPr>
-              <w:t>File.AppendText</w:t>
+                <w:lang w:val="en-US"/>
+              </w:rPr>
+              <w:t>pathFile</w:t>
             </w:r>
             <w:proofErr w:type="spellEnd"/>
             <w:r>
@@ -7251,29 +7561,7 @@
                 <w:color w:val="000000"/>
                 <w:sz w:val="16"/>
                 <w:szCs w:val="16"/>
-                <w:lang w:val="de-CH"/>
-              </w:rPr>
-              <w:t>(</w:t>
-            </w:r>
-            <w:proofErr w:type="spellStart"/>
-            <w:r>
-              <w:rPr>
-                <w:rFonts w:ascii="Cascadia Mono" w:hAnsi="Cascadia Mono" w:cs="Cascadia Mono"/>
-                <w:color w:val="000000"/>
-                <w:sz w:val="16"/>
-                <w:szCs w:val="16"/>
-                <w:lang w:val="de-CH"/>
-              </w:rPr>
-              <w:t>pathFile</w:t>
-            </w:r>
-            <w:proofErr w:type="spellEnd"/>
-            <w:r>
-              <w:rPr>
-                <w:rFonts w:ascii="Cascadia Mono" w:hAnsi="Cascadia Mono" w:cs="Cascadia Mono"/>
-                <w:color w:val="000000"/>
-                <w:sz w:val="16"/>
-                <w:szCs w:val="16"/>
-                <w:lang w:val="de-CH"/>
+                <w:lang w:val="en-US"/>
               </w:rPr>
               <w:t>))</w:t>
             </w:r>
@@ -7296,7 +7584,7 @@
                 <w:color w:val="000000"/>
                 <w:sz w:val="16"/>
                 <w:szCs w:val="16"/>
-                <w:lang w:val="de-CH"/>
+                <w:lang w:val="en-US"/>
               </w:rPr>
               <w:t xml:space="preserve">                </w:t>
             </w:r>
@@ -7943,6 +8231,7 @@
           <w:b/>
           <w:bCs/>
         </w:rPr>
+        <w:lastRenderedPageBreak/>
         <w:t>Explications du code :</w:t>
       </w:r>
       <w:r>
@@ -8207,6 +8496,7 @@
                 <w:color w:val="000000"/>
                 <w:sz w:val="16"/>
                 <w:szCs w:val="16"/>
+                <w:lang w:val="en-US"/>
               </w:rPr>
             </w:pPr>
             <w:r>
@@ -8225,6 +8515,7 @@
                 <w:color w:val="000000"/>
                 <w:sz w:val="16"/>
                 <w:szCs w:val="16"/>
+                <w:lang w:val="en-US"/>
               </w:rPr>
               <w:t>Console.Clear</w:t>
             </w:r>
@@ -8235,6 +8526,7 @@
                 <w:color w:val="000000"/>
                 <w:sz w:val="16"/>
                 <w:szCs w:val="16"/>
+                <w:lang w:val="en-US"/>
               </w:rPr>
               <w:t>(</w:t>
             </w:r>
@@ -8245,6 +8537,7 @@
                 <w:color w:val="000000"/>
                 <w:sz w:val="16"/>
                 <w:szCs w:val="16"/>
+                <w:lang w:val="en-US"/>
               </w:rPr>
               <w:t>);</w:t>
             </w:r>
@@ -8260,75 +8553,93 @@
                 <w:color w:val="000000"/>
                 <w:sz w:val="16"/>
                 <w:szCs w:val="16"/>
-              </w:rPr>
-            </w:pPr>
-            <w:r>
-              <w:rPr>
-                <w:rFonts w:ascii="Cascadia Mono" w:hAnsi="Cascadia Mono" w:cs="Cascadia Mono"/>
-                <w:color w:val="000000"/>
-                <w:sz w:val="16"/>
-                <w:szCs w:val="16"/>
+                <w:lang w:val="en-US"/>
+              </w:rPr>
+            </w:pPr>
+            <w:r>
+              <w:rPr>
+                <w:rFonts w:ascii="Cascadia Mono" w:hAnsi="Cascadia Mono" w:cs="Cascadia Mono"/>
+                <w:color w:val="000000"/>
+                <w:sz w:val="16"/>
+                <w:szCs w:val="16"/>
+                <w:lang w:val="en-US"/>
               </w:rPr>
               <w:t xml:space="preserve">            </w:t>
             </w:r>
+            <w:r>
+              <w:rPr>
+                <w:rFonts w:ascii="Cascadia Mono" w:hAnsi="Cascadia Mono" w:cs="Cascadia Mono"/>
+                <w:color w:val="0000FF"/>
+                <w:sz w:val="16"/>
+                <w:szCs w:val="16"/>
+                <w:lang w:val="en-US"/>
+              </w:rPr>
+              <w:t>string</w:t>
+            </w:r>
+            <w:r>
+              <w:rPr>
+                <w:rFonts w:ascii="Cascadia Mono" w:hAnsi="Cascadia Mono" w:cs="Cascadia Mono"/>
+                <w:color w:val="000000"/>
+                <w:sz w:val="16"/>
+                <w:szCs w:val="16"/>
+                <w:lang w:val="en-US"/>
+              </w:rPr>
+              <w:t xml:space="preserve"> </w:t>
+            </w:r>
+            <w:proofErr w:type="spellStart"/>
+            <w:r>
+              <w:rPr>
+                <w:rFonts w:ascii="Cascadia Mono" w:hAnsi="Cascadia Mono" w:cs="Cascadia Mono"/>
+                <w:color w:val="000000"/>
+                <w:sz w:val="16"/>
+                <w:szCs w:val="16"/>
+                <w:lang w:val="en-US"/>
+              </w:rPr>
+              <w:t>deleteDirectoryPath</w:t>
+            </w:r>
+            <w:proofErr w:type="spellEnd"/>
+            <w:r>
+              <w:rPr>
+                <w:rFonts w:ascii="Cascadia Mono" w:hAnsi="Cascadia Mono" w:cs="Cascadia Mono"/>
+                <w:color w:val="000000"/>
+                <w:sz w:val="16"/>
+                <w:szCs w:val="16"/>
+                <w:lang w:val="en-US"/>
+              </w:rPr>
+              <w:t xml:space="preserve"> = </w:t>
+            </w:r>
+            <w:r>
+              <w:rPr>
+                <w:rFonts w:ascii="Cascadia Mono" w:hAnsi="Cascadia Mono" w:cs="Cascadia Mono"/>
+                <w:color w:val="800000"/>
+                <w:sz w:val="16"/>
+                <w:szCs w:val="16"/>
+                <w:lang w:val="en-US"/>
+              </w:rPr>
+              <w:t>@"C:\Users\amizeqiri\Desktop\GitHub\P_GestMDP_114\P_GestMDP\password</w:t>
+            </w:r>
             <w:proofErr w:type="gramStart"/>
             <w:r>
               <w:rPr>
                 <w:rFonts w:ascii="Cascadia Mono" w:hAnsi="Cascadia Mono" w:cs="Cascadia Mono"/>
-                <w:color w:val="0000FF"/>
-                <w:sz w:val="16"/>
-                <w:szCs w:val="16"/>
-              </w:rPr>
-              <w:t>string</w:t>
+                <w:color w:val="800000"/>
+                <w:sz w:val="16"/>
+                <w:szCs w:val="16"/>
+                <w:lang w:val="en-US"/>
+              </w:rPr>
+              <w:t>"</w:t>
+            </w:r>
+            <w:r>
+              <w:rPr>
+                <w:rFonts w:ascii="Cascadia Mono" w:hAnsi="Cascadia Mono" w:cs="Cascadia Mono"/>
+                <w:color w:val="000000"/>
+                <w:sz w:val="16"/>
+                <w:szCs w:val="16"/>
+                <w:lang w:val="en-US"/>
+              </w:rPr>
+              <w:t>;</w:t>
             </w:r>
             <w:proofErr w:type="gramEnd"/>
-            <w:r>
-              <w:rPr>
-                <w:rFonts w:ascii="Cascadia Mono" w:hAnsi="Cascadia Mono" w:cs="Cascadia Mono"/>
-                <w:color w:val="000000"/>
-                <w:sz w:val="16"/>
-                <w:szCs w:val="16"/>
-              </w:rPr>
-              <w:t xml:space="preserve"> </w:t>
-            </w:r>
-            <w:proofErr w:type="spellStart"/>
-            <w:r>
-              <w:rPr>
-                <w:rFonts w:ascii="Cascadia Mono" w:hAnsi="Cascadia Mono" w:cs="Cascadia Mono"/>
-                <w:color w:val="000000"/>
-                <w:sz w:val="16"/>
-                <w:szCs w:val="16"/>
-              </w:rPr>
-              <w:t>deleteDirectoryPath</w:t>
-            </w:r>
-            <w:proofErr w:type="spellEnd"/>
-            <w:r>
-              <w:rPr>
-                <w:rFonts w:ascii="Cascadia Mono" w:hAnsi="Cascadia Mono" w:cs="Cascadia Mono"/>
-                <w:color w:val="000000"/>
-                <w:sz w:val="16"/>
-                <w:szCs w:val="16"/>
-              </w:rPr>
-              <w:t xml:space="preserve"> = </w:t>
-            </w:r>
-            <w:r>
-              <w:rPr>
-                <w:rFonts w:ascii="Cascadia Mono" w:hAnsi="Cascadia Mono" w:cs="Cascadia Mono"/>
-                <w:color w:val="800000"/>
-                <w:sz w:val="16"/>
-                <w:szCs w:val="16"/>
-              </w:rPr>
-              <w:t>@"C:\Users\amizeqiri\Desktop\GitHub\P_GestMDP_114\P_GestMDP\password"</w:t>
-            </w:r>
-            <w:r>
-              <w:rPr>
-                <w:rFonts w:ascii="Cascadia Mono" w:hAnsi="Cascadia Mono" w:cs="Cascadia Mono"/>
-                <w:color w:val="000000"/>
-                <w:sz w:val="16"/>
-                <w:szCs w:val="16"/>
-              </w:rPr>
-              <w:t>;</w:t>
-            </w:r>
           </w:p>
           <w:p>
             <w:pPr>
@@ -8340,6 +8651,7 @@
                 <w:color w:val="000000"/>
                 <w:sz w:val="16"/>
                 <w:szCs w:val="16"/>
+                <w:lang w:val="en-US"/>
               </w:rPr>
             </w:pPr>
           </w:p>
@@ -8353,30 +8665,29 @@
                 <w:color w:val="000000"/>
                 <w:sz w:val="16"/>
                 <w:szCs w:val="16"/>
-              </w:rPr>
-            </w:pPr>
-            <w:r>
-              <w:rPr>
-                <w:rFonts w:ascii="Cascadia Mono" w:hAnsi="Cascadia Mono" w:cs="Cascadia Mono"/>
-                <w:color w:val="000000"/>
-                <w:sz w:val="16"/>
-                <w:szCs w:val="16"/>
+                <w:lang w:val="en-US"/>
+              </w:rPr>
+            </w:pPr>
+            <w:r>
+              <w:rPr>
+                <w:rFonts w:ascii="Cascadia Mono" w:hAnsi="Cascadia Mono" w:cs="Cascadia Mono"/>
+                <w:color w:val="000000"/>
+                <w:sz w:val="16"/>
+                <w:szCs w:val="16"/>
+                <w:lang w:val="en-US"/>
               </w:rPr>
               <w:t xml:space="preserve">            </w:t>
             </w:r>
-            <w:proofErr w:type="spellStart"/>
-            <w:proofErr w:type="gramStart"/>
             <w:r>
               <w:rPr>
                 <w:rFonts w:ascii="Cascadia Mono" w:hAnsi="Cascadia Mono" w:cs="Cascadia Mono"/>
                 <w:color w:val="0000FF"/>
                 <w:sz w:val="16"/>
                 <w:szCs w:val="16"/>
+                <w:lang w:val="en-US"/>
               </w:rPr>
               <w:t>try</w:t>
             </w:r>
-            <w:proofErr w:type="spellEnd"/>
-            <w:proofErr w:type="gramEnd"/>
           </w:p>
           <w:p>
             <w:pPr>
@@ -8388,14 +8699,16 @@
                 <w:color w:val="000000"/>
                 <w:sz w:val="16"/>
                 <w:szCs w:val="16"/>
-              </w:rPr>
-            </w:pPr>
-            <w:r>
-              <w:rPr>
-                <w:rFonts w:ascii="Cascadia Mono" w:hAnsi="Cascadia Mono" w:cs="Cascadia Mono"/>
-                <w:color w:val="000000"/>
-                <w:sz w:val="16"/>
-                <w:szCs w:val="16"/>
+                <w:lang w:val="en-US"/>
+              </w:rPr>
+            </w:pPr>
+            <w:r>
+              <w:rPr>
+                <w:rFonts w:ascii="Cascadia Mono" w:hAnsi="Cascadia Mono" w:cs="Cascadia Mono"/>
+                <w:color w:val="000000"/>
+                <w:sz w:val="16"/>
+                <w:szCs w:val="16"/>
+                <w:lang w:val="en-US"/>
               </w:rPr>
               <w:t xml:space="preserve">            {</w:t>
             </w:r>
@@ -8410,34 +8723,36 @@
                 <w:color w:val="000000"/>
                 <w:sz w:val="16"/>
                 <w:szCs w:val="16"/>
-              </w:rPr>
-            </w:pPr>
-            <w:r>
-              <w:rPr>
-                <w:rFonts w:ascii="Cascadia Mono" w:hAnsi="Cascadia Mono" w:cs="Cascadia Mono"/>
-                <w:color w:val="000000"/>
-                <w:sz w:val="16"/>
-                <w:szCs w:val="16"/>
+                <w:lang w:val="en-US"/>
+              </w:rPr>
+            </w:pPr>
+            <w:r>
+              <w:rPr>
+                <w:rFonts w:ascii="Cascadia Mono" w:hAnsi="Cascadia Mono" w:cs="Cascadia Mono"/>
+                <w:color w:val="000000"/>
+                <w:sz w:val="16"/>
+                <w:szCs w:val="16"/>
+                <w:lang w:val="en-US"/>
               </w:rPr>
               <w:t xml:space="preserve">                </w:t>
             </w:r>
-            <w:proofErr w:type="gramStart"/>
             <w:r>
               <w:rPr>
                 <w:rFonts w:ascii="Cascadia Mono" w:hAnsi="Cascadia Mono" w:cs="Cascadia Mono"/>
                 <w:color w:val="0000FF"/>
                 <w:sz w:val="16"/>
                 <w:szCs w:val="16"/>
+                <w:lang w:val="en-US"/>
               </w:rPr>
               <w:t>if</w:t>
             </w:r>
-            <w:proofErr w:type="gramEnd"/>
-            <w:r>
-              <w:rPr>
-                <w:rFonts w:ascii="Cascadia Mono" w:hAnsi="Cascadia Mono" w:cs="Cascadia Mono"/>
-                <w:color w:val="000000"/>
-                <w:sz w:val="16"/>
-                <w:szCs w:val="16"/>
+            <w:r>
+              <w:rPr>
+                <w:rFonts w:ascii="Cascadia Mono" w:hAnsi="Cascadia Mono" w:cs="Cascadia Mono"/>
+                <w:color w:val="000000"/>
+                <w:sz w:val="16"/>
+                <w:szCs w:val="16"/>
+                <w:lang w:val="en-US"/>
               </w:rPr>
               <w:t xml:space="preserve"> (</w:t>
             </w:r>
@@ -8448,6 +8763,7 @@
                 <w:color w:val="000000"/>
                 <w:sz w:val="16"/>
                 <w:szCs w:val="16"/>
+                <w:lang w:val="en-US"/>
               </w:rPr>
               <w:t>Directory.Exists</w:t>
             </w:r>
@@ -8458,6 +8774,7 @@
                 <w:color w:val="000000"/>
                 <w:sz w:val="16"/>
                 <w:szCs w:val="16"/>
+                <w:lang w:val="en-US"/>
               </w:rPr>
               <w:t>(</w:t>
             </w:r>
@@ -8468,6 +8785,7 @@
                 <w:color w:val="000000"/>
                 <w:sz w:val="16"/>
                 <w:szCs w:val="16"/>
+                <w:lang w:val="en-US"/>
               </w:rPr>
               <w:t>deleteDirectoryPath</w:t>
             </w:r>
@@ -8478,6 +8796,7 @@
                 <w:color w:val="000000"/>
                 <w:sz w:val="16"/>
                 <w:szCs w:val="16"/>
+                <w:lang w:val="en-US"/>
               </w:rPr>
               <w:t>))</w:t>
             </w:r>
@@ -8492,14 +8811,16 @@
                 <w:color w:val="000000"/>
                 <w:sz w:val="16"/>
                 <w:szCs w:val="16"/>
-              </w:rPr>
-            </w:pPr>
-            <w:r>
-              <w:rPr>
-                <w:rFonts w:ascii="Cascadia Mono" w:hAnsi="Cascadia Mono" w:cs="Cascadia Mono"/>
-                <w:color w:val="000000"/>
-                <w:sz w:val="16"/>
-                <w:szCs w:val="16"/>
+                <w:lang w:val="en-US"/>
+              </w:rPr>
+            </w:pPr>
+            <w:r>
+              <w:rPr>
+                <w:rFonts w:ascii="Cascadia Mono" w:hAnsi="Cascadia Mono" w:cs="Cascadia Mono"/>
+                <w:color w:val="000000"/>
+                <w:sz w:val="16"/>
+                <w:szCs w:val="16"/>
+                <w:lang w:val="en-US"/>
               </w:rPr>
               <w:t xml:space="preserve">                {</w:t>
             </w:r>
@@ -8514,14 +8835,16 @@
                 <w:color w:val="000000"/>
                 <w:sz w:val="16"/>
                 <w:szCs w:val="16"/>
-              </w:rPr>
-            </w:pPr>
-            <w:r>
-              <w:rPr>
-                <w:rFonts w:ascii="Cascadia Mono" w:hAnsi="Cascadia Mono" w:cs="Cascadia Mono"/>
-                <w:color w:val="000000"/>
-                <w:sz w:val="16"/>
-                <w:szCs w:val="16"/>
+                <w:lang w:val="en-US"/>
+              </w:rPr>
+            </w:pPr>
+            <w:r>
+              <w:rPr>
+                <w:rFonts w:ascii="Cascadia Mono" w:hAnsi="Cascadia Mono" w:cs="Cascadia Mono"/>
+                <w:color w:val="000000"/>
+                <w:sz w:val="16"/>
+                <w:szCs w:val="16"/>
+                <w:lang w:val="en-US"/>
               </w:rPr>
               <w:t xml:space="preserve">                    </w:t>
             </w:r>
@@ -8532,6 +8855,7 @@
                 <w:color w:val="0000FF"/>
                 <w:sz w:val="16"/>
                 <w:szCs w:val="16"/>
+                <w:lang w:val="en-US"/>
               </w:rPr>
               <w:t>string</w:t>
             </w:r>
@@ -8541,6 +8865,7 @@
                 <w:color w:val="000000"/>
                 <w:sz w:val="16"/>
                 <w:szCs w:val="16"/>
+                <w:lang w:val="en-US"/>
               </w:rPr>
               <w:t>[</w:t>
             </w:r>
@@ -8551,6 +8876,7 @@
                 <w:color w:val="000000"/>
                 <w:sz w:val="16"/>
                 <w:szCs w:val="16"/>
+                <w:lang w:val="en-US"/>
               </w:rPr>
               <w:t xml:space="preserve">] files = </w:t>
             </w:r>
@@ -8561,6 +8887,7 @@
                 <w:color w:val="000000"/>
                 <w:sz w:val="16"/>
                 <w:szCs w:val="16"/>
+                <w:lang w:val="en-US"/>
               </w:rPr>
               <w:t>Directory.GetFiles</w:t>
             </w:r>
@@ -8571,6 +8898,7 @@
                 <w:color w:val="000000"/>
                 <w:sz w:val="16"/>
                 <w:szCs w:val="16"/>
+                <w:lang w:val="en-US"/>
               </w:rPr>
               <w:t>(</w:t>
             </w:r>
@@ -8581,6 +8909,7 @@
                 <w:color w:val="000000"/>
                 <w:sz w:val="16"/>
                 <w:szCs w:val="16"/>
+                <w:lang w:val="en-US"/>
               </w:rPr>
               <w:t>deleteDirectoryPath</w:t>
             </w:r>
@@ -8591,6 +8920,7 @@
                 <w:color w:val="000000"/>
                 <w:sz w:val="16"/>
                 <w:szCs w:val="16"/>
+                <w:lang w:val="en-US"/>
               </w:rPr>
               <w:t xml:space="preserve">, </w:t>
             </w:r>
@@ -8600,6 +8930,7 @@
                 <w:color w:val="A31515"/>
                 <w:sz w:val="16"/>
                 <w:szCs w:val="16"/>
+                <w:lang w:val="en-US"/>
               </w:rPr>
               <w:t>"*"</w:t>
             </w:r>
@@ -8609,6 +8940,7 @@
                 <w:color w:val="000000"/>
                 <w:sz w:val="16"/>
                 <w:szCs w:val="16"/>
+                <w:lang w:val="en-US"/>
               </w:rPr>
               <w:t>);</w:t>
             </w:r>
@@ -8623,6 +8955,7 @@
                 <w:color w:val="000000"/>
                 <w:sz w:val="16"/>
                 <w:szCs w:val="16"/>
+                <w:lang w:val="en-US"/>
               </w:rPr>
             </w:pPr>
           </w:p>
@@ -8644,6 +8977,7 @@
                 <w:color w:val="000000"/>
                 <w:sz w:val="16"/>
                 <w:szCs w:val="16"/>
+                <w:lang w:val="en-US"/>
               </w:rPr>
               <w:t xml:space="preserve">                    </w:t>
             </w:r>
@@ -8941,6 +9275,7 @@
                 <w:color w:val="000000"/>
                 <w:sz w:val="16"/>
                 <w:szCs w:val="16"/>
+                <w:lang w:val="en-US"/>
               </w:rPr>
             </w:pPr>
             <w:r>
@@ -8952,16 +9287,103 @@
               </w:rPr>
               <w:t xml:space="preserve">                        </w:t>
             </w:r>
+            <w:r>
+              <w:rPr>
+                <w:rFonts w:ascii="Cascadia Mono" w:hAnsi="Cascadia Mono" w:cs="Cascadia Mono"/>
+                <w:color w:val="0000FF"/>
+                <w:sz w:val="16"/>
+                <w:szCs w:val="16"/>
+                <w:lang w:val="en-US"/>
+              </w:rPr>
+              <w:t>for</w:t>
+            </w:r>
+            <w:r>
+              <w:rPr>
+                <w:rFonts w:ascii="Cascadia Mono" w:hAnsi="Cascadia Mono" w:cs="Cascadia Mono"/>
+                <w:color w:val="000000"/>
+                <w:sz w:val="16"/>
+                <w:szCs w:val="16"/>
+                <w:lang w:val="en-US"/>
+              </w:rPr>
+              <w:t xml:space="preserve"> (</w:t>
+            </w:r>
+            <w:r>
+              <w:rPr>
+                <w:rFonts w:ascii="Cascadia Mono" w:hAnsi="Cascadia Mono" w:cs="Cascadia Mono"/>
+                <w:color w:val="0000FF"/>
+                <w:sz w:val="16"/>
+                <w:szCs w:val="16"/>
+                <w:lang w:val="en-US"/>
+              </w:rPr>
+              <w:t>int</w:t>
+            </w:r>
+            <w:r>
+              <w:rPr>
+                <w:rFonts w:ascii="Cascadia Mono" w:hAnsi="Cascadia Mono" w:cs="Cascadia Mono"/>
+                <w:color w:val="000000"/>
+                <w:sz w:val="16"/>
+                <w:szCs w:val="16"/>
+                <w:lang w:val="en-US"/>
+              </w:rPr>
+              <w:t xml:space="preserve"> </w:t>
+            </w:r>
+            <w:proofErr w:type="spellStart"/>
+            <w:r>
+              <w:rPr>
+                <w:rFonts w:ascii="Cascadia Mono" w:hAnsi="Cascadia Mono" w:cs="Cascadia Mono"/>
+                <w:color w:val="000000"/>
+                <w:sz w:val="16"/>
+                <w:szCs w:val="16"/>
+                <w:lang w:val="en-US"/>
+              </w:rPr>
+              <w:t>i</w:t>
+            </w:r>
+            <w:proofErr w:type="spellEnd"/>
+            <w:r>
+              <w:rPr>
+                <w:rFonts w:ascii="Cascadia Mono" w:hAnsi="Cascadia Mono" w:cs="Cascadia Mono"/>
+                <w:color w:val="000000"/>
+                <w:sz w:val="16"/>
+                <w:szCs w:val="16"/>
+                <w:lang w:val="en-US"/>
+              </w:rPr>
+              <w:t xml:space="preserve"> = 0; </w:t>
+            </w:r>
+            <w:proofErr w:type="spellStart"/>
+            <w:r>
+              <w:rPr>
+                <w:rFonts w:ascii="Cascadia Mono" w:hAnsi="Cascadia Mono" w:cs="Cascadia Mono"/>
+                <w:color w:val="000000"/>
+                <w:sz w:val="16"/>
+                <w:szCs w:val="16"/>
+                <w:lang w:val="en-US"/>
+              </w:rPr>
+              <w:t>i</w:t>
+            </w:r>
+            <w:proofErr w:type="spellEnd"/>
+            <w:r>
+              <w:rPr>
+                <w:rFonts w:ascii="Cascadia Mono" w:hAnsi="Cascadia Mono" w:cs="Cascadia Mono"/>
+                <w:color w:val="000000"/>
+                <w:sz w:val="16"/>
+                <w:szCs w:val="16"/>
+                <w:lang w:val="en-US"/>
+              </w:rPr>
+              <w:t xml:space="preserve"> &lt; </w:t>
+            </w:r>
+            <w:proofErr w:type="spellStart"/>
             <w:proofErr w:type="gramStart"/>
             <w:r>
               <w:rPr>
                 <w:rFonts w:ascii="Cascadia Mono" w:hAnsi="Cascadia Mono" w:cs="Cascadia Mono"/>
-                <w:color w:val="0000FF"/>
-                <w:sz w:val="16"/>
-                <w:szCs w:val="16"/>
-              </w:rPr>
-              <w:t>for</w:t>
-            </w:r>
+                <w:color w:val="000000"/>
+                <w:sz w:val="16"/>
+                <w:szCs w:val="16"/>
+                <w:lang w:val="en-US"/>
+              </w:rPr>
+              <w:t>files.Length</w:t>
+            </w:r>
+            <w:proofErr w:type="spellEnd"/>
             <w:proofErr w:type="gramEnd"/>
             <w:r>
               <w:rPr>
@@ -8969,18 +9391,20 @@
                 <w:color w:val="000000"/>
                 <w:sz w:val="16"/>
                 <w:szCs w:val="16"/>
-              </w:rPr>
-              <w:t xml:space="preserve"> (</w:t>
+                <w:lang w:val="en-US"/>
+              </w:rPr>
+              <w:t xml:space="preserve">; </w:t>
             </w:r>
             <w:proofErr w:type="spellStart"/>
             <w:r>
               <w:rPr>
                 <w:rFonts w:ascii="Cascadia Mono" w:hAnsi="Cascadia Mono" w:cs="Cascadia Mono"/>
-                <w:color w:val="0000FF"/>
-                <w:sz w:val="16"/>
-                <w:szCs w:val="16"/>
-              </w:rPr>
-              <w:t>int</w:t>
+                <w:color w:val="000000"/>
+                <w:sz w:val="16"/>
+                <w:szCs w:val="16"/>
+                <w:lang w:val="en-US"/>
+              </w:rPr>
+              <w:t>i</w:t>
             </w:r>
             <w:proofErr w:type="spellEnd"/>
             <w:r>
@@ -8989,28 +9413,9 @@
                 <w:color w:val="000000"/>
                 <w:sz w:val="16"/>
                 <w:szCs w:val="16"/>
-              </w:rPr>
-              <w:t xml:space="preserve"> i = 0; i &lt; </w:t>
-            </w:r>
-            <w:proofErr w:type="spellStart"/>
-            <w:r>
-              <w:rPr>
-                <w:rFonts w:ascii="Cascadia Mono" w:hAnsi="Cascadia Mono" w:cs="Cascadia Mono"/>
-                <w:color w:val="000000"/>
-                <w:sz w:val="16"/>
-                <w:szCs w:val="16"/>
-              </w:rPr>
-              <w:t>files.Length</w:t>
-            </w:r>
-            <w:proofErr w:type="spellEnd"/>
-            <w:r>
-              <w:rPr>
-                <w:rFonts w:ascii="Cascadia Mono" w:hAnsi="Cascadia Mono" w:cs="Cascadia Mono"/>
-                <w:color w:val="000000"/>
-                <w:sz w:val="16"/>
-                <w:szCs w:val="16"/>
-              </w:rPr>
-              <w:t>; i++)</w:t>
+                <w:lang w:val="en-US"/>
+              </w:rPr>
+              <w:t>++)</w:t>
             </w:r>
           </w:p>
           <w:p>
@@ -9031,8 +9436,18 @@
                 <w:color w:val="000000"/>
                 <w:sz w:val="16"/>
                 <w:szCs w:val="16"/>
-              </w:rPr>
-              <w:t xml:space="preserve">                        {</w:t>
+                <w:lang w:val="en-US"/>
+              </w:rPr>
+              <w:t xml:space="preserve">                        </w:t>
+            </w:r>
+            <w:r>
+              <w:rPr>
+                <w:rFonts w:ascii="Cascadia Mono" w:hAnsi="Cascadia Mono" w:cs="Cascadia Mono"/>
+                <w:color w:val="000000"/>
+                <w:sz w:val="16"/>
+                <w:szCs w:val="16"/>
+              </w:rPr>
+              <w:t>{</w:t>
             </w:r>
           </w:p>
           <w:p>
@@ -10025,6 +10440,7 @@
                 <w:sz w:val="16"/>
                 <w:szCs w:val="16"/>
               </w:rPr>
+              <w:lastRenderedPageBreak/>
               <w:t xml:space="preserve">            }</w:t>
             </w:r>
           </w:p>
@@ -10047,7 +10463,6 @@
                 <w:sz w:val="16"/>
                 <w:szCs w:val="16"/>
               </w:rPr>
-              <w:lastRenderedPageBreak/>
               <w:t xml:space="preserve">            </w:t>
             </w:r>
             <w:proofErr w:type="gramStart"/>
@@ -10550,34 +10965,120 @@
       </w:r>
     </w:p>
     <w:p>
-      <w:pPr>
-        <w:rPr>
-          <w:rFonts w:asciiTheme="majorHAnsi" w:hAnsiTheme="majorHAnsi" w:cs="Arial"/>
-          <w:b/>
-          <w:bCs/>
-          <w:caps/>
-          <w:kern w:val="32"/>
-          <w:sz w:val="32"/>
-          <w:szCs w:val="32"/>
-        </w:rPr>
-      </w:pPr>
       <w:r>
         <w:br w:type="page"/>
       </w:r>
     </w:p>
     <w:p>
       <w:pPr>
-        <w:pStyle w:val="Titre1"/>
-      </w:pPr>
-      <w:bookmarkStart w:id="6" w:name="_Toc179199579"/>
+        <w:pStyle w:val="Titre2"/>
+      </w:pPr>
       <w:r>
         <w:lastRenderedPageBreak/>
+        <w:t>Vigenère</w:t>
+      </w:r>
+    </w:p>
+    <w:p>
+      <w:pPr>
+        <w:pStyle w:val="Retraitcorpsdetexte"/>
+      </w:pPr>
+      <w:r>
+        <w:t>Dans mon application, j’utilise deux méthodes Vigenère. La première sert à chiffrer une chaine de caractères et la deuxième de déchiffrer une chaine de caractères</w:t>
+      </w:r>
+      <w:r>
+        <w:t>. Je fais appel à ces deux méthodes dans toutes mes autres méthodes des différentes options (CRUD).</w:t>
+      </w:r>
+    </w:p>
+    <w:p>
+      <w:pPr>
+        <w:pStyle w:val="Retraitcorpsdetexte"/>
+      </w:pPr>
+    </w:p>
+    <w:p>
+      <w:r>
+        <w:t>Étapes du chiffrement de Vigenère</w:t>
+      </w:r>
+    </w:p>
+    <w:p>
+      <w:r>
+        <w:rPr>
+          <w:rStyle w:val="lev"/>
+        </w:rPr>
+        <w:t>Texte clair</w:t>
+      </w:r>
+      <w:r>
+        <w:t xml:space="preserve"> : C'est le message que vous souhaitez chiffrer. Exemples : "HELLO WORLD".</w:t>
+      </w:r>
+    </w:p>
+    <w:p>
+      <w:r>
+        <w:rPr>
+          <w:rStyle w:val="lev"/>
+        </w:rPr>
+        <w:t>Clé</w:t>
+      </w:r>
+      <w:r>
+        <w:t xml:space="preserve"> : La clé est répétée pour correspondre à la longueur du texte clair. Dans ce cas, c'est "</w:t>
+      </w:r>
+      <w:proofErr w:type="spellStart"/>
+      <w:r>
+        <w:t>maCleDeChiffrement</w:t>
+      </w:r>
+      <w:proofErr w:type="spellEnd"/>
+      <w:r>
+        <w:t>".</w:t>
+      </w:r>
+    </w:p>
+    <w:p>
+      <w:r>
+        <w:rPr>
+          <w:rStyle w:val="lev"/>
+        </w:rPr>
+        <w:t>Table de Vigenère</w:t>
+      </w:r>
+      <w:r>
+        <w:t xml:space="preserve"> : Une table alphabétique où chaque ligne représente un décalage de l'alphabet.</w:t>
+      </w:r>
+    </w:p>
+    <w:p>
+      <w:r>
+        <w:rPr>
+          <w:rStyle w:val="lev"/>
+        </w:rPr>
+        <w:t>Chiffrement</w:t>
+      </w:r>
+      <w:r>
+        <w:t xml:space="preserve"> : En associant chaque lettre du texte clair à une lettre de la clé, on utilise la table pour obtenir la lettre chiffrée.</w:t>
+      </w:r>
+    </w:p>
+    <w:p>
+      <w:r>
+        <w:t>Exemples de calcul</w:t>
+      </w:r>
+    </w:p>
+    <w:p>
+      <w:r>
+        <w:t>Si l'on chiffre la première lettre "H" avec "m", on trouve la lettre de la table située à l'intersection de la ligne "H" et de la colonne "m".</w:t>
+      </w:r>
+    </w:p>
+    <w:p>
+      <w:pPr>
+        <w:pStyle w:val="Retraitcorpsdetexte"/>
+        <w:ind w:left="0"/>
+      </w:pPr>
+    </w:p>
+    <w:p>
+      <w:pPr>
+        <w:pStyle w:val="Titre1"/>
+      </w:pPr>
+      <w:bookmarkStart w:id="5" w:name="_Toc181017290"/>
+      <w:r>
         <w:t>Sources</w:t>
       </w:r>
       <w:r>
         <w:t xml:space="preserve"> &amp; Aides</w:t>
       </w:r>
-      <w:bookmarkEnd w:id="6"/>
+      <w:bookmarkEnd w:id="5"/>
     </w:p>
     <w:p>
       <w:pPr>
@@ -10630,7 +11131,22 @@
       </w:r>
       <w:proofErr w:type="spellEnd"/>
       <w:r>
-        <w:t xml:space="preserve"> m’a aidé à comprendre les bouts de code que je trouvais sur internet, il m’a également servi lors de petites incrustations dans le code.</w:t>
+        <w:t xml:space="preserve"> m’a aidé à comprendre les bouts de code que je trouvais sur internet, il m’a également servi lors </w:t>
+      </w:r>
+      <w:r>
+        <w:t>d’</w:t>
+      </w:r>
+      <w:r>
+        <w:t>incrustations dans le code.</w:t>
+      </w:r>
+      <w:r>
+        <w:t xml:space="preserve"> Il m’a servi pour </w:t>
+      </w:r>
+      <w:r>
+        <w:t>Vigenère (</w:t>
+      </w:r>
+      <w:r>
+        <w:t>Chiffrement et déchiffrement).</w:t>
       </w:r>
       <w:r>
         <w:t xml:space="preserve"> Il ne m’a pas servi pour la rédaction du rapport</w:t>
@@ -10642,25 +11158,37 @@
     <w:p>
       <w:pPr>
         <w:pStyle w:val="Corpsdetexte"/>
-        <w:ind w:left="0"/>
-      </w:pPr>
+      </w:pPr>
+      <w:r>
+        <w:t>Les aides spécifiques avec les URLs sont dans le journal de travail.</w:t>
+      </w:r>
     </w:p>
     <w:p>
       <w:pPr>
+        <w:pStyle w:val="Corpsdetexte"/>
+        <w:ind w:left="0"/>
+      </w:pPr>
+    </w:p>
+    <w:p>
+      <w:pPr>
         <w:pStyle w:val="Titre1"/>
       </w:pPr>
-      <w:bookmarkStart w:id="7" w:name="_Toc179199580"/>
+      <w:bookmarkStart w:id="6" w:name="_Toc181017291"/>
       <w:r>
         <w:t>Conclusion</w:t>
       </w:r>
-      <w:bookmarkEnd w:id="7"/>
+      <w:bookmarkEnd w:id="6"/>
     </w:p>
     <w:p>
       <w:pPr>
         <w:pStyle w:val="Corpsdetexte"/>
+        <w:jc w:val="left"/>
       </w:pPr>
       <w:r>
-        <w:t xml:space="preserve">Je n’ai pas compris le but de faire une application dev lorsque je suis en infrastructure. J’ai quitté le développement parce que ce n’est pas ce qui me plaît en informatique et je me retrouve à faire un projet 100% dev. Malgré ce mécontentement, j’ai essayé de faire quelque chose de potable qui ressemble le plus à ce qui est demandé. Je n’ai pas particulièrement </w:t>
+        <w:t>Etant en infrastructure, j’ai eu un petit mécontentement</w:t>
+      </w:r>
+      <w:r>
+        <w:t xml:space="preserve">. J’ai quitté le développement parce que ce n’est pas ce qui me plaît en informatique et je me retrouve à faire un projet 100% dev. Malgré ce mécontentement, j’ai essayé de faire quelque chose de potable qui ressemble le plus à ce qui est demandé. Je n’ai pas particulièrement </w:t>
       </w:r>
       <w:r>
         <w:t>adoré</w:t>
@@ -10682,6 +11210,9 @@
       </w:r>
       <w:r>
         <w:t xml:space="preserve"> ou redécouvrir les tableaux que j’ai très peu vu.</w:t>
+      </w:r>
+      <w:r>
+        <w:t xml:space="preserve"> Vigenère a été une découverte pour moi.</w:t>
       </w:r>
     </w:p>
     <w:sectPr>
@@ -10895,7 +11426,7 @@
         <v:path o:extrusionok="f" gradientshapeok="t" o:connecttype="rect"/>
         <o:lock v:ext="edit" aspectratio="t"/>
       </v:shapetype>
-      <v:shape id="_x0000_i1033" type="#_x0000_t75" style="width:11.25pt;height:11.25pt" o:bullet="t">
+      <v:shape id="_x0000_i1040" type="#_x0000_t75" style="width:11.25pt;height:11.25pt" o:bullet="t">
         <v:imagedata r:id="rId1" o:title="BD10263_"/>
       </v:shape>
     </w:pict>
@@ -12865,6 +13396,119 @@
     </w:lvl>
   </w:abstractNum>
   <w:abstractNum w:abstractNumId="18" w15:restartNumberingAfterBreak="0">
+    <w:nsid w:val="64501F5D"/>
+    <w:multiLevelType w:val="multilevel"/>
+    <w:tmpl w:val="D8303178"/>
+    <w:lvl w:ilvl="0">
+      <w:start w:val="1"/>
+      <w:numFmt w:val="decimal"/>
+      <w:lvlText w:val="%1."/>
+      <w:lvlJc w:val="left"/>
+      <w:pPr>
+        <w:tabs>
+          <w:tab w:val="num" w:pos="720"/>
+        </w:tabs>
+        <w:ind w:left="720" w:hanging="360"/>
+      </w:pPr>
+    </w:lvl>
+    <w:lvl w:ilvl="1" w:tentative="1">
+      <w:start w:val="1"/>
+      <w:numFmt w:val="decimal"/>
+      <w:lvlText w:val="%2."/>
+      <w:lvlJc w:val="left"/>
+      <w:pPr>
+        <w:tabs>
+          <w:tab w:val="num" w:pos="1440"/>
+        </w:tabs>
+        <w:ind w:left="1440" w:hanging="360"/>
+      </w:pPr>
+    </w:lvl>
+    <w:lvl w:ilvl="2" w:tentative="1">
+      <w:start w:val="1"/>
+      <w:numFmt w:val="decimal"/>
+      <w:lvlText w:val="%3."/>
+      <w:lvlJc w:val="left"/>
+      <w:pPr>
+        <w:tabs>
+          <w:tab w:val="num" w:pos="2160"/>
+        </w:tabs>
+        <w:ind w:left="2160" w:hanging="360"/>
+      </w:pPr>
+    </w:lvl>
+    <w:lvl w:ilvl="3" w:tentative="1">
+      <w:start w:val="1"/>
+      <w:numFmt w:val="decimal"/>
+      <w:lvlText w:val="%4."/>
+      <w:lvlJc w:val="left"/>
+      <w:pPr>
+        <w:tabs>
+          <w:tab w:val="num" w:pos="2880"/>
+        </w:tabs>
+        <w:ind w:left="2880" w:hanging="360"/>
+      </w:pPr>
+    </w:lvl>
+    <w:lvl w:ilvl="4" w:tentative="1">
+      <w:start w:val="1"/>
+      <w:numFmt w:val="decimal"/>
+      <w:lvlText w:val="%5."/>
+      <w:lvlJc w:val="left"/>
+      <w:pPr>
+        <w:tabs>
+          <w:tab w:val="num" w:pos="3600"/>
+        </w:tabs>
+        <w:ind w:left="3600" w:hanging="360"/>
+      </w:pPr>
+    </w:lvl>
+    <w:lvl w:ilvl="5" w:tentative="1">
+      <w:start w:val="1"/>
+      <w:numFmt w:val="decimal"/>
+      <w:lvlText w:val="%6."/>
+      <w:lvlJc w:val="left"/>
+      <w:pPr>
+        <w:tabs>
+          <w:tab w:val="num" w:pos="4320"/>
+        </w:tabs>
+        <w:ind w:left="4320" w:hanging="360"/>
+      </w:pPr>
+    </w:lvl>
+    <w:lvl w:ilvl="6" w:tentative="1">
+      <w:start w:val="1"/>
+      <w:numFmt w:val="decimal"/>
+      <w:lvlText w:val="%7."/>
+      <w:lvlJc w:val="left"/>
+      <w:pPr>
+        <w:tabs>
+          <w:tab w:val="num" w:pos="5040"/>
+        </w:tabs>
+        <w:ind w:left="5040" w:hanging="360"/>
+      </w:pPr>
+    </w:lvl>
+    <w:lvl w:ilvl="7" w:tentative="1">
+      <w:start w:val="1"/>
+      <w:numFmt w:val="decimal"/>
+      <w:lvlText w:val="%8."/>
+      <w:lvlJc w:val="left"/>
+      <w:pPr>
+        <w:tabs>
+          <w:tab w:val="num" w:pos="5760"/>
+        </w:tabs>
+        <w:ind w:left="5760" w:hanging="360"/>
+      </w:pPr>
+    </w:lvl>
+    <w:lvl w:ilvl="8" w:tentative="1">
+      <w:start w:val="1"/>
+      <w:numFmt w:val="decimal"/>
+      <w:lvlText w:val="%9."/>
+      <w:lvlJc w:val="left"/>
+      <w:pPr>
+        <w:tabs>
+          <w:tab w:val="num" w:pos="6480"/>
+        </w:tabs>
+        <w:ind w:left="6480" w:hanging="360"/>
+      </w:pPr>
+    </w:lvl>
+  </w:abstractNum>
+  <w:abstractNum w:abstractNumId="19" w15:restartNumberingAfterBreak="0">
     <w:nsid w:val="64DB67C4"/>
     <w:multiLevelType w:val="multilevel"/>
     <w:tmpl w:val="16ECA64C"/>
@@ -12977,7 +13621,7 @@
       </w:pPr>
     </w:lvl>
   </w:abstractNum>
-  <w:abstractNum w:abstractNumId="19" w15:restartNumberingAfterBreak="0">
+  <w:abstractNum w:abstractNumId="20" w15:restartNumberingAfterBreak="0">
     <w:nsid w:val="6B875F62"/>
     <w:multiLevelType w:val="multilevel"/>
     <w:tmpl w:val="E740241C"/>
@@ -13090,7 +13734,7 @@
       </w:pPr>
     </w:lvl>
   </w:abstractNum>
-  <w:abstractNum w:abstractNumId="20" w15:restartNumberingAfterBreak="0">
+  <w:abstractNum w:abstractNumId="21" w15:restartNumberingAfterBreak="0">
     <w:nsid w:val="73560BB0"/>
     <w:multiLevelType w:val="multilevel"/>
     <w:tmpl w:val="16A4FB34"/>
@@ -13203,7 +13847,7 @@
       </w:pPr>
     </w:lvl>
   </w:abstractNum>
-  <w:abstractNum w:abstractNumId="21" w15:restartNumberingAfterBreak="0">
+  <w:abstractNum w:abstractNumId="22" w15:restartNumberingAfterBreak="0">
     <w:nsid w:val="76BC6986"/>
     <w:multiLevelType w:val="multilevel"/>
     <w:tmpl w:val="34DE763C"/>
@@ -13316,7 +13960,7 @@
       </w:pPr>
     </w:lvl>
   </w:abstractNum>
-  <w:abstractNum w:abstractNumId="22" w15:restartNumberingAfterBreak="0">
+  <w:abstractNum w:abstractNumId="23" w15:restartNumberingAfterBreak="0">
     <w:nsid w:val="77467DAD"/>
     <w:multiLevelType w:val="multilevel"/>
     <w:tmpl w:val="39527D38"/>
@@ -13429,7 +14073,7 @@
       </w:pPr>
     </w:lvl>
   </w:abstractNum>
-  <w:abstractNum w:abstractNumId="23" w15:restartNumberingAfterBreak="0">
+  <w:abstractNum w:abstractNumId="24" w15:restartNumberingAfterBreak="0">
     <w:nsid w:val="77EA1D09"/>
     <w:multiLevelType w:val="multilevel"/>
     <w:tmpl w:val="0DEEB666"/>
@@ -13558,7 +14202,7 @@
     <w:abstractNumId w:val="12"/>
   </w:num>
   <w:num w:numId="6" w16cid:durableId="948660929">
-    <w:abstractNumId w:val="22"/>
+    <w:abstractNumId w:val="23"/>
   </w:num>
   <w:num w:numId="7" w16cid:durableId="1779639672">
     <w:abstractNumId w:val="2"/>
@@ -13567,7 +14211,7 @@
     <w:abstractNumId w:val="11"/>
   </w:num>
   <w:num w:numId="9" w16cid:durableId="964117333">
-    <w:abstractNumId w:val="21"/>
+    <w:abstractNumId w:val="22"/>
   </w:num>
   <w:num w:numId="10" w16cid:durableId="1364211427">
     <w:abstractNumId w:val="16"/>
@@ -13576,19 +14220,19 @@
     <w:abstractNumId w:val="14"/>
   </w:num>
   <w:num w:numId="12" w16cid:durableId="1763407258">
-    <w:abstractNumId w:val="19"/>
+    <w:abstractNumId w:val="20"/>
   </w:num>
   <w:num w:numId="13" w16cid:durableId="777139391">
     <w:abstractNumId w:val="15"/>
   </w:num>
   <w:num w:numId="14" w16cid:durableId="1146047444">
-    <w:abstractNumId w:val="20"/>
+    <w:abstractNumId w:val="21"/>
   </w:num>
   <w:num w:numId="15" w16cid:durableId="341124738">
     <w:abstractNumId w:val="7"/>
   </w:num>
   <w:num w:numId="16" w16cid:durableId="1375350286">
-    <w:abstractNumId w:val="18"/>
+    <w:abstractNumId w:val="19"/>
   </w:num>
   <w:num w:numId="17" w16cid:durableId="248348097">
     <w:abstractNumId w:val="13"/>
@@ -13603,7 +14247,7 @@
     <w:abstractNumId w:val="10"/>
   </w:num>
   <w:num w:numId="21" w16cid:durableId="53747491">
-    <w:abstractNumId w:val="23"/>
+    <w:abstractNumId w:val="24"/>
   </w:num>
   <w:num w:numId="22" w16cid:durableId="863325116">
     <w:abstractNumId w:val="4"/>
@@ -13613,6 +14257,9 @@
   </w:num>
   <w:num w:numId="24" w16cid:durableId="1251700136">
     <w:abstractNumId w:val="5"/>
+  </w:num>
+  <w:num w:numId="25" w16cid:durableId="1185048684">
+    <w:abstractNumId w:val="18"/>
   </w:num>
   <w:numIdMacAtCleanup w:val="21"/>
 </w:numbering>
@@ -13713,14 +14360,14 @@
     <w:lsdException w:name="Block Text" w:semiHidden="1" w:unhideWhenUsed="1"/>
     <w:lsdException w:name="Hyperlink" w:semiHidden="1" w:uiPriority="99" w:unhideWhenUsed="1"/>
     <w:lsdException w:name="FollowedHyperlink" w:semiHidden="1" w:unhideWhenUsed="1"/>
-    <w:lsdException w:name="Strong" w:qFormat="1"/>
+    <w:lsdException w:name="Strong" w:uiPriority="22" w:qFormat="1"/>
     <w:lsdException w:name="Emphasis" w:qFormat="1"/>
     <w:lsdException w:name="Document Map" w:semiHidden="1" w:unhideWhenUsed="1"/>
     <w:lsdException w:name="Plain Text" w:semiHidden="1" w:unhideWhenUsed="1"/>
     <w:lsdException w:name="E-mail Signature" w:semiHidden="1" w:unhideWhenUsed="1"/>
     <w:lsdException w:name="HTML Top of Form" w:semiHidden="1" w:unhideWhenUsed="1"/>
     <w:lsdException w:name="HTML Bottom of Form" w:semiHidden="1" w:unhideWhenUsed="1"/>
-    <w:lsdException w:name="Normal (Web)" w:semiHidden="1" w:unhideWhenUsed="1"/>
+    <w:lsdException w:name="Normal (Web)" w:semiHidden="1" w:uiPriority="99" w:unhideWhenUsed="1"/>
     <w:lsdException w:name="HTML Acronym" w:semiHidden="1" w:unhideWhenUsed="1"/>
     <w:lsdException w:name="HTML Address" w:semiHidden="1" w:unhideWhenUsed="1"/>
     <w:lsdException w:name="HTML Cite" w:semiHidden="1" w:unhideWhenUsed="1"/>
@@ -14527,6 +15174,7 @@
   <w:style w:type="character" w:styleId="lev">
     <w:name w:val="Strong"/>
     <w:basedOn w:val="Policepardfaut"/>
+    <w:uiPriority w:val="22"/>
     <w:qFormat/>
     <w:rsid w:val="0037071E"/>
     <w:rPr>
@@ -14805,6 +15453,22 @@
     <w:rPr>
       <w:color w:val="605E5C"/>
       <w:shd w:val="clear" w:color="auto" w:fill="E1DFDD"/>
+    </w:rPr>
+  </w:style>
+  <w:style w:type="paragraph" w:styleId="NormalWeb">
+    <w:name w:val="Normal (Web)"/>
+    <w:basedOn w:val="Normal"/>
+    <w:uiPriority w:val="99"/>
+    <w:semiHidden/>
+    <w:unhideWhenUsed/>
+    <w:rsid w:val="003A3911"/>
+    <w:pPr>
+      <w:spacing w:before="100" w:beforeAutospacing="1" w:after="100" w:afterAutospacing="1"/>
+    </w:pPr>
+    <w:rPr>
+      <w:rFonts w:ascii="Times New Roman" w:hAnsi="Times New Roman"/>
+      <w:sz w:val="24"/>
+      <w:szCs w:val="24"/>
     </w:rPr>
   </w:style>
 </w:styles>
@@ -15097,18 +15761,6 @@
 </file>
 
 <file path=customXml/item1.xml><?xml version="1.0" encoding="utf-8"?>
-<p:properties xmlns:p="http://schemas.microsoft.com/office/2006/metadata/properties" xmlns:xsi="http://www.w3.org/2001/XMLSchema-instance" xmlns:pc="http://schemas.microsoft.com/office/infopath/2007/PartnerControls">
-  <documentManagement>
-    <Total xmlns="98d92101-24da-4498-9971-a24673344bd8" xsi:nil="true"/>
-    <TaxCatchAll xmlns="dfa80de1-e9bb-4cf2-893d-d06220b3971a" xsi:nil="true"/>
-    <lcf76f155ced4ddcb4097134ff3c332f xmlns="98d92101-24da-4498-9971-a24673344bd8">
-      <Terms xmlns="http://schemas.microsoft.com/office/infopath/2007/PartnerControls"/>
-    </lcf76f155ced4ddcb4097134ff3c332f>
-  </documentManagement>
-</p:properties>
-</file>
-
-<file path=customXml/item2.xml><?xml version="1.0" encoding="utf-8"?>
 <ct:contentTypeSchema xmlns:ct="http://schemas.microsoft.com/office/2006/metadata/contentType" xmlns:ma="http://schemas.microsoft.com/office/2006/metadata/properties/metaAttributes" ct:_="" ma:_="" ma:contentTypeName="Document" ma:contentTypeID="0x010100E529CC47EA4E614CBF50FAFAB9B8F32B" ma:contentTypeVersion="13" ma:contentTypeDescription="Crée un document." ma:contentTypeScope="" ma:versionID="6a4cac78e8e76547514939bcab636e7b">
   <xsd:schema xmlns:xsd="http://www.w3.org/2001/XMLSchema" xmlns:xs="http://www.w3.org/2001/XMLSchema" xmlns:p="http://schemas.microsoft.com/office/2006/metadata/properties" xmlns:ns2="98d92101-24da-4498-9971-a24673344bd8" xmlns:ns3="dfa80de1-e9bb-4cf2-893d-d06220b3971a" targetNamespace="http://schemas.microsoft.com/office/2006/metadata/properties" ma:root="true" ma:fieldsID="a8fdc2b16e66b7bdb77d3717a31ab696" ns2:_="" ns3:_="">
     <xsd:import namespace="98d92101-24da-4498-9971-a24673344bd8"/>
@@ -15331,11 +15983,19 @@
 </ct:contentTypeSchema>
 </file>
 
-<file path=customXml/item3.xml><?xml version="1.0" encoding="utf-8"?>
-<b:Sources xmlns:b="http://schemas.openxmlformats.org/officeDocument/2006/bibliography" xmlns="http://schemas.openxmlformats.org/officeDocument/2006/bibliography" SelectedStyle="\APA.XSL" StyleName="APA"/>
+<file path=customXml/item2.xml><?xml version="1.0" encoding="utf-8"?>
+<p:properties xmlns:p="http://schemas.microsoft.com/office/2006/metadata/properties" xmlns:xsi="http://www.w3.org/2001/XMLSchema-instance" xmlns:pc="http://schemas.microsoft.com/office/infopath/2007/PartnerControls">
+  <documentManagement>
+    <Total xmlns="98d92101-24da-4498-9971-a24673344bd8" xsi:nil="true"/>
+    <TaxCatchAll xmlns="dfa80de1-e9bb-4cf2-893d-d06220b3971a" xsi:nil="true"/>
+    <lcf76f155ced4ddcb4097134ff3c332f xmlns="98d92101-24da-4498-9971-a24673344bd8">
+      <Terms xmlns="http://schemas.microsoft.com/office/infopath/2007/PartnerControls"/>
+    </lcf76f155ced4ddcb4097134ff3c332f>
+  </documentManagement>
+</p:properties>
 </file>
 
-<file path=customXml/item4.xml><?xml version="1.0" encoding="utf-8"?>
+<file path=customXml/item3.xml><?xml version="1.0" encoding="utf-8"?>
 <?mso-contentType ?>
 <FormTemplates xmlns="http://schemas.microsoft.com/sharepoint/v3/contenttype/forms">
   <Display>DocumentLibraryForm</Display>
@@ -15344,18 +16004,11 @@
 </FormTemplates>
 </file>
 
-<file path=customXml/itemProps1.xml><?xml version="1.0" encoding="utf-8"?>
-<ds:datastoreItem xmlns:ds="http://schemas.openxmlformats.org/officeDocument/2006/customXml" ds:itemID="{E4C379ED-99CE-474E-BE51-D6618EB059A5}">
-  <ds:schemaRefs>
-    <ds:schemaRef ds:uri="http://schemas.microsoft.com/office/2006/metadata/properties"/>
-    <ds:schemaRef ds:uri="http://schemas.microsoft.com/office/infopath/2007/PartnerControls"/>
-    <ds:schemaRef ds:uri="98d92101-24da-4498-9971-a24673344bd8"/>
-    <ds:schemaRef ds:uri="dfa80de1-e9bb-4cf2-893d-d06220b3971a"/>
-  </ds:schemaRefs>
-</ds:datastoreItem>
+<file path=customXml/item4.xml><?xml version="1.0" encoding="utf-8"?>
+<b:Sources xmlns:b="http://schemas.openxmlformats.org/officeDocument/2006/bibliography" xmlns="http://schemas.openxmlformats.org/officeDocument/2006/bibliography" SelectedStyle="\APA.XSL" StyleName="APA"/>
 </file>
 
-<file path=customXml/itemProps2.xml><?xml version="1.0" encoding="utf-8"?>
+<file path=customXml/itemProps1.xml><?xml version="1.0" encoding="utf-8"?>
 <ds:datastoreItem xmlns:ds="http://schemas.openxmlformats.org/officeDocument/2006/customXml" ds:itemID="{DB88091B-7A0B-40E0-A22E-B64A876609B4}">
   <ds:schemaRefs>
     <ds:schemaRef ds:uri="http://schemas.microsoft.com/office/2006/metadata/contentType"/>
@@ -15374,18 +16027,29 @@
 </ds:datastoreItem>
 </file>
 
+<file path=customXml/itemProps2.xml><?xml version="1.0" encoding="utf-8"?>
+<ds:datastoreItem xmlns:ds="http://schemas.openxmlformats.org/officeDocument/2006/customXml" ds:itemID="{E4C379ED-99CE-474E-BE51-D6618EB059A5}">
+  <ds:schemaRefs>
+    <ds:schemaRef ds:uri="http://schemas.microsoft.com/office/2006/metadata/properties"/>
+    <ds:schemaRef ds:uri="http://schemas.microsoft.com/office/infopath/2007/PartnerControls"/>
+    <ds:schemaRef ds:uri="98d92101-24da-4498-9971-a24673344bd8"/>
+    <ds:schemaRef ds:uri="dfa80de1-e9bb-4cf2-893d-d06220b3971a"/>
+  </ds:schemaRefs>
+</ds:datastoreItem>
+</file>
+
 <file path=customXml/itemProps3.xml><?xml version="1.0" encoding="utf-8"?>
+<ds:datastoreItem xmlns:ds="http://schemas.openxmlformats.org/officeDocument/2006/customXml" ds:itemID="{17BB236F-1E40-438F-95F2-06C15F3EF314}">
+  <ds:schemaRefs>
+    <ds:schemaRef ds:uri="http://schemas.microsoft.com/sharepoint/v3/contenttype/forms"/>
+  </ds:schemaRefs>
+</ds:datastoreItem>
+</file>
+
+<file path=customXml/itemProps4.xml><?xml version="1.0" encoding="utf-8"?>
 <ds:datastoreItem xmlns:ds="http://schemas.openxmlformats.org/officeDocument/2006/customXml" ds:itemID="{742E9764-2B52-4BB1-A7DC-ADF880092330}">
   <ds:schemaRefs>
     <ds:schemaRef ds:uri="http://schemas.openxmlformats.org/officeDocument/2006/bibliography"/>
   </ds:schemaRefs>
 </ds:datastoreItem>
-</file>
-
-<file path=customXml/itemProps4.xml><?xml version="1.0" encoding="utf-8"?>
-<ds:datastoreItem xmlns:ds="http://schemas.openxmlformats.org/officeDocument/2006/customXml" ds:itemID="{17BB236F-1E40-438F-95F2-06C15F3EF314}">
-  <ds:schemaRefs>
-    <ds:schemaRef ds:uri="http://schemas.microsoft.com/sharepoint/v3/contenttype/forms"/>
-  </ds:schemaRefs>
-</ds:datastoreItem>
 </file>
</xml_diff>